<commit_message>
docs: record alpha baseline evidence
</commit_message>
<xml_diff>
--- a/docs/project-management/SEISMIK_CONTROL_AVANCE_v0.1.docx
+++ b/docs/project-management/SEISMIK_CONTROL_AVANCE_v0.1.docx
@@ -1883,15 +1883,15 @@
         <w:tblLook w:val="0000" w:firstRow="0" w:lastRow="0" w:firstColumn="0" w:lastColumn="0" w:noHBand="0" w:noVBand="0"/>
       </w:tblPr>
       <w:tblGrid>
-        <w:gridCol w:w="452"/>
-        <w:gridCol w:w="1517"/>
-        <w:gridCol w:w="1184"/>
-        <w:gridCol w:w="675"/>
-        <w:gridCol w:w="992"/>
-        <w:gridCol w:w="1260"/>
-        <w:gridCol w:w="1243"/>
-        <w:gridCol w:w="1540"/>
-        <w:gridCol w:w="1104"/>
+        <w:gridCol w:w="356"/>
+        <w:gridCol w:w="953"/>
+        <w:gridCol w:w="1029"/>
+        <w:gridCol w:w="611"/>
+        <w:gridCol w:w="688"/>
+        <w:gridCol w:w="1126"/>
+        <w:gridCol w:w="912"/>
+        <w:gridCol w:w="3328"/>
+        <w:gridCol w:w="964"/>
       </w:tblGrid>
       <w:tr>
         <w:tblPrEx>
@@ -2186,7 +2186,7 @@
               <w:rPr>
                 <w:sz w:val="17"/>
               </w:rPr>
-              <w:t>ER</w:t>
+              <w:t>CO</w:t>
             </w:r>
           </w:p>
         </w:tc>
@@ -2276,7 +2276,7 @@
               <w:rPr>
                 <w:sz w:val="17"/>
               </w:rPr>
-              <w:t>Product Owner</w:t>
+              <w:t>Creación completada; revisión PO pendiente en S0-02</w:t>
             </w:r>
           </w:p>
         </w:tc>
@@ -2526,7 +2526,7 @@
               <w:rPr>
                 <w:sz w:val="17"/>
               </w:rPr>
-              <w:t>EC</w:t>
+              <w:t>CO</w:t>
             </w:r>
           </w:p>
         </w:tc>
@@ -2598,7 +2598,7 @@
               <w:rPr>
                 <w:sz w:val="17"/>
               </w:rPr>
-              <w:t>.gitignore, git status</w:t>
+              <w:t>.gitignore; scan sin hallazgos</w:t>
             </w:r>
           </w:p>
         </w:tc>
@@ -2696,7 +2696,7 @@
               <w:rPr>
                 <w:sz w:val="17"/>
               </w:rPr>
-              <w:t>NI</w:t>
+              <w:t>CO</w:t>
             </w:r>
           </w:p>
         </w:tc>
@@ -2768,7 +2768,7 @@
               <w:rPr>
                 <w:sz w:val="17"/>
               </w:rPr>
-              <w:t>Hash de commit</w:t>
+              <w:t>d8382c10dfa219551da3d696943be478c55d8b7b</w:t>
             </w:r>
           </w:p>
         </w:tc>
@@ -2866,7 +2866,7 @@
               <w:rPr>
                 <w:sz w:val="17"/>
               </w:rPr>
-              <w:t>ER</w:t>
+              <w:t>CO</w:t>
             </w:r>
           </w:p>
         </w:tc>
@@ -2956,7 +2956,7 @@
               <w:rPr>
                 <w:sz w:val="17"/>
               </w:rPr>
-              <w:t>Product Owner</w:t>
+              <w:t>Creación completada; PO revisa en S0-02</w:t>
             </w:r>
           </w:p>
         </w:tc>
@@ -3160,13 +3160,13 @@
         <w:tblLook w:val="0000" w:firstRow="0" w:lastRow="0" w:firstColumn="0" w:lastColumn="0" w:noHBand="0" w:noVBand="0"/>
       </w:tblPr>
       <w:tblGrid>
-        <w:gridCol w:w="751"/>
-        <w:gridCol w:w="2139"/>
+        <w:gridCol w:w="708"/>
+        <w:gridCol w:w="1458"/>
         <w:gridCol w:w="609"/>
-        <w:gridCol w:w="1252"/>
+        <w:gridCol w:w="1184"/>
         <w:gridCol w:w="675"/>
-        <w:gridCol w:w="2469"/>
-        <w:gridCol w:w="2072"/>
+        <w:gridCol w:w="1572"/>
+        <w:gridCol w:w="3761"/>
       </w:tblGrid>
       <w:tr>
         <w:tblPrEx>
@@ -3433,7 +3433,7 @@
               <w:rPr>
                 <w:sz w:val="17"/>
               </w:rPr>
-              <w:t>EC</w:t>
+              <w:t>CO</w:t>
             </w:r>
           </w:p>
         </w:tc>
@@ -3469,7 +3469,7 @@
               <w:rPr>
                 <w:sz w:val="17"/>
               </w:rPr>
-              <w:t>Git</w:t>
+              <w:t>d8382c10dfa219551da3d696943be478c55d8b7b</w:t>
             </w:r>
           </w:p>
         </w:tc>
@@ -4299,6 +4299,7 @@
               <w:rPr>
                 <w:sz w:val="17"/>
               </w:rPr>
+              <w:lastRenderedPageBreak/>
               <w:t>ENT-008</w:t>
             </w:r>
           </w:p>
@@ -10627,7 +10628,7 @@
   <w:abstractNum w:abstractNumId="0" w15:restartNumberingAfterBreak="0">
     <w:nsid w:val="FFFFFF89"/>
     <w:multiLevelType w:val="singleLevel"/>
-    <w:tmpl w:val="02E66A5E"/>
+    <w:tmpl w:val="8388759C"/>
     <w:lvl w:ilvl="0">
       <w:start w:val="1"/>
       <w:numFmt w:val="bullet"/>
@@ -10645,7 +10646,7 @@
       </w:rPr>
     </w:lvl>
   </w:abstractNum>
-  <w:num w:numId="1" w16cid:durableId="275333887">
+  <w:num w:numId="1" w16cid:durableId="2144077168">
     <w:abstractNumId w:val="0"/>
   </w:num>
 </w:numbering>
@@ -11066,7 +11067,7 @@
     <w:link w:val="Ttulo1Car"/>
     <w:uiPriority w:val="9"/>
     <w:qFormat/>
-    <w:rsid w:val="00F51ADA"/>
+    <w:rsid w:val="00FA3BD9"/>
     <w:pPr>
       <w:keepNext/>
       <w:keepLines/>
@@ -11089,7 +11090,7 @@
     <w:semiHidden/>
     <w:unhideWhenUsed/>
     <w:qFormat/>
-    <w:rsid w:val="00F51ADA"/>
+    <w:rsid w:val="00FA3BD9"/>
     <w:pPr>
       <w:keepNext/>
       <w:keepLines/>
@@ -11112,7 +11113,7 @@
     <w:semiHidden/>
     <w:unhideWhenUsed/>
     <w:qFormat/>
-    <w:rsid w:val="00F51ADA"/>
+    <w:rsid w:val="00FA3BD9"/>
     <w:pPr>
       <w:keepNext/>
       <w:keepLines/>
@@ -11135,7 +11136,7 @@
     <w:semiHidden/>
     <w:unhideWhenUsed/>
     <w:qFormat/>
-    <w:rsid w:val="00F51ADA"/>
+    <w:rsid w:val="00FA3BD9"/>
     <w:pPr>
       <w:keepNext/>
       <w:keepLines/>
@@ -11158,7 +11159,7 @@
     <w:semiHidden/>
     <w:unhideWhenUsed/>
     <w:qFormat/>
-    <w:rsid w:val="00F51ADA"/>
+    <w:rsid w:val="00FA3BD9"/>
     <w:pPr>
       <w:keepNext/>
       <w:keepLines/>
@@ -11179,7 +11180,7 @@
     <w:semiHidden/>
     <w:unhideWhenUsed/>
     <w:qFormat/>
-    <w:rsid w:val="00F51ADA"/>
+    <w:rsid w:val="00FA3BD9"/>
     <w:pPr>
       <w:keepNext/>
       <w:keepLines/>
@@ -11202,7 +11203,7 @@
     <w:semiHidden/>
     <w:unhideWhenUsed/>
     <w:qFormat/>
-    <w:rsid w:val="00F51ADA"/>
+    <w:rsid w:val="00FA3BD9"/>
     <w:pPr>
       <w:keepNext/>
       <w:keepLines/>
@@ -11223,7 +11224,7 @@
     <w:semiHidden/>
     <w:unhideWhenUsed/>
     <w:qFormat/>
-    <w:rsid w:val="00F51ADA"/>
+    <w:rsid w:val="00FA3BD9"/>
     <w:pPr>
       <w:keepNext/>
       <w:keepLines/>
@@ -11246,7 +11247,7 @@
     <w:semiHidden/>
     <w:unhideWhenUsed/>
     <w:qFormat/>
-    <w:rsid w:val="00F51ADA"/>
+    <w:rsid w:val="00FA3BD9"/>
     <w:pPr>
       <w:keepNext/>
       <w:keepLines/>
@@ -11290,7 +11291,7 @@
     <w:basedOn w:val="Fuentedeprrafopredeter"/>
     <w:link w:val="Ttulo1"/>
     <w:uiPriority w:val="9"/>
-    <w:rsid w:val="00F51ADA"/>
+    <w:rsid w:val="00FA3BD9"/>
     <w:rPr>
       <w:rFonts w:ascii="Aptos Display" w:eastAsiaTheme="majorEastAsia" w:hAnsi="Aptos Display" w:cstheme="majorBidi"/>
       <w:color w:val="13458B"/>
@@ -11304,7 +11305,7 @@
     <w:link w:val="Ttulo2"/>
     <w:uiPriority w:val="9"/>
     <w:semiHidden/>
-    <w:rsid w:val="00F51ADA"/>
+    <w:rsid w:val="00FA3BD9"/>
     <w:rPr>
       <w:rFonts w:ascii="Aptos Display" w:eastAsiaTheme="majorEastAsia" w:hAnsi="Aptos Display" w:cstheme="majorBidi"/>
       <w:color w:val="13458B"/>
@@ -11318,7 +11319,7 @@
     <w:link w:val="Ttulo3"/>
     <w:uiPriority w:val="9"/>
     <w:semiHidden/>
-    <w:rsid w:val="00F51ADA"/>
+    <w:rsid w:val="00FA3BD9"/>
     <w:rPr>
       <w:rFonts w:ascii="Aptos Display" w:eastAsiaTheme="majorEastAsia" w:hAnsi="Aptos Display" w:cstheme="majorBidi"/>
       <w:color w:val="13458B"/>
@@ -11332,7 +11333,7 @@
     <w:link w:val="Ttulo4"/>
     <w:uiPriority w:val="9"/>
     <w:semiHidden/>
-    <w:rsid w:val="00F51ADA"/>
+    <w:rsid w:val="00FA3BD9"/>
     <w:rPr>
       <w:rFonts w:eastAsiaTheme="majorEastAsia" w:cstheme="majorBidi"/>
       <w:i/>
@@ -11346,7 +11347,7 @@
     <w:link w:val="Ttulo5"/>
     <w:uiPriority w:val="9"/>
     <w:semiHidden/>
-    <w:rsid w:val="00F51ADA"/>
+    <w:rsid w:val="00FA3BD9"/>
     <w:rPr>
       <w:rFonts w:eastAsiaTheme="majorEastAsia" w:cstheme="majorBidi"/>
       <w:color w:val="0F4761" w:themeColor="accent1" w:themeShade="BF"/>
@@ -11358,7 +11359,7 @@
     <w:link w:val="Ttulo6"/>
     <w:uiPriority w:val="9"/>
     <w:semiHidden/>
-    <w:rsid w:val="00F51ADA"/>
+    <w:rsid w:val="00FA3BD9"/>
     <w:rPr>
       <w:rFonts w:eastAsiaTheme="majorEastAsia" w:cstheme="majorBidi"/>
       <w:i/>
@@ -11372,7 +11373,7 @@
     <w:link w:val="Ttulo7"/>
     <w:uiPriority w:val="9"/>
     <w:semiHidden/>
-    <w:rsid w:val="00F51ADA"/>
+    <w:rsid w:val="00FA3BD9"/>
     <w:rPr>
       <w:rFonts w:eastAsiaTheme="majorEastAsia" w:cstheme="majorBidi"/>
       <w:color w:val="595959" w:themeColor="text1" w:themeTint="A6"/>
@@ -11384,7 +11385,7 @@
     <w:link w:val="Ttulo8"/>
     <w:uiPriority w:val="9"/>
     <w:semiHidden/>
-    <w:rsid w:val="00F51ADA"/>
+    <w:rsid w:val="00FA3BD9"/>
     <w:rPr>
       <w:rFonts w:eastAsiaTheme="majorEastAsia" w:cstheme="majorBidi"/>
       <w:i/>
@@ -11398,7 +11399,7 @@
     <w:link w:val="Ttulo9"/>
     <w:uiPriority w:val="9"/>
     <w:semiHidden/>
-    <w:rsid w:val="00F51ADA"/>
+    <w:rsid w:val="00FA3BD9"/>
     <w:rPr>
       <w:rFonts w:eastAsiaTheme="majorEastAsia" w:cstheme="majorBidi"/>
       <w:color w:val="272727" w:themeColor="text1" w:themeTint="D8"/>
@@ -11411,7 +11412,7 @@
     <w:link w:val="TtuloCar"/>
     <w:uiPriority w:val="10"/>
     <w:qFormat/>
-    <w:rsid w:val="00F51ADA"/>
+    <w:rsid w:val="00FA3BD9"/>
     <w:pPr>
       <w:spacing w:after="80"/>
       <w:contextualSpacing/>
@@ -11430,7 +11431,7 @@
     <w:basedOn w:val="Fuentedeprrafopredeter"/>
     <w:link w:val="Ttulo"/>
     <w:uiPriority w:val="10"/>
-    <w:rsid w:val="00F51ADA"/>
+    <w:rsid w:val="00FA3BD9"/>
     <w:rPr>
       <w:rFonts w:ascii="Aptos Display" w:eastAsiaTheme="majorEastAsia" w:hAnsi="Aptos Display" w:cstheme="majorBidi"/>
       <w:color w:val="13458B"/>
@@ -11447,7 +11448,7 @@
     <w:link w:val="SubttuloCar"/>
     <w:uiPriority w:val="11"/>
     <w:qFormat/>
-    <w:rsid w:val="00F51ADA"/>
+    <w:rsid w:val="00FA3BD9"/>
     <w:pPr>
       <w:numPr>
         <w:ilvl w:val="1"/>
@@ -11466,7 +11467,7 @@
     <w:basedOn w:val="Fuentedeprrafopredeter"/>
     <w:link w:val="Subttulo"/>
     <w:uiPriority w:val="11"/>
-    <w:rsid w:val="00F51ADA"/>
+    <w:rsid w:val="00FA3BD9"/>
     <w:rPr>
       <w:rFonts w:eastAsiaTheme="majorEastAsia" w:cstheme="majorBidi"/>
       <w:color w:val="595959" w:themeColor="text1" w:themeTint="A6"/>
@@ -11482,7 +11483,7 @@
     <w:link w:val="CitaCar"/>
     <w:uiPriority w:val="29"/>
     <w:qFormat/>
-    <w:rsid w:val="00F51ADA"/>
+    <w:rsid w:val="00FA3BD9"/>
     <w:pPr>
       <w:spacing w:before="160"/>
       <w:jc w:val="center"/>
@@ -11498,7 +11499,7 @@
     <w:basedOn w:val="Fuentedeprrafopredeter"/>
     <w:link w:val="Cita"/>
     <w:uiPriority w:val="29"/>
-    <w:rsid w:val="00F51ADA"/>
+    <w:rsid w:val="00FA3BD9"/>
     <w:rPr>
       <w:i/>
       <w:iCs/>
@@ -11510,7 +11511,7 @@
     <w:basedOn w:val="Normal"/>
     <w:uiPriority w:val="34"/>
     <w:qFormat/>
-    <w:rsid w:val="00F51ADA"/>
+    <w:rsid w:val="00FA3BD9"/>
     <w:pPr>
       <w:ind w:left="720"/>
       <w:contextualSpacing/>
@@ -11521,7 +11522,7 @@
     <w:basedOn w:val="Fuentedeprrafopredeter"/>
     <w:uiPriority w:val="21"/>
     <w:qFormat/>
-    <w:rsid w:val="00F51ADA"/>
+    <w:rsid w:val="00FA3BD9"/>
     <w:rPr>
       <w:i/>
       <w:iCs/>
@@ -11535,7 +11536,7 @@
     <w:link w:val="CitadestacadaCar"/>
     <w:uiPriority w:val="30"/>
     <w:qFormat/>
-    <w:rsid w:val="00F51ADA"/>
+    <w:rsid w:val="00FA3BD9"/>
     <w:pPr>
       <w:pBdr>
         <w:top w:val="single" w:sz="4" w:space="10" w:color="0F4761" w:themeColor="accent1" w:themeShade="BF"/>
@@ -11556,7 +11557,7 @@
     <w:basedOn w:val="Fuentedeprrafopredeter"/>
     <w:link w:val="Citadestacada"/>
     <w:uiPriority w:val="30"/>
-    <w:rsid w:val="00F51ADA"/>
+    <w:rsid w:val="00FA3BD9"/>
     <w:rPr>
       <w:i/>
       <w:iCs/>
@@ -11568,7 +11569,7 @@
     <w:basedOn w:val="Fuentedeprrafopredeter"/>
     <w:uiPriority w:val="32"/>
     <w:qFormat/>
-    <w:rsid w:val="00F51ADA"/>
+    <w:rsid w:val="00FA3BD9"/>
     <w:rPr>
       <w:b/>
       <w:bCs/>
@@ -11583,7 +11584,7 @@
     <w:link w:val="EncabezadoCar"/>
     <w:uiPriority w:val="99"/>
     <w:unhideWhenUsed/>
-    <w:rsid w:val="00F51ADA"/>
+    <w:rsid w:val="00FA3BD9"/>
     <w:pPr>
       <w:tabs>
         <w:tab w:val="center" w:pos="4419"/>
@@ -11597,7 +11598,7 @@
     <w:basedOn w:val="Fuentedeprrafopredeter"/>
     <w:link w:val="Encabezado"/>
     <w:uiPriority w:val="99"/>
-    <w:rsid w:val="00F51ADA"/>
+    <w:rsid w:val="00FA3BD9"/>
     <w:rPr>
       <w:rFonts w:ascii="Aptos" w:hAnsi="Aptos"/>
       <w:sz w:val="20"/>
@@ -11609,7 +11610,7 @@
     <w:link w:val="PiedepginaCar"/>
     <w:uiPriority w:val="99"/>
     <w:unhideWhenUsed/>
-    <w:rsid w:val="00F51ADA"/>
+    <w:rsid w:val="00FA3BD9"/>
     <w:pPr>
       <w:tabs>
         <w:tab w:val="center" w:pos="4419"/>
@@ -11623,7 +11624,7 @@
     <w:basedOn w:val="Fuentedeprrafopredeter"/>
     <w:link w:val="Piedepgina"/>
     <w:uiPriority w:val="99"/>
-    <w:rsid w:val="00F51ADA"/>
+    <w:rsid w:val="00FA3BD9"/>
     <w:rPr>
       <w:rFonts w:ascii="Aptos" w:hAnsi="Aptos"/>
       <w:sz w:val="20"/>
@@ -11634,7 +11635,7 @@
     <w:basedOn w:val="Normal"/>
     <w:uiPriority w:val="99"/>
     <w:unhideWhenUsed/>
-    <w:rsid w:val="00F51ADA"/>
+    <w:rsid w:val="00FA3BD9"/>
     <w:pPr>
       <w:numPr>
         <w:numId w:val="1"/>

</xml_diff>

<commit_message>
feat: complete Sprint 1 seismic ingestion and replay
</commit_message>
<xml_diff>
--- a/docs/project-management/SEISMIK_CONTROL_AVANCE_v0.1.docx
+++ b/docs/project-management/SEISMIK_CONTROL_AVANCE_v0.1.docx
@@ -17,12 +17,12 @@
     </w:p>
     <w:p>
       <w:r>
-        <w:t xml:space="preserve">Fecha de corte: 23 de agosto de 2026  </w:t>
+        <w:t xml:space="preserve">Fecha de corte: 24 de agosto de 2026  </w:t>
       </w:r>
     </w:p>
     <w:p>
       <w:r>
-        <w:t xml:space="preserve">Estado general: Alfa 0.1 — Sprint 0 en ejecución  </w:t>
+        <w:t xml:space="preserve">Estado general: Alfa 0.1 — Sprint 1 cerrado técnicamente; modo sombra obligatorio  </w:t>
       </w:r>
     </w:p>
     <w:p>
@@ -269,6 +269,104 @@
                 <w:sz w:val="17"/>
               </w:rPr>
               <w:t>Registro inicial de control y trazabilidad</w:t>
+            </w:r>
+          </w:p>
+        </w:tc>
+        <w:tc>
+          <w:tcPr>
+            <w:tcW w:w="0" w:type="auto"/>
+          </w:tcPr>
+          <w:p>
+            <w:pPr>
+              <w:rPr>
+                <w:sz w:val="17"/>
+              </w:rPr>
+            </w:pPr>
+            <w:r>
+              <w:rPr>
+                <w:sz w:val="17"/>
+              </w:rPr>
+              <w:t>Activo</w:t>
+            </w:r>
+          </w:p>
+        </w:tc>
+      </w:tr>
+      <w:tr>
+        <w:tblPrEx>
+          <w:tblCellMar>
+            <w:top w:w="0" w:type="dxa"/>
+            <w:bottom w:w="0" w:type="dxa"/>
+          </w:tblCellMar>
+        </w:tblPrEx>
+        <w:tc>
+          <w:tcPr>
+            <w:tcW w:w="0" w:type="auto"/>
+          </w:tcPr>
+          <w:p>
+            <w:pPr>
+              <w:rPr>
+                <w:sz w:val="17"/>
+              </w:rPr>
+            </w:pPr>
+            <w:r>
+              <w:rPr>
+                <w:sz w:val="17"/>
+              </w:rPr>
+              <w:t>0.1.1</w:t>
+            </w:r>
+          </w:p>
+        </w:tc>
+        <w:tc>
+          <w:tcPr>
+            <w:tcW w:w="0" w:type="auto"/>
+          </w:tcPr>
+          <w:p>
+            <w:pPr>
+              <w:rPr>
+                <w:sz w:val="17"/>
+              </w:rPr>
+            </w:pPr>
+            <w:r>
+              <w:rPr>
+                <w:sz w:val="17"/>
+              </w:rPr>
+              <w:t>2026-08-24</w:t>
+            </w:r>
+          </w:p>
+        </w:tc>
+        <w:tc>
+          <w:tcPr>
+            <w:tcW w:w="0" w:type="auto"/>
+          </w:tcPr>
+          <w:p>
+            <w:pPr>
+              <w:rPr>
+                <w:sz w:val="17"/>
+              </w:rPr>
+            </w:pPr>
+            <w:r>
+              <w:rPr>
+                <w:sz w:val="17"/>
+              </w:rPr>
+              <w:t>Codex</w:t>
+            </w:r>
+          </w:p>
+        </w:tc>
+        <w:tc>
+          <w:tcPr>
+            <w:tcW w:w="0" w:type="auto"/>
+          </w:tcPr>
+          <w:p>
+            <w:pPr>
+              <w:rPr>
+                <w:sz w:val="17"/>
+              </w:rPr>
+            </w:pPr>
+            <w:r>
+              <w:rPr>
+                <w:sz w:val="17"/>
+              </w:rPr>
+              <w:t>Evidencia y cierre técnico del Sprint 1</w:t>
             </w:r>
           </w:p>
         </w:tc>
@@ -832,9 +930,9 @@
         <w:tblLook w:val="0000" w:firstRow="0" w:lastRow="0" w:firstColumn="0" w:lastColumn="0" w:noHBand="0" w:noVBand="0"/>
       </w:tblPr>
       <w:tblGrid>
-        <w:gridCol w:w="1857"/>
-        <w:gridCol w:w="2696"/>
-        <w:gridCol w:w="1775"/>
+        <w:gridCol w:w="1965"/>
+        <w:gridCol w:w="2484"/>
+        <w:gridCol w:w="1879"/>
         <w:gridCol w:w="895"/>
         <w:gridCol w:w="2739"/>
       </w:tblGrid>
@@ -1003,7 +1101,7 @@
               <w:rPr>
                 <w:sz w:val="17"/>
               </w:rPr>
-              <w:t>0 de 8 aceptados</w:t>
+              <w:t>1 de 8 cerrados técnicamente</w:t>
             </w:r>
           </w:p>
         </w:tc>
@@ -1057,7 +1155,7 @@
               <w:rPr>
                 <w:sz w:val="17"/>
               </w:rPr>
-              <w:t>Este documento</w:t>
+              <w:t>Informe Sprint 1</w:t>
             </w:r>
           </w:p>
         </w:tc>
@@ -1297,7 +1395,7 @@
               <w:rPr>
                 <w:sz w:val="17"/>
               </w:rPr>
-              <w:t>No ejecutables por falta de Python activo</w:t>
+              <w:t>32 aprobadas; Ruff y mypy limpios</w:t>
             </w:r>
           </w:p>
         </w:tc>
@@ -1333,25 +1431,25 @@
               <w:rPr>
                 <w:sz w:val="17"/>
               </w:rPr>
-              <w:t>Rojo</w:t>
-            </w:r>
-          </w:p>
-        </w:tc>
-        <w:tc>
-          <w:tcPr>
-            <w:tcW w:w="0" w:type="auto"/>
-          </w:tcPr>
-          <w:p>
-            <w:pPr>
-              <w:rPr>
-                <w:sz w:val="17"/>
-              </w:rPr>
-            </w:pPr>
-            <w:r>
-              <w:rPr>
-                <w:sz w:val="17"/>
-              </w:rPr>
-              <w:t>Entorno local 2026-08-23</w:t>
+              <w:t>Verde</w:t>
+            </w:r>
+          </w:p>
+        </w:tc>
+        <w:tc>
+          <w:tcPr>
+            <w:tcW w:w="0" w:type="auto"/>
+          </w:tcPr>
+          <w:p>
+            <w:pPr>
+              <w:rPr>
+                <w:sz w:val="17"/>
+              </w:rPr>
+            </w:pPr>
+            <w:r>
+              <w:rPr>
+                <w:sz w:val="17"/>
+              </w:rPr>
+              <w:t>Entorno local 2026-08-24</w:t>
             </w:r>
           </w:p>
         </w:tc>
@@ -1705,17 +1803,9 @@
             </w:pPr>
             <w:r>
               <w:rPr>
-                <w:rFonts w:hint="eastAsia"/>
-                <w:sz w:val="17"/>
-              </w:rPr>
-              <w:t>≤</w:t>
-            </w:r>
-            <w:r>
-              <w:rPr>
-                <w:rFonts w:hint="eastAsia"/>
-                <w:sz w:val="17"/>
-              </w:rPr>
-              <w:t>150.000 COP/mes</w:t>
+                <w:sz w:val="17"/>
+              </w:rPr>
+              <w:t>≤150.000 COP/mes</w:t>
             </w:r>
           </w:p>
         </w:tc>
@@ -1777,6 +1867,7 @@
               <w:rPr>
                 <w:sz w:val="17"/>
               </w:rPr>
+              <w:lastRenderedPageBreak/>
               <w:t>Alertas públicas</w:t>
             </w:r>
           </w:p>
@@ -3138,6 +3229,888 @@
         <w:pStyle w:val="Ttulo1"/>
       </w:pPr>
       <w:r>
+        <w:t>3.1 Tablero de Sprint 1</w:t>
+      </w:r>
+    </w:p>
+    <w:tbl>
+      <w:tblPr>
+        <w:tblW w:w="0" w:type="auto"/>
+        <w:tblInd w:w="-5" w:type="dxa"/>
+        <w:tblBorders>
+          <w:top w:val="single" w:sz="4" w:space="0" w:color="auto"/>
+          <w:left w:val="single" w:sz="4" w:space="0" w:color="auto"/>
+          <w:bottom w:val="single" w:sz="4" w:space="0" w:color="auto"/>
+          <w:right w:val="single" w:sz="4" w:space="0" w:color="auto"/>
+          <w:insideH w:val="single" w:sz="4" w:space="0" w:color="auto"/>
+          <w:insideV w:val="single" w:sz="4" w:space="0" w:color="auto"/>
+        </w:tblBorders>
+        <w:tblCellMar>
+          <w:left w:w="70" w:type="dxa"/>
+          <w:right w:w="70" w:type="dxa"/>
+        </w:tblCellMar>
+        <w:tblLook w:val="0000" w:firstRow="0" w:lastRow="0" w:firstColumn="0" w:lastColumn="0" w:noHBand="0" w:noVBand="0"/>
+      </w:tblPr>
+      <w:tblGrid>
+        <w:gridCol w:w="517"/>
+        <w:gridCol w:w="1671"/>
+        <w:gridCol w:w="1234"/>
+        <w:gridCol w:w="675"/>
+        <w:gridCol w:w="2210"/>
+        <w:gridCol w:w="3660"/>
+      </w:tblGrid>
+      <w:tr>
+        <w:tblPrEx>
+          <w:tblCellMar>
+            <w:top w:w="0" w:type="dxa"/>
+            <w:bottom w:w="0" w:type="dxa"/>
+          </w:tblCellMar>
+        </w:tblPrEx>
+        <w:trPr>
+          <w:tblHeader/>
+        </w:trPr>
+        <w:tc>
+          <w:tcPr>
+            <w:tcW w:w="0" w:type="auto"/>
+            <w:shd w:val="clear" w:color="auto" w:fill="13458B"/>
+          </w:tcPr>
+          <w:p>
+            <w:pPr>
+              <w:rPr>
+                <w:b/>
+                <w:color w:val="FFFFFF"/>
+                <w:sz w:val="17"/>
+              </w:rPr>
+            </w:pPr>
+            <w:r>
+              <w:rPr>
+                <w:b/>
+                <w:color w:val="FFFFFF"/>
+                <w:sz w:val="17"/>
+              </w:rPr>
+              <w:t>ID</w:t>
+            </w:r>
+          </w:p>
+        </w:tc>
+        <w:tc>
+          <w:tcPr>
+            <w:tcW w:w="0" w:type="auto"/>
+            <w:shd w:val="clear" w:color="auto" w:fill="13458B"/>
+          </w:tcPr>
+          <w:p>
+            <w:pPr>
+              <w:rPr>
+                <w:b/>
+                <w:color w:val="FFFFFF"/>
+                <w:sz w:val="17"/>
+              </w:rPr>
+            </w:pPr>
+            <w:r>
+              <w:rPr>
+                <w:b/>
+                <w:color w:val="FFFFFF"/>
+                <w:sz w:val="17"/>
+              </w:rPr>
+              <w:t>Actividad</w:t>
+            </w:r>
+          </w:p>
+        </w:tc>
+        <w:tc>
+          <w:tcPr>
+            <w:tcW w:w="0" w:type="auto"/>
+            <w:shd w:val="clear" w:color="auto" w:fill="13458B"/>
+          </w:tcPr>
+          <w:p>
+            <w:pPr>
+              <w:rPr>
+                <w:b/>
+                <w:color w:val="FFFFFF"/>
+                <w:sz w:val="17"/>
+              </w:rPr>
+            </w:pPr>
+            <w:r>
+              <w:rPr>
+                <w:b/>
+                <w:color w:val="FFFFFF"/>
+                <w:sz w:val="17"/>
+              </w:rPr>
+              <w:t>Responsable</w:t>
+            </w:r>
+          </w:p>
+        </w:tc>
+        <w:tc>
+          <w:tcPr>
+            <w:tcW w:w="0" w:type="auto"/>
+            <w:shd w:val="clear" w:color="auto" w:fill="13458B"/>
+          </w:tcPr>
+          <w:p>
+            <w:pPr>
+              <w:rPr>
+                <w:b/>
+                <w:color w:val="FFFFFF"/>
+                <w:sz w:val="17"/>
+              </w:rPr>
+            </w:pPr>
+            <w:r>
+              <w:rPr>
+                <w:b/>
+                <w:color w:val="FFFFFF"/>
+                <w:sz w:val="17"/>
+              </w:rPr>
+              <w:t>Estado</w:t>
+            </w:r>
+          </w:p>
+        </w:tc>
+        <w:tc>
+          <w:tcPr>
+            <w:tcW w:w="0" w:type="auto"/>
+            <w:shd w:val="clear" w:color="auto" w:fill="13458B"/>
+          </w:tcPr>
+          <w:p>
+            <w:pPr>
+              <w:rPr>
+                <w:b/>
+                <w:color w:val="FFFFFF"/>
+                <w:sz w:val="17"/>
+              </w:rPr>
+            </w:pPr>
+            <w:r>
+              <w:rPr>
+                <w:b/>
+                <w:color w:val="FFFFFF"/>
+                <w:sz w:val="17"/>
+              </w:rPr>
+              <w:t>Entregable</w:t>
+            </w:r>
+          </w:p>
+        </w:tc>
+        <w:tc>
+          <w:tcPr>
+            <w:tcW w:w="0" w:type="auto"/>
+            <w:shd w:val="clear" w:color="auto" w:fill="13458B"/>
+          </w:tcPr>
+          <w:p>
+            <w:pPr>
+              <w:rPr>
+                <w:b/>
+                <w:color w:val="FFFFFF"/>
+                <w:sz w:val="17"/>
+              </w:rPr>
+            </w:pPr>
+            <w:r>
+              <w:rPr>
+                <w:b/>
+                <w:color w:val="FFFFFF"/>
+                <w:sz w:val="17"/>
+              </w:rPr>
+              <w:t>Evidencia</w:t>
+            </w:r>
+          </w:p>
+        </w:tc>
+      </w:tr>
+      <w:tr>
+        <w:tblPrEx>
+          <w:tblCellMar>
+            <w:top w:w="0" w:type="dxa"/>
+            <w:bottom w:w="0" w:type="dxa"/>
+          </w:tblCellMar>
+        </w:tblPrEx>
+        <w:tc>
+          <w:tcPr>
+            <w:tcW w:w="0" w:type="auto"/>
+          </w:tcPr>
+          <w:p>
+            <w:pPr>
+              <w:rPr>
+                <w:sz w:val="17"/>
+              </w:rPr>
+            </w:pPr>
+            <w:r>
+              <w:rPr>
+                <w:sz w:val="17"/>
+              </w:rPr>
+              <w:t>S1-01</w:t>
+            </w:r>
+          </w:p>
+        </w:tc>
+        <w:tc>
+          <w:tcPr>
+            <w:tcW w:w="0" w:type="auto"/>
+          </w:tcPr>
+          <w:p>
+            <w:pPr>
+              <w:rPr>
+                <w:sz w:val="17"/>
+              </w:rPr>
+            </w:pPr>
+            <w:r>
+              <w:rPr>
+                <w:sz w:val="17"/>
+              </w:rPr>
+              <w:t>Fijar Python y calidad</w:t>
+            </w:r>
+          </w:p>
+        </w:tc>
+        <w:tc>
+          <w:tcPr>
+            <w:tcW w:w="0" w:type="auto"/>
+          </w:tcPr>
+          <w:p>
+            <w:pPr>
+              <w:rPr>
+                <w:sz w:val="17"/>
+              </w:rPr>
+            </w:pPr>
+            <w:r>
+              <w:rPr>
+                <w:sz w:val="17"/>
+              </w:rPr>
+              <w:t>Codex</w:t>
+            </w:r>
+          </w:p>
+        </w:tc>
+        <w:tc>
+          <w:tcPr>
+            <w:tcW w:w="0" w:type="auto"/>
+          </w:tcPr>
+          <w:p>
+            <w:pPr>
+              <w:rPr>
+                <w:sz w:val="17"/>
+              </w:rPr>
+            </w:pPr>
+            <w:r>
+              <w:rPr>
+                <w:sz w:val="17"/>
+              </w:rPr>
+              <w:t>CO</w:t>
+            </w:r>
+          </w:p>
+        </w:tc>
+        <w:tc>
+          <w:tcPr>
+            <w:tcW w:w="0" w:type="auto"/>
+          </w:tcPr>
+          <w:p>
+            <w:pPr>
+              <w:rPr>
+                <w:sz w:val="17"/>
+              </w:rPr>
+            </w:pPr>
+            <w:r>
+              <w:rPr>
+                <w:sz w:val="17"/>
+              </w:rPr>
+              <w:t>Python 3.12.10 + herramientas</w:t>
+            </w:r>
+          </w:p>
+        </w:tc>
+        <w:tc>
+          <w:tcPr>
+            <w:tcW w:w="0" w:type="auto"/>
+          </w:tcPr>
+          <w:p>
+            <w:pPr>
+              <w:rPr>
+                <w:sz w:val="17"/>
+              </w:rPr>
+            </w:pPr>
+            <w:r>
+              <w:rPr>
+                <w:sz w:val="17"/>
+              </w:rPr>
+              <w:t>.python-version, pyproject.toml</w:t>
+            </w:r>
+          </w:p>
+        </w:tc>
+      </w:tr>
+      <w:tr>
+        <w:tblPrEx>
+          <w:tblCellMar>
+            <w:top w:w="0" w:type="dxa"/>
+            <w:bottom w:w="0" w:type="dxa"/>
+          </w:tblCellMar>
+        </w:tblPrEx>
+        <w:tc>
+          <w:tcPr>
+            <w:tcW w:w="0" w:type="auto"/>
+          </w:tcPr>
+          <w:p>
+            <w:pPr>
+              <w:rPr>
+                <w:sz w:val="17"/>
+              </w:rPr>
+            </w:pPr>
+            <w:r>
+              <w:rPr>
+                <w:sz w:val="17"/>
+              </w:rPr>
+              <w:t>S1-02</w:t>
+            </w:r>
+          </w:p>
+        </w:tc>
+        <w:tc>
+          <w:tcPr>
+            <w:tcW w:w="0" w:type="auto"/>
+          </w:tcPr>
+          <w:p>
+            <w:pPr>
+              <w:rPr>
+                <w:sz w:val="17"/>
+              </w:rPr>
+            </w:pPr>
+            <w:r>
+              <w:rPr>
+                <w:sz w:val="17"/>
+              </w:rPr>
+              <w:t>Verificar estaciones CM</w:t>
+            </w:r>
+          </w:p>
+        </w:tc>
+        <w:tc>
+          <w:tcPr>
+            <w:tcW w:w="0" w:type="auto"/>
+          </w:tcPr>
+          <w:p>
+            <w:pPr>
+              <w:rPr>
+                <w:sz w:val="17"/>
+              </w:rPr>
+            </w:pPr>
+            <w:r>
+              <w:rPr>
+                <w:sz w:val="17"/>
+              </w:rPr>
+              <w:t>Codex</w:t>
+            </w:r>
+          </w:p>
+        </w:tc>
+        <w:tc>
+          <w:tcPr>
+            <w:tcW w:w="0" w:type="auto"/>
+          </w:tcPr>
+          <w:p>
+            <w:pPr>
+              <w:rPr>
+                <w:sz w:val="17"/>
+              </w:rPr>
+            </w:pPr>
+            <w:r>
+              <w:rPr>
+                <w:sz w:val="17"/>
+              </w:rPr>
+              <w:t>CO</w:t>
+            </w:r>
+          </w:p>
+        </w:tc>
+        <w:tc>
+          <w:tcPr>
+            <w:tcW w:w="0" w:type="auto"/>
+          </w:tcPr>
+          <w:p>
+            <w:pPr>
+              <w:rPr>
+                <w:sz w:val="17"/>
+              </w:rPr>
+            </w:pPr>
+            <w:r>
+              <w:rPr>
+                <w:sz w:val="17"/>
+              </w:rPr>
+              <w:t>Catálogo fechado</w:t>
+            </w:r>
+          </w:p>
+        </w:tc>
+        <w:tc>
+          <w:tcPr>
+            <w:tcW w:w="0" w:type="auto"/>
+          </w:tcPr>
+          <w:p>
+            <w:pPr>
+              <w:rPr>
+                <w:sz w:val="17"/>
+              </w:rPr>
+            </w:pPr>
+            <w:r>
+              <w:rPr>
+                <w:sz w:val="17"/>
+              </w:rPr>
+              <w:t>data/stations/</w:t>
+            </w:r>
+          </w:p>
+        </w:tc>
+      </w:tr>
+      <w:tr>
+        <w:tblPrEx>
+          <w:tblCellMar>
+            <w:top w:w="0" w:type="dxa"/>
+            <w:bottom w:w="0" w:type="dxa"/>
+          </w:tblCellMar>
+        </w:tblPrEx>
+        <w:tc>
+          <w:tcPr>
+            <w:tcW w:w="0" w:type="auto"/>
+          </w:tcPr>
+          <w:p>
+            <w:pPr>
+              <w:rPr>
+                <w:sz w:val="17"/>
+              </w:rPr>
+            </w:pPr>
+            <w:r>
+              <w:rPr>
+                <w:sz w:val="17"/>
+              </w:rPr>
+              <w:t>S1-03</w:t>
+            </w:r>
+          </w:p>
+        </w:tc>
+        <w:tc>
+          <w:tcPr>
+            <w:tcW w:w="0" w:type="auto"/>
+          </w:tcPr>
+          <w:p>
+            <w:pPr>
+              <w:rPr>
+                <w:sz w:val="17"/>
+              </w:rPr>
+            </w:pPr>
+            <w:r>
+              <w:rPr>
+                <w:sz w:val="17"/>
+              </w:rPr>
+              <w:t>Reconexión y gaps</w:t>
+            </w:r>
+          </w:p>
+        </w:tc>
+        <w:tc>
+          <w:tcPr>
+            <w:tcW w:w="0" w:type="auto"/>
+          </w:tcPr>
+          <w:p>
+            <w:pPr>
+              <w:rPr>
+                <w:sz w:val="17"/>
+              </w:rPr>
+            </w:pPr>
+            <w:r>
+              <w:rPr>
+                <w:sz w:val="17"/>
+              </w:rPr>
+              <w:t>Codex</w:t>
+            </w:r>
+          </w:p>
+        </w:tc>
+        <w:tc>
+          <w:tcPr>
+            <w:tcW w:w="0" w:type="auto"/>
+          </w:tcPr>
+          <w:p>
+            <w:pPr>
+              <w:rPr>
+                <w:sz w:val="17"/>
+              </w:rPr>
+            </w:pPr>
+            <w:r>
+              <w:rPr>
+                <w:sz w:val="17"/>
+              </w:rPr>
+              <w:t>CO</w:t>
+            </w:r>
+          </w:p>
+        </w:tc>
+        <w:tc>
+          <w:tcPr>
+            <w:tcW w:w="0" w:type="auto"/>
+          </w:tcPr>
+          <w:p>
+            <w:pPr>
+              <w:rPr>
+                <w:sz w:val="17"/>
+              </w:rPr>
+            </w:pPr>
+            <w:r>
+              <w:rPr>
+                <w:sz w:val="17"/>
+              </w:rPr>
+              <w:t>Cliente recuperable y contadores</w:t>
+            </w:r>
+          </w:p>
+        </w:tc>
+        <w:tc>
+          <w:tcPr>
+            <w:tcW w:w="0" w:type="auto"/>
+          </w:tcPr>
+          <w:p>
+            <w:pPr>
+              <w:rPr>
+                <w:sz w:val="17"/>
+              </w:rPr>
+            </w:pPr>
+            <w:r>
+              <w:rPr>
+                <w:sz w:val="17"/>
+              </w:rPr>
+              <w:t>src/eew/, tests</w:t>
+            </w:r>
+          </w:p>
+        </w:tc>
+      </w:tr>
+      <w:tr>
+        <w:tblPrEx>
+          <w:tblCellMar>
+            <w:top w:w="0" w:type="dxa"/>
+            <w:bottom w:w="0" w:type="dxa"/>
+          </w:tblCellMar>
+        </w:tblPrEx>
+        <w:tc>
+          <w:tcPr>
+            <w:tcW w:w="0" w:type="auto"/>
+          </w:tcPr>
+          <w:p>
+            <w:pPr>
+              <w:rPr>
+                <w:sz w:val="17"/>
+              </w:rPr>
+            </w:pPr>
+            <w:r>
+              <w:rPr>
+                <w:sz w:val="17"/>
+              </w:rPr>
+              <w:t>S1-04</w:t>
+            </w:r>
+          </w:p>
+        </w:tc>
+        <w:tc>
+          <w:tcPr>
+            <w:tcW w:w="0" w:type="auto"/>
+          </w:tcPr>
+          <w:p>
+            <w:pPr>
+              <w:rPr>
+                <w:sz w:val="17"/>
+              </w:rPr>
+            </w:pPr>
+            <w:r>
+              <w:rPr>
+                <w:sz w:val="17"/>
+              </w:rPr>
+              <w:t>Replay MiniSEED</w:t>
+            </w:r>
+          </w:p>
+        </w:tc>
+        <w:tc>
+          <w:tcPr>
+            <w:tcW w:w="0" w:type="auto"/>
+          </w:tcPr>
+          <w:p>
+            <w:pPr>
+              <w:rPr>
+                <w:sz w:val="17"/>
+              </w:rPr>
+            </w:pPr>
+            <w:r>
+              <w:rPr>
+                <w:sz w:val="17"/>
+              </w:rPr>
+              <w:t>Codex</w:t>
+            </w:r>
+          </w:p>
+        </w:tc>
+        <w:tc>
+          <w:tcPr>
+            <w:tcW w:w="0" w:type="auto"/>
+          </w:tcPr>
+          <w:p>
+            <w:pPr>
+              <w:rPr>
+                <w:sz w:val="17"/>
+              </w:rPr>
+            </w:pPr>
+            <w:r>
+              <w:rPr>
+                <w:sz w:val="17"/>
+              </w:rPr>
+              <w:t>CO</w:t>
+            </w:r>
+          </w:p>
+        </w:tc>
+        <w:tc>
+          <w:tcPr>
+            <w:tcW w:w="0" w:type="auto"/>
+          </w:tcPr>
+          <w:p>
+            <w:pPr>
+              <w:rPr>
+                <w:sz w:val="17"/>
+              </w:rPr>
+            </w:pPr>
+            <w:r>
+              <w:rPr>
+                <w:sz w:val="17"/>
+              </w:rPr>
+              <w:t>Runner determinista</w:t>
+            </w:r>
+          </w:p>
+        </w:tc>
+        <w:tc>
+          <w:tcPr>
+            <w:tcW w:w="0" w:type="auto"/>
+          </w:tcPr>
+          <w:p>
+            <w:pPr>
+              <w:rPr>
+                <w:sz w:val="17"/>
+              </w:rPr>
+            </w:pPr>
+            <w:r>
+              <w:rPr>
+                <w:sz w:val="17"/>
+              </w:rPr>
+              <w:t>src/eew/replay.py</w:t>
+            </w:r>
+          </w:p>
+        </w:tc>
+      </w:tr>
+      <w:tr>
+        <w:tblPrEx>
+          <w:tblCellMar>
+            <w:top w:w="0" w:type="dxa"/>
+            <w:bottom w:w="0" w:type="dxa"/>
+          </w:tblCellMar>
+        </w:tblPrEx>
+        <w:tc>
+          <w:tcPr>
+            <w:tcW w:w="0" w:type="auto"/>
+          </w:tcPr>
+          <w:p>
+            <w:pPr>
+              <w:rPr>
+                <w:sz w:val="17"/>
+              </w:rPr>
+            </w:pPr>
+            <w:r>
+              <w:rPr>
+                <w:sz w:val="17"/>
+              </w:rPr>
+              <w:t>S1-05</w:t>
+            </w:r>
+          </w:p>
+        </w:tc>
+        <w:tc>
+          <w:tcPr>
+            <w:tcW w:w="0" w:type="auto"/>
+          </w:tcPr>
+          <w:p>
+            <w:pPr>
+              <w:rPr>
+                <w:sz w:val="17"/>
+              </w:rPr>
+            </w:pPr>
+            <w:r>
+              <w:rPr>
+                <w:sz w:val="17"/>
+              </w:rPr>
+              <w:t>Casos históricos y ruido</w:t>
+            </w:r>
+          </w:p>
+        </w:tc>
+        <w:tc>
+          <w:tcPr>
+            <w:tcW w:w="0" w:type="auto"/>
+          </w:tcPr>
+          <w:p>
+            <w:pPr>
+              <w:rPr>
+                <w:sz w:val="17"/>
+              </w:rPr>
+            </w:pPr>
+            <w:r>
+              <w:rPr>
+                <w:sz w:val="17"/>
+              </w:rPr>
+              <w:t>Codex + asesor</w:t>
+            </w:r>
+          </w:p>
+        </w:tc>
+        <w:tc>
+          <w:tcPr>
+            <w:tcW w:w="0" w:type="auto"/>
+          </w:tcPr>
+          <w:p>
+            <w:pPr>
+              <w:rPr>
+                <w:sz w:val="17"/>
+              </w:rPr>
+            </w:pPr>
+            <w:r>
+              <w:rPr>
+                <w:sz w:val="17"/>
+              </w:rPr>
+              <w:t>ER</w:t>
+            </w:r>
+          </w:p>
+        </w:tc>
+        <w:tc>
+          <w:tcPr>
+            <w:tcW w:w="0" w:type="auto"/>
+          </w:tcPr>
+          <w:p>
+            <w:pPr>
+              <w:rPr>
+                <w:sz w:val="17"/>
+              </w:rPr>
+            </w:pPr>
+            <w:r>
+              <w:rPr>
+                <w:sz w:val="17"/>
+              </w:rPr>
+              <w:t>4 fixtures con hashes</w:t>
+            </w:r>
+          </w:p>
+        </w:tc>
+        <w:tc>
+          <w:tcPr>
+            <w:tcW w:w="0" w:type="auto"/>
+          </w:tcPr>
+          <w:p>
+            <w:pPr>
+              <w:rPr>
+                <w:sz w:val="17"/>
+              </w:rPr>
+            </w:pPr>
+            <w:r>
+              <w:rPr>
+                <w:sz w:val="17"/>
+              </w:rPr>
+              <w:t>data/replay/manifest.json; revisión científica pendiente</w:t>
+            </w:r>
+          </w:p>
+        </w:tc>
+      </w:tr>
+      <w:tr>
+        <w:tblPrEx>
+          <w:tblCellMar>
+            <w:top w:w="0" w:type="dxa"/>
+            <w:bottom w:w="0" w:type="dxa"/>
+          </w:tblCellMar>
+        </w:tblPrEx>
+        <w:tc>
+          <w:tcPr>
+            <w:tcW w:w="0" w:type="auto"/>
+          </w:tcPr>
+          <w:p>
+            <w:pPr>
+              <w:rPr>
+                <w:sz w:val="17"/>
+              </w:rPr>
+            </w:pPr>
+            <w:r>
+              <w:rPr>
+                <w:sz w:val="17"/>
+              </w:rPr>
+              <w:t>S1-06</w:t>
+            </w:r>
+          </w:p>
+        </w:tc>
+        <w:tc>
+          <w:tcPr>
+            <w:tcW w:w="0" w:type="auto"/>
+          </w:tcPr>
+          <w:p>
+            <w:pPr>
+              <w:rPr>
+                <w:sz w:val="17"/>
+              </w:rPr>
+            </w:pPr>
+            <w:r>
+              <w:rPr>
+                <w:sz w:val="17"/>
+              </w:rPr>
+              <w:t>Suite backend</w:t>
+            </w:r>
+          </w:p>
+        </w:tc>
+        <w:tc>
+          <w:tcPr>
+            <w:tcW w:w="0" w:type="auto"/>
+          </w:tcPr>
+          <w:p>
+            <w:pPr>
+              <w:rPr>
+                <w:sz w:val="17"/>
+              </w:rPr>
+            </w:pPr>
+            <w:r>
+              <w:rPr>
+                <w:sz w:val="17"/>
+              </w:rPr>
+              <w:t>Codex</w:t>
+            </w:r>
+          </w:p>
+        </w:tc>
+        <w:tc>
+          <w:tcPr>
+            <w:tcW w:w="0" w:type="auto"/>
+          </w:tcPr>
+          <w:p>
+            <w:pPr>
+              <w:rPr>
+                <w:sz w:val="17"/>
+              </w:rPr>
+            </w:pPr>
+            <w:r>
+              <w:rPr>
+                <w:sz w:val="17"/>
+              </w:rPr>
+              <w:t>CO</w:t>
+            </w:r>
+          </w:p>
+        </w:tc>
+        <w:tc>
+          <w:tcPr>
+            <w:tcW w:w="0" w:type="auto"/>
+          </w:tcPr>
+          <w:p>
+            <w:pPr>
+              <w:rPr>
+                <w:sz w:val="17"/>
+              </w:rPr>
+            </w:pPr>
+            <w:r>
+              <w:rPr>
+                <w:sz w:val="17"/>
+              </w:rPr>
+              <w:t>32 pruebas aprobadas</w:t>
+            </w:r>
+          </w:p>
+        </w:tc>
+        <w:tc>
+          <w:tcPr>
+            <w:tcW w:w="0" w:type="auto"/>
+          </w:tcPr>
+          <w:p>
+            <w:pPr>
+              <w:rPr>
+                <w:sz w:val="17"/>
+              </w:rPr>
+            </w:pPr>
+            <w:r>
+              <w:rPr>
+                <w:sz w:val="17"/>
+              </w:rPr>
+              <w:t>pytest/Ruff/mypy 2026-08-24</w:t>
+            </w:r>
+          </w:p>
+        </w:tc>
+      </w:tr>
+    </w:tbl>
+    <w:p/>
+    <w:p>
+      <w:pPr>
+        <w:pStyle w:val="Ttulo1"/>
+      </w:pPr>
+      <w:r>
+        <w:lastRenderedPageBreak/>
         <w:t>4. Registro maestro de entregables</w:t>
       </w:r>
     </w:p>
@@ -3701,7 +4674,7 @@
               <w:rPr>
                 <w:sz w:val="17"/>
               </w:rPr>
-              <w:t>NI</w:t>
+              <w:t>CO</w:t>
             </w:r>
           </w:p>
         </w:tc>
@@ -3737,7 +4710,7 @@
               <w:rPr>
                 <w:sz w:val="17"/>
               </w:rPr>
-              <w:t>tests/, informe Sprint</w:t>
+              <w:t>SPRINT_1_CIERRE_2026-08-24.md</w:t>
             </w:r>
           </w:p>
         </w:tc>
@@ -4299,7 +5272,6 @@
               <w:rPr>
                 <w:sz w:val="17"/>
               </w:rPr>
-              <w:lastRenderedPageBreak/>
               <w:t>ENT-008</w:t>
             </w:r>
           </w:p>
@@ -5521,14 +6493,14 @@
         <w:tblLook w:val="0000" w:firstRow="0" w:lastRow="0" w:firstColumn="0" w:lastColumn="0" w:noHBand="0" w:noVBand="0"/>
       </w:tblPr>
       <w:tblGrid>
-        <w:gridCol w:w="420"/>
-        <w:gridCol w:w="2278"/>
+        <w:gridCol w:w="417"/>
+        <w:gridCol w:w="2263"/>
         <w:gridCol w:w="590"/>
         <w:gridCol w:w="785"/>
         <w:gridCol w:w="634"/>
-        <w:gridCol w:w="1217"/>
-        <w:gridCol w:w="2912"/>
-        <w:gridCol w:w="1131"/>
+        <w:gridCol w:w="1216"/>
+        <w:gridCol w:w="2933"/>
+        <w:gridCol w:w="1129"/>
       </w:tblGrid>
       <w:tr>
         <w:tblPrEx>
@@ -5854,25 +6826,25 @@
               <w:rPr>
                 <w:sz w:val="17"/>
               </w:rPr>
-              <w:t>Modo sombra y simulacros TEST</w:t>
-            </w:r>
-          </w:p>
-        </w:tc>
-        <w:tc>
-          <w:tcPr>
-            <w:tcW w:w="0" w:type="auto"/>
-          </w:tcPr>
-          <w:p>
-            <w:pPr>
-              <w:rPr>
-                <w:sz w:val="17"/>
-              </w:rPr>
-            </w:pPr>
-            <w:r>
-              <w:rPr>
-                <w:sz w:val="17"/>
-              </w:rPr>
-              <w:t>Abierto</w:t>
+              <w:t>Modo sombra; calibrar tras 2 candidatos en ruido</w:t>
+            </w:r>
+          </w:p>
+        </w:tc>
+        <w:tc>
+          <w:tcPr>
+            <w:tcW w:w="0" w:type="auto"/>
+          </w:tcPr>
+          <w:p>
+            <w:pPr>
+              <w:rPr>
+                <w:sz w:val="17"/>
+              </w:rPr>
+            </w:pPr>
+            <w:r>
+              <w:rPr>
+                <w:sz w:val="17"/>
+              </w:rPr>
+              <w:t>En tratamiento</w:t>
             </w:r>
           </w:p>
         </w:tc>
@@ -7578,12 +8550,12 @@
         <w:tblLook w:val="0000" w:firstRow="0" w:lastRow="0" w:firstColumn="0" w:lastColumn="0" w:noHBand="0" w:noVBand="0"/>
       </w:tblPr>
       <w:tblGrid>
-        <w:gridCol w:w="714"/>
-        <w:gridCol w:w="867"/>
-        <w:gridCol w:w="2552"/>
-        <w:gridCol w:w="3195"/>
-        <w:gridCol w:w="1749"/>
-        <w:gridCol w:w="890"/>
+        <w:gridCol w:w="686"/>
+        <w:gridCol w:w="828"/>
+        <w:gridCol w:w="2291"/>
+        <w:gridCol w:w="2917"/>
+        <w:gridCol w:w="1656"/>
+        <w:gridCol w:w="1589"/>
       </w:tblGrid>
       <w:tr>
         <w:tblPrEx>
@@ -8310,6 +9282,122 @@
                 <w:sz w:val="17"/>
               </w:rPr>
               <w:t>Propuesta</w:t>
+            </w:r>
+          </w:p>
+        </w:tc>
+      </w:tr>
+      <w:tr>
+        <w:tblPrEx>
+          <w:tblCellMar>
+            <w:top w:w="0" w:type="dxa"/>
+            <w:bottom w:w="0" w:type="dxa"/>
+          </w:tblCellMar>
+        </w:tblPrEx>
+        <w:tc>
+          <w:tcPr>
+            <w:tcW w:w="0" w:type="auto"/>
+          </w:tcPr>
+          <w:p>
+            <w:pPr>
+              <w:rPr>
+                <w:sz w:val="17"/>
+              </w:rPr>
+            </w:pPr>
+            <w:r>
+              <w:rPr>
+                <w:sz w:val="17"/>
+              </w:rPr>
+              <w:t>DEC-006</w:t>
+            </w:r>
+          </w:p>
+        </w:tc>
+        <w:tc>
+          <w:tcPr>
+            <w:tcW w:w="0" w:type="auto"/>
+          </w:tcPr>
+          <w:p>
+            <w:pPr>
+              <w:rPr>
+                <w:sz w:val="17"/>
+              </w:rPr>
+            </w:pPr>
+            <w:r>
+              <w:rPr>
+                <w:sz w:val="17"/>
+              </w:rPr>
+              <w:t>2026-08-24</w:t>
+            </w:r>
+          </w:p>
+        </w:tc>
+        <w:tc>
+          <w:tcPr>
+            <w:tcW w:w="0" w:type="auto"/>
+          </w:tcPr>
+          <w:p>
+            <w:pPr>
+              <w:rPr>
+                <w:sz w:val="17"/>
+              </w:rPr>
+            </w:pPr>
+            <w:r>
+              <w:rPr>
+                <w:sz w:val="17"/>
+              </w:rPr>
+              <w:t>Mantener No-Go público tras Sprint 1</w:t>
+            </w:r>
+          </w:p>
+        </w:tc>
+        <w:tc>
+          <w:tcPr>
+            <w:tcW w:w="0" w:type="auto"/>
+          </w:tcPr>
+          <w:p>
+            <w:pPr>
+              <w:rPr>
+                <w:sz w:val="17"/>
+              </w:rPr>
+            </w:pPr>
+            <w:r>
+              <w:rPr>
+                <w:sz w:val="17"/>
+              </w:rPr>
+              <w:t>Replay ambiente produjo falsos candidatos</w:t>
+            </w:r>
+          </w:p>
+        </w:tc>
+        <w:tc>
+          <w:tcPr>
+            <w:tcW w:w="0" w:type="auto"/>
+          </w:tcPr>
+          <w:p>
+            <w:pPr>
+              <w:rPr>
+                <w:sz w:val="17"/>
+              </w:rPr>
+            </w:pPr>
+            <w:r>
+              <w:rPr>
+                <w:sz w:val="17"/>
+              </w:rPr>
+              <w:t>Codex</w:t>
+            </w:r>
+          </w:p>
+        </w:tc>
+        <w:tc>
+          <w:tcPr>
+            <w:tcW w:w="0" w:type="auto"/>
+          </w:tcPr>
+          <w:p>
+            <w:pPr>
+              <w:rPr>
+                <w:sz w:val="17"/>
+              </w:rPr>
+            </w:pPr>
+            <w:r>
+              <w:rPr>
+                <w:sz w:val="17"/>
+              </w:rPr>
+              <w:t>Aceptada técnicamente</w:t>
             </w:r>
           </w:p>
         </w:tc>
@@ -8343,13 +9431,13 @@
         <w:tblLook w:val="0000" w:firstRow="0" w:lastRow="0" w:firstColumn="0" w:lastColumn="0" w:noHBand="0" w:noVBand="0"/>
       </w:tblPr>
       <w:tblGrid>
-        <w:gridCol w:w="587"/>
-        <w:gridCol w:w="967"/>
-        <w:gridCol w:w="2193"/>
-        <w:gridCol w:w="1910"/>
-        <w:gridCol w:w="1538"/>
-        <w:gridCol w:w="2097"/>
-        <w:gridCol w:w="675"/>
+        <w:gridCol w:w="565"/>
+        <w:gridCol w:w="964"/>
+        <w:gridCol w:w="2067"/>
+        <w:gridCol w:w="1814"/>
+        <w:gridCol w:w="1464"/>
+        <w:gridCol w:w="1994"/>
+        <w:gridCol w:w="1099"/>
       </w:tblGrid>
       <w:tr>
         <w:tblPrEx>
@@ -8580,25 +9668,25 @@
               <w:rPr>
                 <w:sz w:val="17"/>
               </w:rPr>
-              <w:t>Python no está disponible en el entorno activo</w:t>
-            </w:r>
-          </w:p>
-        </w:tc>
-        <w:tc>
-          <w:tcPr>
-            <w:tcW w:w="0" w:type="auto"/>
-          </w:tcPr>
-          <w:p>
-            <w:pPr>
-              <w:rPr>
-                <w:sz w:val="17"/>
-              </w:rPr>
-            </w:pPr>
-            <w:r>
-              <w:rPr>
-                <w:sz w:val="17"/>
-              </w:rPr>
-              <w:t>No se reejecutan pruebas backend</w:t>
+              <w:t>Python no estaba disponible en el entorno activo</w:t>
+            </w:r>
+          </w:p>
+        </w:tc>
+        <w:tc>
+          <w:tcPr>
+            <w:tcW w:w="0" w:type="auto"/>
+          </w:tcPr>
+          <w:p>
+            <w:pPr>
+              <w:rPr>
+                <w:sz w:val="17"/>
+              </w:rPr>
+            </w:pPr>
+            <w:r>
+              <w:rPr>
+                <w:sz w:val="17"/>
+              </w:rPr>
+              <w:t>No se reejecutaban pruebas backend</w:t>
             </w:r>
           </w:p>
         </w:tc>
@@ -8634,25 +9722,25 @@
               <w:rPr>
                 <w:sz w:val="17"/>
               </w:rPr>
-              <w:t>Instalar/fijar Python 3.12 en Sprint 1</w:t>
-            </w:r>
-          </w:p>
-        </w:tc>
-        <w:tc>
-          <w:tcPr>
-            <w:tcW w:w="0" w:type="auto"/>
-          </w:tcPr>
-          <w:p>
-            <w:pPr>
-              <w:rPr>
-                <w:sz w:val="17"/>
-              </w:rPr>
-            </w:pPr>
-            <w:r>
-              <w:rPr>
-                <w:sz w:val="17"/>
-              </w:rPr>
-              <w:t>Abierto</w:t>
+              <w:t>Python 3.12.10 instalado y validado</w:t>
+            </w:r>
+          </w:p>
+        </w:tc>
+        <w:tc>
+          <w:tcPr>
+            <w:tcW w:w="0" w:type="auto"/>
+          </w:tcPr>
+          <w:p>
+            <w:pPr>
+              <w:rPr>
+                <w:sz w:val="17"/>
+              </w:rPr>
+            </w:pPr>
+            <w:r>
+              <w:rPr>
+                <w:sz w:val="17"/>
+              </w:rPr>
+              <w:t>Resuelto 2026-08-24</w:t>
             </w:r>
           </w:p>
         </w:tc>
@@ -9673,63 +10761,9 @@
     <w:p>
       <w:pPr>
         <w:pStyle w:val="Listaconvietas"/>
-        <w:rPr>
-          <w:rFonts w:hint="eastAsia"/>
-        </w:rPr>
       </w:pPr>
       <w:r>
-        <w:rPr>
-          <w:rFonts w:hint="eastAsia"/>
-        </w:rPr>
-        <w:t xml:space="preserve">[ ] Pipeline replay </w:t>
-      </w:r>
-      <w:r>
-        <w:rPr>
-          <w:rFonts w:hint="eastAsia"/>
-        </w:rPr>
-        <w:t>→</w:t>
-      </w:r>
-      <w:r>
-        <w:rPr>
-          <w:rFonts w:hint="eastAsia"/>
-        </w:rPr>
-        <w:t xml:space="preserve"> candidato </w:t>
-      </w:r>
-      <w:r>
-        <w:rPr>
-          <w:rFonts w:hint="eastAsia"/>
-        </w:rPr>
-        <w:t>→</w:t>
-      </w:r>
-      <w:r>
-        <w:rPr>
-          <w:rFonts w:hint="eastAsia"/>
-        </w:rPr>
-        <w:t xml:space="preserve"> API </w:t>
-      </w:r>
-      <w:r>
-        <w:rPr>
-          <w:rFonts w:hint="eastAsia"/>
-        </w:rPr>
-        <w:t>→</w:t>
-      </w:r>
-      <w:r>
-        <w:rPr>
-          <w:rFonts w:hint="eastAsia"/>
-        </w:rPr>
-        <w:t xml:space="preserve"> bus </w:t>
-      </w:r>
-      <w:r>
-        <w:rPr>
-          <w:rFonts w:hint="eastAsia"/>
-        </w:rPr>
-        <w:t>→</w:t>
-      </w:r>
-      <w:r>
-        <w:rPr>
-          <w:rFonts w:hint="eastAsia"/>
-        </w:rPr>
-        <w:t xml:space="preserve"> push TEST demostrado.</w:t>
+        <w:t>[ ] Pipeline replay → candidato → API → bus → push TEST demostrado.</w:t>
       </w:r>
     </w:p>
     <w:p>
@@ -10607,7 +11641,7 @@
         <w:color w:val="808080"/>
         <w:sz w:val="16"/>
       </w:rPr>
-      <w:t>Seismik | Control de Avance | v0.1</w:t>
+      <w:t>Seismik | Control de Avance | v0.1.1</w:t>
     </w:r>
   </w:p>
 </w:hdr>
@@ -10628,7 +11662,7 @@
   <w:abstractNum w:abstractNumId="0" w15:restartNumberingAfterBreak="0">
     <w:nsid w:val="FFFFFF89"/>
     <w:multiLevelType w:val="singleLevel"/>
-    <w:tmpl w:val="8388759C"/>
+    <w:tmpl w:val="C1B49998"/>
     <w:lvl w:ilvl="0">
       <w:start w:val="1"/>
       <w:numFmt w:val="bullet"/>
@@ -10646,7 +11680,7 @@
       </w:rPr>
     </w:lvl>
   </w:abstractNum>
-  <w:num w:numId="1" w16cid:durableId="2144077168">
+  <w:num w:numId="1" w16cid:durableId="788939108">
     <w:abstractNumId w:val="0"/>
   </w:num>
 </w:numbering>
@@ -10657,11 +11691,11 @@
   <w:docDefaults>
     <w:rPrDefault>
       <w:rPr>
-        <w:rFonts w:asciiTheme="minorHAnsi" w:eastAsiaTheme="minorEastAsia" w:hAnsiTheme="minorHAnsi" w:cstheme="minorBidi"/>
+        <w:rFonts w:asciiTheme="minorHAnsi" w:eastAsiaTheme="minorHAnsi" w:hAnsiTheme="minorHAnsi" w:cstheme="minorBidi"/>
         <w:kern w:val="2"/>
         <w:sz w:val="24"/>
         <w:szCs w:val="24"/>
-        <w:lang w:val="es-CO" w:eastAsia="ko-KR" w:bidi="ar-SA"/>
+        <w:lang w:val="es-CO" w:eastAsia="en-US" w:bidi="ar-SA"/>
         <w14:ligatures w14:val="standardContextual"/>
       </w:rPr>
     </w:rPrDefault>
@@ -11067,7 +12101,7 @@
     <w:link w:val="Ttulo1Car"/>
     <w:uiPriority w:val="9"/>
     <w:qFormat/>
-    <w:rsid w:val="00FA3BD9"/>
+    <w:rsid w:val="009A36E8"/>
     <w:pPr>
       <w:keepNext/>
       <w:keepLines/>
@@ -11090,7 +12124,7 @@
     <w:semiHidden/>
     <w:unhideWhenUsed/>
     <w:qFormat/>
-    <w:rsid w:val="00FA3BD9"/>
+    <w:rsid w:val="009A36E8"/>
     <w:pPr>
       <w:keepNext/>
       <w:keepLines/>
@@ -11113,7 +12147,7 @@
     <w:semiHidden/>
     <w:unhideWhenUsed/>
     <w:qFormat/>
-    <w:rsid w:val="00FA3BD9"/>
+    <w:rsid w:val="009A36E8"/>
     <w:pPr>
       <w:keepNext/>
       <w:keepLines/>
@@ -11136,7 +12170,7 @@
     <w:semiHidden/>
     <w:unhideWhenUsed/>
     <w:qFormat/>
-    <w:rsid w:val="00FA3BD9"/>
+    <w:rsid w:val="009A36E8"/>
     <w:pPr>
       <w:keepNext/>
       <w:keepLines/>
@@ -11159,7 +12193,7 @@
     <w:semiHidden/>
     <w:unhideWhenUsed/>
     <w:qFormat/>
-    <w:rsid w:val="00FA3BD9"/>
+    <w:rsid w:val="009A36E8"/>
     <w:pPr>
       <w:keepNext/>
       <w:keepLines/>
@@ -11180,7 +12214,7 @@
     <w:semiHidden/>
     <w:unhideWhenUsed/>
     <w:qFormat/>
-    <w:rsid w:val="00FA3BD9"/>
+    <w:rsid w:val="009A36E8"/>
     <w:pPr>
       <w:keepNext/>
       <w:keepLines/>
@@ -11203,7 +12237,7 @@
     <w:semiHidden/>
     <w:unhideWhenUsed/>
     <w:qFormat/>
-    <w:rsid w:val="00FA3BD9"/>
+    <w:rsid w:val="009A36E8"/>
     <w:pPr>
       <w:keepNext/>
       <w:keepLines/>
@@ -11224,7 +12258,7 @@
     <w:semiHidden/>
     <w:unhideWhenUsed/>
     <w:qFormat/>
-    <w:rsid w:val="00FA3BD9"/>
+    <w:rsid w:val="009A36E8"/>
     <w:pPr>
       <w:keepNext/>
       <w:keepLines/>
@@ -11247,7 +12281,7 @@
     <w:semiHidden/>
     <w:unhideWhenUsed/>
     <w:qFormat/>
-    <w:rsid w:val="00FA3BD9"/>
+    <w:rsid w:val="009A36E8"/>
     <w:pPr>
       <w:keepNext/>
       <w:keepLines/>
@@ -11291,7 +12325,7 @@
     <w:basedOn w:val="Fuentedeprrafopredeter"/>
     <w:link w:val="Ttulo1"/>
     <w:uiPriority w:val="9"/>
-    <w:rsid w:val="00FA3BD9"/>
+    <w:rsid w:val="009A36E8"/>
     <w:rPr>
       <w:rFonts w:ascii="Aptos Display" w:eastAsiaTheme="majorEastAsia" w:hAnsi="Aptos Display" w:cstheme="majorBidi"/>
       <w:color w:val="13458B"/>
@@ -11305,7 +12339,7 @@
     <w:link w:val="Ttulo2"/>
     <w:uiPriority w:val="9"/>
     <w:semiHidden/>
-    <w:rsid w:val="00FA3BD9"/>
+    <w:rsid w:val="009A36E8"/>
     <w:rPr>
       <w:rFonts w:ascii="Aptos Display" w:eastAsiaTheme="majorEastAsia" w:hAnsi="Aptos Display" w:cstheme="majorBidi"/>
       <w:color w:val="13458B"/>
@@ -11319,7 +12353,7 @@
     <w:link w:val="Ttulo3"/>
     <w:uiPriority w:val="9"/>
     <w:semiHidden/>
-    <w:rsid w:val="00FA3BD9"/>
+    <w:rsid w:val="009A36E8"/>
     <w:rPr>
       <w:rFonts w:ascii="Aptos Display" w:eastAsiaTheme="majorEastAsia" w:hAnsi="Aptos Display" w:cstheme="majorBidi"/>
       <w:color w:val="13458B"/>
@@ -11333,7 +12367,7 @@
     <w:link w:val="Ttulo4"/>
     <w:uiPriority w:val="9"/>
     <w:semiHidden/>
-    <w:rsid w:val="00FA3BD9"/>
+    <w:rsid w:val="009A36E8"/>
     <w:rPr>
       <w:rFonts w:eastAsiaTheme="majorEastAsia" w:cstheme="majorBidi"/>
       <w:i/>
@@ -11347,7 +12381,7 @@
     <w:link w:val="Ttulo5"/>
     <w:uiPriority w:val="9"/>
     <w:semiHidden/>
-    <w:rsid w:val="00FA3BD9"/>
+    <w:rsid w:val="009A36E8"/>
     <w:rPr>
       <w:rFonts w:eastAsiaTheme="majorEastAsia" w:cstheme="majorBidi"/>
       <w:color w:val="0F4761" w:themeColor="accent1" w:themeShade="BF"/>
@@ -11359,7 +12393,7 @@
     <w:link w:val="Ttulo6"/>
     <w:uiPriority w:val="9"/>
     <w:semiHidden/>
-    <w:rsid w:val="00FA3BD9"/>
+    <w:rsid w:val="009A36E8"/>
     <w:rPr>
       <w:rFonts w:eastAsiaTheme="majorEastAsia" w:cstheme="majorBidi"/>
       <w:i/>
@@ -11373,7 +12407,7 @@
     <w:link w:val="Ttulo7"/>
     <w:uiPriority w:val="9"/>
     <w:semiHidden/>
-    <w:rsid w:val="00FA3BD9"/>
+    <w:rsid w:val="009A36E8"/>
     <w:rPr>
       <w:rFonts w:eastAsiaTheme="majorEastAsia" w:cstheme="majorBidi"/>
       <w:color w:val="595959" w:themeColor="text1" w:themeTint="A6"/>
@@ -11385,7 +12419,7 @@
     <w:link w:val="Ttulo8"/>
     <w:uiPriority w:val="9"/>
     <w:semiHidden/>
-    <w:rsid w:val="00FA3BD9"/>
+    <w:rsid w:val="009A36E8"/>
     <w:rPr>
       <w:rFonts w:eastAsiaTheme="majorEastAsia" w:cstheme="majorBidi"/>
       <w:i/>
@@ -11399,7 +12433,7 @@
     <w:link w:val="Ttulo9"/>
     <w:uiPriority w:val="9"/>
     <w:semiHidden/>
-    <w:rsid w:val="00FA3BD9"/>
+    <w:rsid w:val="009A36E8"/>
     <w:rPr>
       <w:rFonts w:eastAsiaTheme="majorEastAsia" w:cstheme="majorBidi"/>
       <w:color w:val="272727" w:themeColor="text1" w:themeTint="D8"/>
@@ -11412,7 +12446,7 @@
     <w:link w:val="TtuloCar"/>
     <w:uiPriority w:val="10"/>
     <w:qFormat/>
-    <w:rsid w:val="00FA3BD9"/>
+    <w:rsid w:val="009A36E8"/>
     <w:pPr>
       <w:spacing w:after="80"/>
       <w:contextualSpacing/>
@@ -11431,7 +12465,7 @@
     <w:basedOn w:val="Fuentedeprrafopredeter"/>
     <w:link w:val="Ttulo"/>
     <w:uiPriority w:val="10"/>
-    <w:rsid w:val="00FA3BD9"/>
+    <w:rsid w:val="009A36E8"/>
     <w:rPr>
       <w:rFonts w:ascii="Aptos Display" w:eastAsiaTheme="majorEastAsia" w:hAnsi="Aptos Display" w:cstheme="majorBidi"/>
       <w:color w:val="13458B"/>
@@ -11448,7 +12482,7 @@
     <w:link w:val="SubttuloCar"/>
     <w:uiPriority w:val="11"/>
     <w:qFormat/>
-    <w:rsid w:val="00FA3BD9"/>
+    <w:rsid w:val="009A36E8"/>
     <w:pPr>
       <w:numPr>
         <w:ilvl w:val="1"/>
@@ -11467,7 +12501,7 @@
     <w:basedOn w:val="Fuentedeprrafopredeter"/>
     <w:link w:val="Subttulo"/>
     <w:uiPriority w:val="11"/>
-    <w:rsid w:val="00FA3BD9"/>
+    <w:rsid w:val="009A36E8"/>
     <w:rPr>
       <w:rFonts w:eastAsiaTheme="majorEastAsia" w:cstheme="majorBidi"/>
       <w:color w:val="595959" w:themeColor="text1" w:themeTint="A6"/>
@@ -11483,7 +12517,7 @@
     <w:link w:val="CitaCar"/>
     <w:uiPriority w:val="29"/>
     <w:qFormat/>
-    <w:rsid w:val="00FA3BD9"/>
+    <w:rsid w:val="009A36E8"/>
     <w:pPr>
       <w:spacing w:before="160"/>
       <w:jc w:val="center"/>
@@ -11499,7 +12533,7 @@
     <w:basedOn w:val="Fuentedeprrafopredeter"/>
     <w:link w:val="Cita"/>
     <w:uiPriority w:val="29"/>
-    <w:rsid w:val="00FA3BD9"/>
+    <w:rsid w:val="009A36E8"/>
     <w:rPr>
       <w:i/>
       <w:iCs/>
@@ -11511,7 +12545,7 @@
     <w:basedOn w:val="Normal"/>
     <w:uiPriority w:val="34"/>
     <w:qFormat/>
-    <w:rsid w:val="00FA3BD9"/>
+    <w:rsid w:val="009A36E8"/>
     <w:pPr>
       <w:ind w:left="720"/>
       <w:contextualSpacing/>
@@ -11522,7 +12556,7 @@
     <w:basedOn w:val="Fuentedeprrafopredeter"/>
     <w:uiPriority w:val="21"/>
     <w:qFormat/>
-    <w:rsid w:val="00FA3BD9"/>
+    <w:rsid w:val="009A36E8"/>
     <w:rPr>
       <w:i/>
       <w:iCs/>
@@ -11536,7 +12570,7 @@
     <w:link w:val="CitadestacadaCar"/>
     <w:uiPriority w:val="30"/>
     <w:qFormat/>
-    <w:rsid w:val="00FA3BD9"/>
+    <w:rsid w:val="009A36E8"/>
     <w:pPr>
       <w:pBdr>
         <w:top w:val="single" w:sz="4" w:space="10" w:color="0F4761" w:themeColor="accent1" w:themeShade="BF"/>
@@ -11557,7 +12591,7 @@
     <w:basedOn w:val="Fuentedeprrafopredeter"/>
     <w:link w:val="Citadestacada"/>
     <w:uiPriority w:val="30"/>
-    <w:rsid w:val="00FA3BD9"/>
+    <w:rsid w:val="009A36E8"/>
     <w:rPr>
       <w:i/>
       <w:iCs/>
@@ -11569,7 +12603,7 @@
     <w:basedOn w:val="Fuentedeprrafopredeter"/>
     <w:uiPriority w:val="32"/>
     <w:qFormat/>
-    <w:rsid w:val="00FA3BD9"/>
+    <w:rsid w:val="009A36E8"/>
     <w:rPr>
       <w:b/>
       <w:bCs/>
@@ -11584,7 +12618,7 @@
     <w:link w:val="EncabezadoCar"/>
     <w:uiPriority w:val="99"/>
     <w:unhideWhenUsed/>
-    <w:rsid w:val="00FA3BD9"/>
+    <w:rsid w:val="009A36E8"/>
     <w:pPr>
       <w:tabs>
         <w:tab w:val="center" w:pos="4419"/>
@@ -11598,7 +12632,7 @@
     <w:basedOn w:val="Fuentedeprrafopredeter"/>
     <w:link w:val="Encabezado"/>
     <w:uiPriority w:val="99"/>
-    <w:rsid w:val="00FA3BD9"/>
+    <w:rsid w:val="009A36E8"/>
     <w:rPr>
       <w:rFonts w:ascii="Aptos" w:hAnsi="Aptos"/>
       <w:sz w:val="20"/>
@@ -11610,7 +12644,7 @@
     <w:link w:val="PiedepginaCar"/>
     <w:uiPriority w:val="99"/>
     <w:unhideWhenUsed/>
-    <w:rsid w:val="00FA3BD9"/>
+    <w:rsid w:val="009A36E8"/>
     <w:pPr>
       <w:tabs>
         <w:tab w:val="center" w:pos="4419"/>
@@ -11624,7 +12658,7 @@
     <w:basedOn w:val="Fuentedeprrafopredeter"/>
     <w:link w:val="Piedepgina"/>
     <w:uiPriority w:val="99"/>
-    <w:rsid w:val="00FA3BD9"/>
+    <w:rsid w:val="009A36E8"/>
     <w:rPr>
       <w:rFonts w:ascii="Aptos" w:hAnsi="Aptos"/>
       <w:sz w:val="20"/>
@@ -11635,7 +12669,7 @@
     <w:basedOn w:val="Normal"/>
     <w:uiPriority w:val="99"/>
     <w:unhideWhenUsed/>
-    <w:rsid w:val="00FA3BD9"/>
+    <w:rsid w:val="009A36E8"/>
     <w:pPr>
       <w:numPr>
         <w:numId w:val="1"/>

</xml_diff>

<commit_message>
feat: complete Sprint 2 shadow calibration
</commit_message>
<xml_diff>
--- a/docs/project-management/SEISMIK_CONTROL_AVANCE_v0.1.docx
+++ b/docs/project-management/SEISMIK_CONTROL_AVANCE_v0.1.docx
@@ -12,17 +12,17 @@
     </w:p>
     <w:p>
       <w:r>
-        <w:t xml:space="preserve">Versión: 0.1  </w:t>
+        <w:t xml:space="preserve">Versión: 0.1.2  </w:t>
       </w:r>
     </w:p>
     <w:p>
       <w:r>
-        <w:t xml:space="preserve">Fecha de corte: 24 de agosto de 2026  </w:t>
+        <w:t>Fecha de corte: 24 de agosto de 2026</w:t>
       </w:r>
     </w:p>
     <w:p>
       <w:r>
-        <w:t xml:space="preserve">Estado general: Alfa 0.1 — Sprint 1 cerrado técnicamente; modo sombra obligatorio  </w:t>
+        <w:t>Estado general: Alfa 0.1 — Sprint 2 cerrado técnicamente; revisión científica pendiente</w:t>
       </w:r>
     </w:p>
     <w:p>
@@ -64,7 +64,7 @@
         <w:gridCol w:w="722"/>
         <w:gridCol w:w="983"/>
         <w:gridCol w:w="609"/>
-        <w:gridCol w:w="3001"/>
+        <w:gridCol w:w="3594"/>
         <w:gridCol w:w="675"/>
       </w:tblGrid>
       <w:tr>
@@ -367,6 +367,104 @@
                 <w:sz w:val="17"/>
               </w:rPr>
               <w:t>Evidencia y cierre técnico del Sprint 1</w:t>
+            </w:r>
+          </w:p>
+        </w:tc>
+        <w:tc>
+          <w:tcPr>
+            <w:tcW w:w="0" w:type="auto"/>
+          </w:tcPr>
+          <w:p>
+            <w:pPr>
+              <w:rPr>
+                <w:sz w:val="17"/>
+              </w:rPr>
+            </w:pPr>
+            <w:r>
+              <w:rPr>
+                <w:sz w:val="17"/>
+              </w:rPr>
+              <w:t>Activo</w:t>
+            </w:r>
+          </w:p>
+        </w:tc>
+      </w:tr>
+      <w:tr>
+        <w:tblPrEx>
+          <w:tblCellMar>
+            <w:top w:w="0" w:type="dxa"/>
+            <w:bottom w:w="0" w:type="dxa"/>
+          </w:tblCellMar>
+        </w:tblPrEx>
+        <w:tc>
+          <w:tcPr>
+            <w:tcW w:w="0" w:type="auto"/>
+          </w:tcPr>
+          <w:p>
+            <w:pPr>
+              <w:rPr>
+                <w:sz w:val="17"/>
+              </w:rPr>
+            </w:pPr>
+            <w:r>
+              <w:rPr>
+                <w:sz w:val="17"/>
+              </w:rPr>
+              <w:t>0.1.2</w:t>
+            </w:r>
+          </w:p>
+        </w:tc>
+        <w:tc>
+          <w:tcPr>
+            <w:tcW w:w="0" w:type="auto"/>
+          </w:tcPr>
+          <w:p>
+            <w:pPr>
+              <w:rPr>
+                <w:sz w:val="17"/>
+              </w:rPr>
+            </w:pPr>
+            <w:r>
+              <w:rPr>
+                <w:sz w:val="17"/>
+              </w:rPr>
+              <w:t>2026-08-24</w:t>
+            </w:r>
+          </w:p>
+        </w:tc>
+        <w:tc>
+          <w:tcPr>
+            <w:tcW w:w="0" w:type="auto"/>
+          </w:tcPr>
+          <w:p>
+            <w:pPr>
+              <w:rPr>
+                <w:sz w:val="17"/>
+              </w:rPr>
+            </w:pPr>
+            <w:r>
+              <w:rPr>
+                <w:sz w:val="17"/>
+              </w:rPr>
+              <w:t>Codex</w:t>
+            </w:r>
+          </w:p>
+        </w:tc>
+        <w:tc>
+          <w:tcPr>
+            <w:tcW w:w="0" w:type="auto"/>
+          </w:tcPr>
+          <w:p>
+            <w:pPr>
+              <w:rPr>
+                <w:sz w:val="17"/>
+              </w:rPr>
+            </w:pPr>
+            <w:r>
+              <w:rPr>
+                <w:sz w:val="17"/>
+              </w:rPr>
+              <w:t>Calibración sombra y cierre técnico del Sprint 2</w:t>
             </w:r>
           </w:p>
         </w:tc>
@@ -1101,7 +1199,7 @@
               <w:rPr>
                 <w:sz w:val="17"/>
               </w:rPr>
-              <w:t>1 de 8 cerrados técnicamente</w:t>
+              <w:t>2 de 8 cerrados técnicamente</w:t>
             </w:r>
           </w:p>
         </w:tc>
@@ -1155,7 +1253,7 @@
               <w:rPr>
                 <w:sz w:val="17"/>
               </w:rPr>
-              <w:t>Informe Sprint 1</w:t>
+              <w:t>Informes Sprint 1 y 2</w:t>
             </w:r>
           </w:p>
         </w:tc>
@@ -1395,7 +1493,7 @@
               <w:rPr>
                 <w:sz w:val="17"/>
               </w:rPr>
-              <w:t>32 aprobadas; Ruff y mypy limpios</w:t>
+              <w:t>41 aprobadas; Ruff y mypy limpios</w:t>
             </w:r>
           </w:p>
         </w:tc>
@@ -1769,6 +1867,7 @@
               <w:rPr>
                 <w:sz w:val="17"/>
               </w:rPr>
+              <w:lastRenderedPageBreak/>
               <w:t>Costo cloud activo</w:t>
             </w:r>
           </w:p>
@@ -1867,7 +1966,6 @@
               <w:rPr>
                 <w:sz w:val="17"/>
               </w:rPr>
-              <w:lastRenderedPageBreak/>
               <w:t>Alertas públicas</w:t>
             </w:r>
           </w:p>
@@ -4110,7 +4208,887 @@
         <w:pStyle w:val="Ttulo1"/>
       </w:pPr>
       <w:r>
-        <w:lastRenderedPageBreak/>
+        <w:t>3.2 Tablero de Sprint 2</w:t>
+      </w:r>
+    </w:p>
+    <w:tbl>
+      <w:tblPr>
+        <w:tblW w:w="0" w:type="auto"/>
+        <w:tblInd w:w="-5" w:type="dxa"/>
+        <w:tblBorders>
+          <w:top w:val="single" w:sz="4" w:space="0" w:color="auto"/>
+          <w:left w:val="single" w:sz="4" w:space="0" w:color="auto"/>
+          <w:bottom w:val="single" w:sz="4" w:space="0" w:color="auto"/>
+          <w:right w:val="single" w:sz="4" w:space="0" w:color="auto"/>
+          <w:insideH w:val="single" w:sz="4" w:space="0" w:color="auto"/>
+          <w:insideV w:val="single" w:sz="4" w:space="0" w:color="auto"/>
+        </w:tblBorders>
+        <w:tblCellMar>
+          <w:left w:w="70" w:type="dxa"/>
+          <w:right w:w="70" w:type="dxa"/>
+        </w:tblCellMar>
+        <w:tblLook w:val="0000" w:firstRow="0" w:lastRow="0" w:firstColumn="0" w:lastColumn="0" w:noHBand="0" w:noVBand="0"/>
+      </w:tblPr>
+      <w:tblGrid>
+        <w:gridCol w:w="553"/>
+        <w:gridCol w:w="2408"/>
+        <w:gridCol w:w="1254"/>
+        <w:gridCol w:w="947"/>
+        <w:gridCol w:w="2069"/>
+        <w:gridCol w:w="2736"/>
+      </w:tblGrid>
+      <w:tr>
+        <w:tblPrEx>
+          <w:tblCellMar>
+            <w:top w:w="0" w:type="dxa"/>
+            <w:bottom w:w="0" w:type="dxa"/>
+          </w:tblCellMar>
+        </w:tblPrEx>
+        <w:trPr>
+          <w:tblHeader/>
+        </w:trPr>
+        <w:tc>
+          <w:tcPr>
+            <w:tcW w:w="0" w:type="auto"/>
+            <w:shd w:val="clear" w:color="auto" w:fill="13458B"/>
+          </w:tcPr>
+          <w:p>
+            <w:pPr>
+              <w:rPr>
+                <w:b/>
+                <w:color w:val="FFFFFF"/>
+                <w:sz w:val="17"/>
+              </w:rPr>
+            </w:pPr>
+            <w:r>
+              <w:rPr>
+                <w:b/>
+                <w:color w:val="FFFFFF"/>
+                <w:sz w:val="17"/>
+              </w:rPr>
+              <w:t>ID</w:t>
+            </w:r>
+          </w:p>
+        </w:tc>
+        <w:tc>
+          <w:tcPr>
+            <w:tcW w:w="0" w:type="auto"/>
+            <w:shd w:val="clear" w:color="auto" w:fill="13458B"/>
+          </w:tcPr>
+          <w:p>
+            <w:pPr>
+              <w:rPr>
+                <w:b/>
+                <w:color w:val="FFFFFF"/>
+                <w:sz w:val="17"/>
+              </w:rPr>
+            </w:pPr>
+            <w:r>
+              <w:rPr>
+                <w:b/>
+                <w:color w:val="FFFFFF"/>
+                <w:sz w:val="17"/>
+              </w:rPr>
+              <w:t>Actividad</w:t>
+            </w:r>
+          </w:p>
+        </w:tc>
+        <w:tc>
+          <w:tcPr>
+            <w:tcW w:w="0" w:type="auto"/>
+            <w:shd w:val="clear" w:color="auto" w:fill="13458B"/>
+          </w:tcPr>
+          <w:p>
+            <w:pPr>
+              <w:rPr>
+                <w:b/>
+                <w:color w:val="FFFFFF"/>
+                <w:sz w:val="17"/>
+              </w:rPr>
+            </w:pPr>
+            <w:r>
+              <w:rPr>
+                <w:b/>
+                <w:color w:val="FFFFFF"/>
+                <w:sz w:val="17"/>
+              </w:rPr>
+              <w:t>Responsable</w:t>
+            </w:r>
+          </w:p>
+        </w:tc>
+        <w:tc>
+          <w:tcPr>
+            <w:tcW w:w="0" w:type="auto"/>
+            <w:shd w:val="clear" w:color="auto" w:fill="13458B"/>
+          </w:tcPr>
+          <w:p>
+            <w:pPr>
+              <w:rPr>
+                <w:b/>
+                <w:color w:val="FFFFFF"/>
+                <w:sz w:val="17"/>
+              </w:rPr>
+            </w:pPr>
+            <w:r>
+              <w:rPr>
+                <w:b/>
+                <w:color w:val="FFFFFF"/>
+                <w:sz w:val="17"/>
+              </w:rPr>
+              <w:t>Estado</w:t>
+            </w:r>
+          </w:p>
+        </w:tc>
+        <w:tc>
+          <w:tcPr>
+            <w:tcW w:w="0" w:type="auto"/>
+            <w:shd w:val="clear" w:color="auto" w:fill="13458B"/>
+          </w:tcPr>
+          <w:p>
+            <w:pPr>
+              <w:rPr>
+                <w:b/>
+                <w:color w:val="FFFFFF"/>
+                <w:sz w:val="17"/>
+              </w:rPr>
+            </w:pPr>
+            <w:r>
+              <w:rPr>
+                <w:b/>
+                <w:color w:val="FFFFFF"/>
+                <w:sz w:val="17"/>
+              </w:rPr>
+              <w:t>Entregable</w:t>
+            </w:r>
+          </w:p>
+        </w:tc>
+        <w:tc>
+          <w:tcPr>
+            <w:tcW w:w="0" w:type="auto"/>
+            <w:shd w:val="clear" w:color="auto" w:fill="13458B"/>
+          </w:tcPr>
+          <w:p>
+            <w:pPr>
+              <w:rPr>
+                <w:b/>
+                <w:color w:val="FFFFFF"/>
+                <w:sz w:val="17"/>
+              </w:rPr>
+            </w:pPr>
+            <w:r>
+              <w:rPr>
+                <w:b/>
+                <w:color w:val="FFFFFF"/>
+                <w:sz w:val="17"/>
+              </w:rPr>
+              <w:t>Evidencia</w:t>
+            </w:r>
+          </w:p>
+        </w:tc>
+      </w:tr>
+      <w:tr>
+        <w:tblPrEx>
+          <w:tblCellMar>
+            <w:top w:w="0" w:type="dxa"/>
+            <w:bottom w:w="0" w:type="dxa"/>
+          </w:tblCellMar>
+        </w:tblPrEx>
+        <w:tc>
+          <w:tcPr>
+            <w:tcW w:w="0" w:type="auto"/>
+          </w:tcPr>
+          <w:p>
+            <w:pPr>
+              <w:rPr>
+                <w:sz w:val="17"/>
+              </w:rPr>
+            </w:pPr>
+            <w:r>
+              <w:rPr>
+                <w:sz w:val="17"/>
+              </w:rPr>
+              <w:t>S2-01</w:t>
+            </w:r>
+          </w:p>
+        </w:tc>
+        <w:tc>
+          <w:tcPr>
+            <w:tcW w:w="0" w:type="auto"/>
+          </w:tcPr>
+          <w:p>
+            <w:pPr>
+              <w:rPr>
+                <w:sz w:val="17"/>
+              </w:rPr>
+            </w:pPr>
+            <w:r>
+              <w:rPr>
+                <w:sz w:val="17"/>
+              </w:rPr>
+              <w:t>Parametrizar DSP/STA-LTA</w:t>
+            </w:r>
+          </w:p>
+        </w:tc>
+        <w:tc>
+          <w:tcPr>
+            <w:tcW w:w="0" w:type="auto"/>
+          </w:tcPr>
+          <w:p>
+            <w:pPr>
+              <w:rPr>
+                <w:sz w:val="17"/>
+              </w:rPr>
+            </w:pPr>
+            <w:r>
+              <w:rPr>
+                <w:sz w:val="17"/>
+              </w:rPr>
+              <w:t>Codex</w:t>
+            </w:r>
+          </w:p>
+        </w:tc>
+        <w:tc>
+          <w:tcPr>
+            <w:tcW w:w="0" w:type="auto"/>
+          </w:tcPr>
+          <w:p>
+            <w:pPr>
+              <w:rPr>
+                <w:sz w:val="17"/>
+              </w:rPr>
+            </w:pPr>
+            <w:r>
+              <w:rPr>
+                <w:sz w:val="17"/>
+              </w:rPr>
+              <w:t>CO</w:t>
+            </w:r>
+          </w:p>
+        </w:tc>
+        <w:tc>
+          <w:tcPr>
+            <w:tcW w:w="0" w:type="auto"/>
+          </w:tcPr>
+          <w:p>
+            <w:pPr>
+              <w:rPr>
+                <w:sz w:val="17"/>
+              </w:rPr>
+            </w:pPr>
+            <w:r>
+              <w:rPr>
+                <w:sz w:val="17"/>
+              </w:rPr>
+              <w:t>Perfil CM.HHZ</w:t>
+            </w:r>
+          </w:p>
+        </w:tc>
+        <w:tc>
+          <w:tcPr>
+            <w:tcW w:w="0" w:type="auto"/>
+          </w:tcPr>
+          <w:p>
+            <w:pPr>
+              <w:rPr>
+                <w:sz w:val="17"/>
+              </w:rPr>
+            </w:pPr>
+            <w:r>
+              <w:rPr>
+                <w:sz w:val="17"/>
+              </w:rPr>
+              <w:t>config.json, src/eew/config.py</w:t>
+            </w:r>
+          </w:p>
+        </w:tc>
+      </w:tr>
+      <w:tr>
+        <w:tblPrEx>
+          <w:tblCellMar>
+            <w:top w:w="0" w:type="dxa"/>
+            <w:bottom w:w="0" w:type="dxa"/>
+          </w:tblCellMar>
+        </w:tblPrEx>
+        <w:tc>
+          <w:tcPr>
+            <w:tcW w:w="0" w:type="auto"/>
+          </w:tcPr>
+          <w:p>
+            <w:pPr>
+              <w:rPr>
+                <w:sz w:val="17"/>
+              </w:rPr>
+            </w:pPr>
+            <w:r>
+              <w:rPr>
+                <w:sz w:val="17"/>
+              </w:rPr>
+              <w:t>S2-02</w:t>
+            </w:r>
+          </w:p>
+        </w:tc>
+        <w:tc>
+          <w:tcPr>
+            <w:tcW w:w="0" w:type="auto"/>
+          </w:tcPr>
+          <w:p>
+            <w:pPr>
+              <w:rPr>
+                <w:sz w:val="17"/>
+              </w:rPr>
+            </w:pPr>
+            <w:r>
+              <w:rPr>
+                <w:sz w:val="17"/>
+              </w:rPr>
+              <w:t>Validar coincidencia y geometría</w:t>
+            </w:r>
+          </w:p>
+        </w:tc>
+        <w:tc>
+          <w:tcPr>
+            <w:tcW w:w="0" w:type="auto"/>
+          </w:tcPr>
+          <w:p>
+            <w:pPr>
+              <w:rPr>
+                <w:sz w:val="17"/>
+              </w:rPr>
+            </w:pPr>
+            <w:r>
+              <w:rPr>
+                <w:sz w:val="17"/>
+              </w:rPr>
+              <w:t>Codex</w:t>
+            </w:r>
+          </w:p>
+        </w:tc>
+        <w:tc>
+          <w:tcPr>
+            <w:tcW w:w="0" w:type="auto"/>
+          </w:tcPr>
+          <w:p>
+            <w:pPr>
+              <w:rPr>
+                <w:sz w:val="17"/>
+              </w:rPr>
+            </w:pPr>
+            <w:r>
+              <w:rPr>
+                <w:sz w:val="17"/>
+              </w:rPr>
+              <w:t>CO</w:t>
+            </w:r>
+          </w:p>
+        </w:tc>
+        <w:tc>
+          <w:tcPr>
+            <w:tcW w:w="0" w:type="auto"/>
+          </w:tcPr>
+          <w:p>
+            <w:pPr>
+              <w:rPr>
+                <w:sz w:val="17"/>
+              </w:rPr>
+            </w:pPr>
+            <w:r>
+              <w:rPr>
+                <w:sz w:val="17"/>
+              </w:rPr>
+              <w:t>Quorum, apertura y lag</w:t>
+            </w:r>
+          </w:p>
+        </w:tc>
+        <w:tc>
+          <w:tcPr>
+            <w:tcW w:w="0" w:type="auto"/>
+          </w:tcPr>
+          <w:p>
+            <w:pPr>
+              <w:rPr>
+                <w:sz w:val="17"/>
+              </w:rPr>
+            </w:pPr>
+            <w:r>
+              <w:rPr>
+                <w:sz w:val="17"/>
+              </w:rPr>
+              <w:t>src/eew/coincidence.py, tests</w:t>
+            </w:r>
+          </w:p>
+        </w:tc>
+      </w:tr>
+      <w:tr>
+        <w:tblPrEx>
+          <w:tblCellMar>
+            <w:top w:w="0" w:type="dxa"/>
+            <w:bottom w:w="0" w:type="dxa"/>
+          </w:tblCellMar>
+        </w:tblPrEx>
+        <w:tc>
+          <w:tcPr>
+            <w:tcW w:w="0" w:type="auto"/>
+          </w:tcPr>
+          <w:p>
+            <w:pPr>
+              <w:rPr>
+                <w:sz w:val="17"/>
+              </w:rPr>
+            </w:pPr>
+            <w:r>
+              <w:rPr>
+                <w:sz w:val="17"/>
+              </w:rPr>
+              <w:t>S2-03</w:t>
+            </w:r>
+          </w:p>
+        </w:tc>
+        <w:tc>
+          <w:tcPr>
+            <w:tcW w:w="0" w:type="auto"/>
+          </w:tcPr>
+          <w:p>
+            <w:pPr>
+              <w:rPr>
+                <w:sz w:val="17"/>
+              </w:rPr>
+            </w:pPr>
+            <w:r>
+              <w:rPr>
+                <w:sz w:val="17"/>
+              </w:rPr>
+              <w:t>Medir replay</w:t>
+            </w:r>
+          </w:p>
+        </w:tc>
+        <w:tc>
+          <w:tcPr>
+            <w:tcW w:w="0" w:type="auto"/>
+          </w:tcPr>
+          <w:p>
+            <w:pPr>
+              <w:rPr>
+                <w:sz w:val="17"/>
+              </w:rPr>
+            </w:pPr>
+            <w:r>
+              <w:rPr>
+                <w:sz w:val="17"/>
+              </w:rPr>
+              <w:t>Codex</w:t>
+            </w:r>
+          </w:p>
+        </w:tc>
+        <w:tc>
+          <w:tcPr>
+            <w:tcW w:w="0" w:type="auto"/>
+          </w:tcPr>
+          <w:p>
+            <w:pPr>
+              <w:rPr>
+                <w:sz w:val="17"/>
+              </w:rPr>
+            </w:pPr>
+            <w:r>
+              <w:rPr>
+                <w:sz w:val="17"/>
+              </w:rPr>
+              <w:t>CO técnico</w:t>
+            </w:r>
+          </w:p>
+        </w:tc>
+        <w:tc>
+          <w:tcPr>
+            <w:tcW w:w="0" w:type="auto"/>
+          </w:tcPr>
+          <w:p>
+            <w:pPr>
+              <w:rPr>
+                <w:sz w:val="17"/>
+              </w:rPr>
+            </w:pPr>
+            <w:r>
+              <w:rPr>
+                <w:sz w:val="17"/>
+              </w:rPr>
+              <w:t>Matrices de 36 + 18 perfiles</w:t>
+            </w:r>
+          </w:p>
+        </w:tc>
+        <w:tc>
+          <w:tcPr>
+            <w:tcW w:w="0" w:type="auto"/>
+          </w:tcPr>
+          <w:p>
+            <w:pPr>
+              <w:rPr>
+                <w:sz w:val="17"/>
+              </w:rPr>
+            </w:pPr>
+            <w:r>
+              <w:rPr>
+                <w:sz w:val="17"/>
+              </w:rPr>
+              <w:t>data/calibration/</w:t>
+            </w:r>
+          </w:p>
+        </w:tc>
+      </w:tr>
+      <w:tr>
+        <w:tblPrEx>
+          <w:tblCellMar>
+            <w:top w:w="0" w:type="dxa"/>
+            <w:bottom w:w="0" w:type="dxa"/>
+          </w:tblCellMar>
+        </w:tblPrEx>
+        <w:tc>
+          <w:tcPr>
+            <w:tcW w:w="0" w:type="auto"/>
+          </w:tcPr>
+          <w:p>
+            <w:pPr>
+              <w:rPr>
+                <w:sz w:val="17"/>
+              </w:rPr>
+            </w:pPr>
+            <w:r>
+              <w:rPr>
+                <w:sz w:val="17"/>
+              </w:rPr>
+              <w:t>S2-04</w:t>
+            </w:r>
+          </w:p>
+        </w:tc>
+        <w:tc>
+          <w:tcPr>
+            <w:tcW w:w="0" w:type="auto"/>
+          </w:tcPr>
+          <w:p>
+            <w:pPr>
+              <w:rPr>
+                <w:sz w:val="17"/>
+              </w:rPr>
+            </w:pPr>
+            <w:r>
+              <w:rPr>
+                <w:sz w:val="17"/>
+              </w:rPr>
+              <w:t>Correlación SGC</w:t>
+            </w:r>
+          </w:p>
+        </w:tc>
+        <w:tc>
+          <w:tcPr>
+            <w:tcW w:w="0" w:type="auto"/>
+          </w:tcPr>
+          <w:p>
+            <w:pPr>
+              <w:rPr>
+                <w:sz w:val="17"/>
+              </w:rPr>
+            </w:pPr>
+            <w:r>
+              <w:rPr>
+                <w:sz w:val="17"/>
+              </w:rPr>
+              <w:t>Codex + asesor</w:t>
+            </w:r>
+          </w:p>
+        </w:tc>
+        <w:tc>
+          <w:tcPr>
+            <w:tcW w:w="0" w:type="auto"/>
+          </w:tcPr>
+          <w:p>
+            <w:pPr>
+              <w:rPr>
+                <w:sz w:val="17"/>
+              </w:rPr>
+            </w:pPr>
+            <w:r>
+              <w:rPr>
+                <w:sz w:val="17"/>
+              </w:rPr>
+              <w:t>ER</w:t>
+            </w:r>
+          </w:p>
+        </w:tc>
+        <w:tc>
+          <w:tcPr>
+            <w:tcW w:w="0" w:type="auto"/>
+          </w:tcPr>
+          <w:p>
+            <w:pPr>
+              <w:rPr>
+                <w:sz w:val="17"/>
+              </w:rPr>
+            </w:pPr>
+            <w:r>
+              <w:rPr>
+                <w:sz w:val="17"/>
+              </w:rPr>
+              <w:t>Matcher y contrato SGC</w:t>
+            </w:r>
+          </w:p>
+        </w:tc>
+        <w:tc>
+          <w:tcPr>
+            <w:tcW w:w="0" w:type="auto"/>
+          </w:tcPr>
+          <w:p>
+            <w:pPr>
+              <w:rPr>
+                <w:sz w:val="17"/>
+              </w:rPr>
+            </w:pPr>
+            <w:r>
+              <w:rPr>
+                <w:sz w:val="17"/>
+              </w:rPr>
+              <w:t>test_official.py, sgc-association.json</w:t>
+            </w:r>
+          </w:p>
+        </w:tc>
+      </w:tr>
+      <w:tr>
+        <w:tblPrEx>
+          <w:tblCellMar>
+            <w:top w:w="0" w:type="dxa"/>
+            <w:bottom w:w="0" w:type="dxa"/>
+          </w:tblCellMar>
+        </w:tblPrEx>
+        <w:tc>
+          <w:tcPr>
+            <w:tcW w:w="0" w:type="auto"/>
+          </w:tcPr>
+          <w:p>
+            <w:pPr>
+              <w:rPr>
+                <w:sz w:val="17"/>
+              </w:rPr>
+            </w:pPr>
+            <w:r>
+              <w:rPr>
+                <w:sz w:val="17"/>
+              </w:rPr>
+              <w:t>S2-05</w:t>
+            </w:r>
+          </w:p>
+        </w:tc>
+        <w:tc>
+          <w:tcPr>
+            <w:tcW w:w="0" w:type="auto"/>
+          </w:tcPr>
+          <w:p>
+            <w:pPr>
+              <w:rPr>
+                <w:sz w:val="17"/>
+              </w:rPr>
+            </w:pPr>
+            <w:r>
+              <w:rPr>
+                <w:sz w:val="17"/>
+              </w:rPr>
+              <w:t>Salud y lag por estación</w:t>
+            </w:r>
+          </w:p>
+        </w:tc>
+        <w:tc>
+          <w:tcPr>
+            <w:tcW w:w="0" w:type="auto"/>
+          </w:tcPr>
+          <w:p>
+            <w:pPr>
+              <w:rPr>
+                <w:sz w:val="17"/>
+              </w:rPr>
+            </w:pPr>
+            <w:r>
+              <w:rPr>
+                <w:sz w:val="17"/>
+              </w:rPr>
+              <w:t>Codex</w:t>
+            </w:r>
+          </w:p>
+        </w:tc>
+        <w:tc>
+          <w:tcPr>
+            <w:tcW w:w="0" w:type="auto"/>
+          </w:tcPr>
+          <w:p>
+            <w:pPr>
+              <w:rPr>
+                <w:sz w:val="17"/>
+              </w:rPr>
+            </w:pPr>
+            <w:r>
+              <w:rPr>
+                <w:sz w:val="17"/>
+              </w:rPr>
+              <w:t>CO</w:t>
+            </w:r>
+          </w:p>
+        </w:tc>
+        <w:tc>
+          <w:tcPr>
+            <w:tcW w:w="0" w:type="auto"/>
+          </w:tcPr>
+          <w:p>
+            <w:pPr>
+              <w:rPr>
+                <w:sz w:val="17"/>
+              </w:rPr>
+            </w:pPr>
+            <w:r>
+              <w:rPr>
+                <w:sz w:val="17"/>
+              </w:rPr>
+              <w:t>Snapshot observable</w:t>
+            </w:r>
+          </w:p>
+        </w:tc>
+        <w:tc>
+          <w:tcPr>
+            <w:tcW w:w="0" w:type="auto"/>
+          </w:tcPr>
+          <w:p>
+            <w:pPr>
+              <w:rPr>
+                <w:sz w:val="17"/>
+              </w:rPr>
+            </w:pPr>
+            <w:r>
+              <w:rPr>
+                <w:sz w:val="17"/>
+              </w:rPr>
+              <w:t>src/eew/seedlink.py, tests</w:t>
+            </w:r>
+          </w:p>
+        </w:tc>
+      </w:tr>
+      <w:tr>
+        <w:tblPrEx>
+          <w:tblCellMar>
+            <w:top w:w="0" w:type="dxa"/>
+            <w:bottom w:w="0" w:type="dxa"/>
+          </w:tblCellMar>
+        </w:tblPrEx>
+        <w:tc>
+          <w:tcPr>
+            <w:tcW w:w="0" w:type="auto"/>
+          </w:tcPr>
+          <w:p>
+            <w:pPr>
+              <w:rPr>
+                <w:sz w:val="17"/>
+              </w:rPr>
+            </w:pPr>
+            <w:r>
+              <w:rPr>
+                <w:sz w:val="17"/>
+              </w:rPr>
+              <w:t>S2-06</w:t>
+            </w:r>
+          </w:p>
+        </w:tc>
+        <w:tc>
+          <w:tcPr>
+            <w:tcW w:w="0" w:type="auto"/>
+          </w:tcPr>
+          <w:p>
+            <w:pPr>
+              <w:rPr>
+                <w:sz w:val="17"/>
+              </w:rPr>
+            </w:pPr>
+            <w:r>
+              <w:rPr>
+                <w:sz w:val="17"/>
+              </w:rPr>
+              <w:t>Revisión sismológica</w:t>
+            </w:r>
+          </w:p>
+        </w:tc>
+        <w:tc>
+          <w:tcPr>
+            <w:tcW w:w="0" w:type="auto"/>
+          </w:tcPr>
+          <w:p>
+            <w:pPr>
+              <w:rPr>
+                <w:sz w:val="17"/>
+              </w:rPr>
+            </w:pPr>
+            <w:r>
+              <w:rPr>
+                <w:sz w:val="17"/>
+              </w:rPr>
+              <w:t>PO + asesor</w:t>
+            </w:r>
+          </w:p>
+        </w:tc>
+        <w:tc>
+          <w:tcPr>
+            <w:tcW w:w="0" w:type="auto"/>
+          </w:tcPr>
+          <w:p>
+            <w:pPr>
+              <w:rPr>
+                <w:sz w:val="17"/>
+              </w:rPr>
+            </w:pPr>
+            <w:r>
+              <w:rPr>
+                <w:sz w:val="17"/>
+              </w:rPr>
+              <w:t>BL</w:t>
+            </w:r>
+          </w:p>
+        </w:tc>
+        <w:tc>
+          <w:tcPr>
+            <w:tcW w:w="0" w:type="auto"/>
+          </w:tcPr>
+          <w:p>
+            <w:pPr>
+              <w:rPr>
+                <w:sz w:val="17"/>
+              </w:rPr>
+            </w:pPr>
+            <w:r>
+              <w:rPr>
+                <w:sz w:val="17"/>
+              </w:rPr>
+              <w:t>Acta independiente</w:t>
+            </w:r>
+          </w:p>
+        </w:tc>
+        <w:tc>
+          <w:tcPr>
+            <w:tcW w:w="0" w:type="auto"/>
+          </w:tcPr>
+          <w:p>
+            <w:pPr>
+              <w:rPr>
+                <w:sz w:val="17"/>
+              </w:rPr>
+            </w:pPr>
+            <w:r>
+              <w:rPr>
+                <w:sz w:val="17"/>
+              </w:rPr>
+              <w:t>Paquete listo; falta revisor</w:t>
+            </w:r>
+          </w:p>
+        </w:tc>
+      </w:tr>
+    </w:tbl>
+    <w:p/>
+    <w:p>
+      <w:pPr>
+        <w:pStyle w:val="Ttulo1"/>
+      </w:pPr>
+      <w:r>
         <w:t>4. Registro maestro de entregables</w:t>
       </w:r>
     </w:p>
@@ -4133,12 +5111,12 @@
         <w:tblLook w:val="0000" w:firstRow="0" w:lastRow="0" w:firstColumn="0" w:lastColumn="0" w:noHBand="0" w:noVBand="0"/>
       </w:tblPr>
       <w:tblGrid>
-        <w:gridCol w:w="708"/>
-        <w:gridCol w:w="1458"/>
+        <w:gridCol w:w="703"/>
+        <w:gridCol w:w="1385"/>
         <w:gridCol w:w="609"/>
-        <w:gridCol w:w="1184"/>
+        <w:gridCol w:w="1177"/>
         <w:gridCol w:w="675"/>
-        <w:gridCol w:w="1572"/>
+        <w:gridCol w:w="1657"/>
         <w:gridCol w:w="3761"/>
       </w:tblGrid>
       <w:tr>
@@ -4808,43 +5786,43 @@
               <w:rPr>
                 <w:sz w:val="17"/>
               </w:rPr>
-              <w:t>NI</w:t>
-            </w:r>
-          </w:p>
-        </w:tc>
-        <w:tc>
-          <w:tcPr>
-            <w:tcW w:w="0" w:type="auto"/>
-          </w:tcPr>
-          <w:p>
-            <w:pPr>
-              <w:rPr>
-                <w:sz w:val="17"/>
-              </w:rPr>
-            </w:pPr>
-            <w:r>
-              <w:rPr>
-                <w:sz w:val="17"/>
-              </w:rPr>
-              <w:t>Métricas y revisión científica</w:t>
-            </w:r>
-          </w:p>
-        </w:tc>
-        <w:tc>
-          <w:tcPr>
-            <w:tcW w:w="0" w:type="auto"/>
-          </w:tcPr>
-          <w:p>
-            <w:pPr>
-              <w:rPr>
-                <w:sz w:val="17"/>
-              </w:rPr>
-            </w:pPr>
-            <w:r>
-              <w:rPr>
-                <w:sz w:val="17"/>
-              </w:rPr>
-              <w:t>Informe de calibración</w:t>
+              <w:t>ER</w:t>
+            </w:r>
+          </w:p>
+        </w:tc>
+        <w:tc>
+          <w:tcPr>
+            <w:tcW w:w="0" w:type="auto"/>
+          </w:tcPr>
+          <w:p>
+            <w:pPr>
+              <w:rPr>
+                <w:sz w:val="17"/>
+              </w:rPr>
+            </w:pPr>
+            <w:r>
+              <w:rPr>
+                <w:sz w:val="17"/>
+              </w:rPr>
+              <w:t>Métricas listas; revisión científica pendiente</w:t>
+            </w:r>
+          </w:p>
+        </w:tc>
+        <w:tc>
+          <w:tcPr>
+            <w:tcW w:w="0" w:type="auto"/>
+          </w:tcPr>
+          <w:p>
+            <w:pPr>
+              <w:rPr>
+                <w:sz w:val="17"/>
+              </w:rPr>
+            </w:pPr>
+            <w:r>
+              <w:rPr>
+                <w:sz w:val="17"/>
+              </w:rPr>
+              <w:t>SPRINT_2_CIERRE_TECNICO_2026-08-24.md</w:t>
             </w:r>
           </w:p>
         </w:tc>
@@ -5799,6 +6777,7 @@
               <w:rPr>
                 <w:sz w:val="17"/>
               </w:rPr>
+              <w:lastRenderedPageBreak/>
               <w:t>CP-01</w:t>
             </w:r>
           </w:p>
@@ -8550,12 +9529,12 @@
         <w:tblLook w:val="0000" w:firstRow="0" w:lastRow="0" w:firstColumn="0" w:lastColumn="0" w:noHBand="0" w:noVBand="0"/>
       </w:tblPr>
       <w:tblGrid>
-        <w:gridCol w:w="686"/>
-        <w:gridCol w:w="828"/>
-        <w:gridCol w:w="2291"/>
-        <w:gridCol w:w="2917"/>
-        <w:gridCol w:w="1656"/>
-        <w:gridCol w:w="1589"/>
+        <w:gridCol w:w="676"/>
+        <w:gridCol w:w="815"/>
+        <w:gridCol w:w="2211"/>
+        <w:gridCol w:w="3072"/>
+        <w:gridCol w:w="1628"/>
+        <w:gridCol w:w="1565"/>
       </w:tblGrid>
       <w:tr>
         <w:tblPrEx>
@@ -8959,6 +9938,7 @@
               <w:rPr>
                 <w:sz w:val="17"/>
               </w:rPr>
+              <w:lastRenderedPageBreak/>
               <w:t>DEC-003</w:t>
             </w:r>
           </w:p>
@@ -9362,6 +10342,238 @@
                 <w:sz w:val="17"/>
               </w:rPr>
               <w:t>Replay ambiente produjo falsos candidatos</w:t>
+            </w:r>
+          </w:p>
+        </w:tc>
+        <w:tc>
+          <w:tcPr>
+            <w:tcW w:w="0" w:type="auto"/>
+          </w:tcPr>
+          <w:p>
+            <w:pPr>
+              <w:rPr>
+                <w:sz w:val="17"/>
+              </w:rPr>
+            </w:pPr>
+            <w:r>
+              <w:rPr>
+                <w:sz w:val="17"/>
+              </w:rPr>
+              <w:t>Codex</w:t>
+            </w:r>
+          </w:p>
+        </w:tc>
+        <w:tc>
+          <w:tcPr>
+            <w:tcW w:w="0" w:type="auto"/>
+          </w:tcPr>
+          <w:p>
+            <w:pPr>
+              <w:rPr>
+                <w:sz w:val="17"/>
+              </w:rPr>
+            </w:pPr>
+            <w:r>
+              <w:rPr>
+                <w:sz w:val="17"/>
+              </w:rPr>
+              <w:t>Aceptada técnicamente</w:t>
+            </w:r>
+          </w:p>
+        </w:tc>
+      </w:tr>
+      <w:tr>
+        <w:tblPrEx>
+          <w:tblCellMar>
+            <w:top w:w="0" w:type="dxa"/>
+            <w:bottom w:w="0" w:type="dxa"/>
+          </w:tblCellMar>
+        </w:tblPrEx>
+        <w:tc>
+          <w:tcPr>
+            <w:tcW w:w="0" w:type="auto"/>
+          </w:tcPr>
+          <w:p>
+            <w:pPr>
+              <w:rPr>
+                <w:sz w:val="17"/>
+              </w:rPr>
+            </w:pPr>
+            <w:r>
+              <w:rPr>
+                <w:sz w:val="17"/>
+              </w:rPr>
+              <w:t>DEC-007</w:t>
+            </w:r>
+          </w:p>
+        </w:tc>
+        <w:tc>
+          <w:tcPr>
+            <w:tcW w:w="0" w:type="auto"/>
+          </w:tcPr>
+          <w:p>
+            <w:pPr>
+              <w:rPr>
+                <w:sz w:val="17"/>
+              </w:rPr>
+            </w:pPr>
+            <w:r>
+              <w:rPr>
+                <w:sz w:val="17"/>
+              </w:rPr>
+              <w:t>2026-08-24</w:t>
+            </w:r>
+          </w:p>
+        </w:tc>
+        <w:tc>
+          <w:tcPr>
+            <w:tcW w:w="0" w:type="auto"/>
+          </w:tcPr>
+          <w:p>
+            <w:pPr>
+              <w:rPr>
+                <w:sz w:val="17"/>
+              </w:rPr>
+            </w:pPr>
+            <w:r>
+              <w:rPr>
+                <w:sz w:val="17"/>
+              </w:rPr>
+              <w:t>Adoptar quorum 3 y descartar quorum 2</w:t>
+            </w:r>
+          </w:p>
+        </w:tc>
+        <w:tc>
+          <w:tcPr>
+            <w:tcW w:w="0" w:type="auto"/>
+          </w:tcPr>
+          <w:p>
+            <w:pPr>
+              <w:rPr>
+                <w:sz w:val="17"/>
+              </w:rPr>
+            </w:pPr>
+            <w:r>
+              <w:rPr>
+                <w:sz w:val="17"/>
+              </w:rPr>
+              <w:t>El quorum 2 duplicó eventos y falló ventanas de evaluación</w:t>
+            </w:r>
+          </w:p>
+        </w:tc>
+        <w:tc>
+          <w:tcPr>
+            <w:tcW w:w="0" w:type="auto"/>
+          </w:tcPr>
+          <w:p>
+            <w:pPr>
+              <w:rPr>
+                <w:sz w:val="17"/>
+              </w:rPr>
+            </w:pPr>
+            <w:r>
+              <w:rPr>
+                <w:sz w:val="17"/>
+              </w:rPr>
+              <w:t>Codex</w:t>
+            </w:r>
+          </w:p>
+        </w:tc>
+        <w:tc>
+          <w:tcPr>
+            <w:tcW w:w="0" w:type="auto"/>
+          </w:tcPr>
+          <w:p>
+            <w:pPr>
+              <w:rPr>
+                <w:sz w:val="17"/>
+              </w:rPr>
+            </w:pPr>
+            <w:r>
+              <w:rPr>
+                <w:sz w:val="17"/>
+              </w:rPr>
+              <w:t>Aceptada técnicamente</w:t>
+            </w:r>
+          </w:p>
+        </w:tc>
+      </w:tr>
+      <w:tr>
+        <w:tblPrEx>
+          <w:tblCellMar>
+            <w:top w:w="0" w:type="dxa"/>
+            <w:bottom w:w="0" w:type="dxa"/>
+          </w:tblCellMar>
+        </w:tblPrEx>
+        <w:tc>
+          <w:tcPr>
+            <w:tcW w:w="0" w:type="auto"/>
+          </w:tcPr>
+          <w:p>
+            <w:pPr>
+              <w:rPr>
+                <w:sz w:val="17"/>
+              </w:rPr>
+            </w:pPr>
+            <w:r>
+              <w:rPr>
+                <w:sz w:val="17"/>
+              </w:rPr>
+              <w:t>DEC-008</w:t>
+            </w:r>
+          </w:p>
+        </w:tc>
+        <w:tc>
+          <w:tcPr>
+            <w:tcW w:w="0" w:type="auto"/>
+          </w:tcPr>
+          <w:p>
+            <w:pPr>
+              <w:rPr>
+                <w:sz w:val="17"/>
+              </w:rPr>
+            </w:pPr>
+            <w:r>
+              <w:rPr>
+                <w:sz w:val="17"/>
+              </w:rPr>
+              <w:t>2026-08-24</w:t>
+            </w:r>
+          </w:p>
+        </w:tc>
+        <w:tc>
+          <w:tcPr>
+            <w:tcW w:w="0" w:type="auto"/>
+          </w:tcPr>
+          <w:p>
+            <w:pPr>
+              <w:rPr>
+                <w:sz w:val="17"/>
+              </w:rPr>
+            </w:pPr>
+            <w:r>
+              <w:rPr>
+                <w:sz w:val="17"/>
+              </w:rPr>
+              <w:t>Mantener No-Go tras Sprint 2</w:t>
+            </w:r>
+          </w:p>
+        </w:tc>
+        <w:tc>
+          <w:tcPr>
+            <w:tcW w:w="0" w:type="auto"/>
+          </w:tcPr>
+          <w:p>
+            <w:pPr>
+              <w:rPr>
+                <w:sz w:val="17"/>
+              </w:rPr>
+            </w:pPr>
+            <w:r>
+              <w:rPr>
+                <w:sz w:val="17"/>
+              </w:rPr>
+              <w:t>Latencia media 56.552 s y corpus insuficiente</w:t>
             </w:r>
           </w:p>
         </w:tc>
@@ -9431,13 +10643,13 @@
         <w:tblLook w:val="0000" w:firstRow="0" w:lastRow="0" w:firstColumn="0" w:lastColumn="0" w:noHBand="0" w:noVBand="0"/>
       </w:tblPr>
       <w:tblGrid>
-        <w:gridCol w:w="565"/>
-        <w:gridCol w:w="964"/>
-        <w:gridCol w:w="2067"/>
-        <w:gridCol w:w="1814"/>
-        <w:gridCol w:w="1464"/>
-        <w:gridCol w:w="1994"/>
-        <w:gridCol w:w="1099"/>
+        <w:gridCol w:w="536"/>
+        <w:gridCol w:w="961"/>
+        <w:gridCol w:w="1795"/>
+        <w:gridCol w:w="1693"/>
+        <w:gridCol w:w="1368"/>
+        <w:gridCol w:w="2303"/>
+        <w:gridCol w:w="1311"/>
       </w:tblGrid>
       <w:tr>
         <w:tblPrEx>
@@ -10143,6 +11355,140 @@
                 <w:sz w:val="17"/>
               </w:rPr>
               <w:t>Abierto</w:t>
+            </w:r>
+          </w:p>
+        </w:tc>
+      </w:tr>
+      <w:tr>
+        <w:tblPrEx>
+          <w:tblCellMar>
+            <w:top w:w="0" w:type="dxa"/>
+            <w:bottom w:w="0" w:type="dxa"/>
+          </w:tblCellMar>
+        </w:tblPrEx>
+        <w:tc>
+          <w:tcPr>
+            <w:tcW w:w="0" w:type="auto"/>
+          </w:tcPr>
+          <w:p>
+            <w:pPr>
+              <w:rPr>
+                <w:sz w:val="17"/>
+              </w:rPr>
+            </w:pPr>
+            <w:r>
+              <w:rPr>
+                <w:sz w:val="17"/>
+              </w:rPr>
+              <w:t>IMP-005</w:t>
+            </w:r>
+          </w:p>
+        </w:tc>
+        <w:tc>
+          <w:tcPr>
+            <w:tcW w:w="0" w:type="auto"/>
+          </w:tcPr>
+          <w:p>
+            <w:pPr>
+              <w:rPr>
+                <w:sz w:val="17"/>
+              </w:rPr>
+            </w:pPr>
+            <w:r>
+              <w:rPr>
+                <w:sz w:val="17"/>
+              </w:rPr>
+              <w:t>2026-08-24</w:t>
+            </w:r>
+          </w:p>
+        </w:tc>
+        <w:tc>
+          <w:tcPr>
+            <w:tcW w:w="0" w:type="auto"/>
+          </w:tcPr>
+          <w:p>
+            <w:pPr>
+              <w:rPr>
+                <w:sz w:val="17"/>
+              </w:rPr>
+            </w:pPr>
+            <w:r>
+              <w:rPr>
+                <w:sz w:val="17"/>
+              </w:rPr>
+              <w:t>Feed rápido SGC no conserva replays antiguos</w:t>
+            </w:r>
+          </w:p>
+        </w:tc>
+        <w:tc>
+          <w:tcPr>
+            <w:tcW w:w="0" w:type="auto"/>
+          </w:tcPr>
+          <w:p>
+            <w:pPr>
+              <w:rPr>
+                <w:sz w:val="17"/>
+              </w:rPr>
+            </w:pPr>
+            <w:r>
+              <w:rPr>
+                <w:sz w:val="17"/>
+              </w:rPr>
+              <w:t>Impide validar en vivo asociaciones históricas</w:t>
+            </w:r>
+          </w:p>
+        </w:tc>
+        <w:tc>
+          <w:tcPr>
+            <w:tcW w:w="0" w:type="auto"/>
+          </w:tcPr>
+          <w:p>
+            <w:pPr>
+              <w:rPr>
+                <w:sz w:val="17"/>
+              </w:rPr>
+            </w:pPr>
+            <w:r>
+              <w:rPr>
+                <w:sz w:val="17"/>
+              </w:rPr>
+              <w:t>Codex</w:t>
+            </w:r>
+          </w:p>
+        </w:tc>
+        <w:tc>
+          <w:tcPr>
+            <w:tcW w:w="0" w:type="auto"/>
+          </w:tcPr>
+          <w:p>
+            <w:pPr>
+              <w:rPr>
+                <w:sz w:val="17"/>
+              </w:rPr>
+            </w:pPr>
+            <w:r>
+              <w:rPr>
+                <w:sz w:val="17"/>
+              </w:rPr>
+              <w:t>Usar fixture contractual y catálogo archivado con atribución</w:t>
+            </w:r>
+          </w:p>
+        </w:tc>
+        <w:tc>
+          <w:tcPr>
+            <w:tcW w:w="0" w:type="auto"/>
+          </w:tcPr>
+          <w:p>
+            <w:pPr>
+              <w:rPr>
+                <w:sz w:val="17"/>
+              </w:rPr>
+            </w:pPr>
+            <w:r>
+              <w:rPr>
+                <w:sz w:val="17"/>
+              </w:rPr>
+              <w:t>Documentado</w:t>
             </w:r>
           </w:p>
         </w:tc>
@@ -10373,6 +11719,7 @@
               <w:rPr>
                 <w:sz w:val="17"/>
               </w:rPr>
+              <w:lastRenderedPageBreak/>
               <w:t>Objetivo</w:t>
             </w:r>
           </w:p>
@@ -11641,7 +12988,7 @@
         <w:color w:val="808080"/>
         <w:sz w:val="16"/>
       </w:rPr>
-      <w:t>Seismik | Control de Avance | v0.1.1</w:t>
+      <w:t>Seismik | Control de Avance | v0.1.2</w:t>
     </w:r>
   </w:p>
 </w:hdr>
@@ -11662,7 +13009,7 @@
   <w:abstractNum w:abstractNumId="0" w15:restartNumberingAfterBreak="0">
     <w:nsid w:val="FFFFFF89"/>
     <w:multiLevelType w:val="singleLevel"/>
-    <w:tmpl w:val="C1B49998"/>
+    <w:tmpl w:val="AFFE2E3C"/>
     <w:lvl w:ilvl="0">
       <w:start w:val="1"/>
       <w:numFmt w:val="bullet"/>
@@ -11680,7 +13027,7 @@
       </w:rPr>
     </w:lvl>
   </w:abstractNum>
-  <w:num w:numId="1" w16cid:durableId="788939108">
+  <w:num w:numId="1" w16cid:durableId="1510098797">
     <w:abstractNumId w:val="0"/>
   </w:num>
 </w:numbering>
@@ -12101,7 +13448,7 @@
     <w:link w:val="Ttulo1Car"/>
     <w:uiPriority w:val="9"/>
     <w:qFormat/>
-    <w:rsid w:val="009A36E8"/>
+    <w:rsid w:val="00101272"/>
     <w:pPr>
       <w:keepNext/>
       <w:keepLines/>
@@ -12124,7 +13471,7 @@
     <w:semiHidden/>
     <w:unhideWhenUsed/>
     <w:qFormat/>
-    <w:rsid w:val="009A36E8"/>
+    <w:rsid w:val="00101272"/>
     <w:pPr>
       <w:keepNext/>
       <w:keepLines/>
@@ -12147,7 +13494,7 @@
     <w:semiHidden/>
     <w:unhideWhenUsed/>
     <w:qFormat/>
-    <w:rsid w:val="009A36E8"/>
+    <w:rsid w:val="00101272"/>
     <w:pPr>
       <w:keepNext/>
       <w:keepLines/>
@@ -12170,7 +13517,7 @@
     <w:semiHidden/>
     <w:unhideWhenUsed/>
     <w:qFormat/>
-    <w:rsid w:val="009A36E8"/>
+    <w:rsid w:val="00101272"/>
     <w:pPr>
       <w:keepNext/>
       <w:keepLines/>
@@ -12193,7 +13540,7 @@
     <w:semiHidden/>
     <w:unhideWhenUsed/>
     <w:qFormat/>
-    <w:rsid w:val="009A36E8"/>
+    <w:rsid w:val="00101272"/>
     <w:pPr>
       <w:keepNext/>
       <w:keepLines/>
@@ -12214,7 +13561,7 @@
     <w:semiHidden/>
     <w:unhideWhenUsed/>
     <w:qFormat/>
-    <w:rsid w:val="009A36E8"/>
+    <w:rsid w:val="00101272"/>
     <w:pPr>
       <w:keepNext/>
       <w:keepLines/>
@@ -12237,7 +13584,7 @@
     <w:semiHidden/>
     <w:unhideWhenUsed/>
     <w:qFormat/>
-    <w:rsid w:val="009A36E8"/>
+    <w:rsid w:val="00101272"/>
     <w:pPr>
       <w:keepNext/>
       <w:keepLines/>
@@ -12258,7 +13605,7 @@
     <w:semiHidden/>
     <w:unhideWhenUsed/>
     <w:qFormat/>
-    <w:rsid w:val="009A36E8"/>
+    <w:rsid w:val="00101272"/>
     <w:pPr>
       <w:keepNext/>
       <w:keepLines/>
@@ -12281,7 +13628,7 @@
     <w:semiHidden/>
     <w:unhideWhenUsed/>
     <w:qFormat/>
-    <w:rsid w:val="009A36E8"/>
+    <w:rsid w:val="00101272"/>
     <w:pPr>
       <w:keepNext/>
       <w:keepLines/>
@@ -12325,7 +13672,7 @@
     <w:basedOn w:val="Fuentedeprrafopredeter"/>
     <w:link w:val="Ttulo1"/>
     <w:uiPriority w:val="9"/>
-    <w:rsid w:val="009A36E8"/>
+    <w:rsid w:val="00101272"/>
     <w:rPr>
       <w:rFonts w:ascii="Aptos Display" w:eastAsiaTheme="majorEastAsia" w:hAnsi="Aptos Display" w:cstheme="majorBidi"/>
       <w:color w:val="13458B"/>
@@ -12339,7 +13686,7 @@
     <w:link w:val="Ttulo2"/>
     <w:uiPriority w:val="9"/>
     <w:semiHidden/>
-    <w:rsid w:val="009A36E8"/>
+    <w:rsid w:val="00101272"/>
     <w:rPr>
       <w:rFonts w:ascii="Aptos Display" w:eastAsiaTheme="majorEastAsia" w:hAnsi="Aptos Display" w:cstheme="majorBidi"/>
       <w:color w:val="13458B"/>
@@ -12353,7 +13700,7 @@
     <w:link w:val="Ttulo3"/>
     <w:uiPriority w:val="9"/>
     <w:semiHidden/>
-    <w:rsid w:val="009A36E8"/>
+    <w:rsid w:val="00101272"/>
     <w:rPr>
       <w:rFonts w:ascii="Aptos Display" w:eastAsiaTheme="majorEastAsia" w:hAnsi="Aptos Display" w:cstheme="majorBidi"/>
       <w:color w:val="13458B"/>
@@ -12367,7 +13714,7 @@
     <w:link w:val="Ttulo4"/>
     <w:uiPriority w:val="9"/>
     <w:semiHidden/>
-    <w:rsid w:val="009A36E8"/>
+    <w:rsid w:val="00101272"/>
     <w:rPr>
       <w:rFonts w:eastAsiaTheme="majorEastAsia" w:cstheme="majorBidi"/>
       <w:i/>
@@ -12381,7 +13728,7 @@
     <w:link w:val="Ttulo5"/>
     <w:uiPriority w:val="9"/>
     <w:semiHidden/>
-    <w:rsid w:val="009A36E8"/>
+    <w:rsid w:val="00101272"/>
     <w:rPr>
       <w:rFonts w:eastAsiaTheme="majorEastAsia" w:cstheme="majorBidi"/>
       <w:color w:val="0F4761" w:themeColor="accent1" w:themeShade="BF"/>
@@ -12393,7 +13740,7 @@
     <w:link w:val="Ttulo6"/>
     <w:uiPriority w:val="9"/>
     <w:semiHidden/>
-    <w:rsid w:val="009A36E8"/>
+    <w:rsid w:val="00101272"/>
     <w:rPr>
       <w:rFonts w:eastAsiaTheme="majorEastAsia" w:cstheme="majorBidi"/>
       <w:i/>
@@ -12407,7 +13754,7 @@
     <w:link w:val="Ttulo7"/>
     <w:uiPriority w:val="9"/>
     <w:semiHidden/>
-    <w:rsid w:val="009A36E8"/>
+    <w:rsid w:val="00101272"/>
     <w:rPr>
       <w:rFonts w:eastAsiaTheme="majorEastAsia" w:cstheme="majorBidi"/>
       <w:color w:val="595959" w:themeColor="text1" w:themeTint="A6"/>
@@ -12419,7 +13766,7 @@
     <w:link w:val="Ttulo8"/>
     <w:uiPriority w:val="9"/>
     <w:semiHidden/>
-    <w:rsid w:val="009A36E8"/>
+    <w:rsid w:val="00101272"/>
     <w:rPr>
       <w:rFonts w:eastAsiaTheme="majorEastAsia" w:cstheme="majorBidi"/>
       <w:i/>
@@ -12433,7 +13780,7 @@
     <w:link w:val="Ttulo9"/>
     <w:uiPriority w:val="9"/>
     <w:semiHidden/>
-    <w:rsid w:val="009A36E8"/>
+    <w:rsid w:val="00101272"/>
     <w:rPr>
       <w:rFonts w:eastAsiaTheme="majorEastAsia" w:cstheme="majorBidi"/>
       <w:color w:val="272727" w:themeColor="text1" w:themeTint="D8"/>
@@ -12446,7 +13793,7 @@
     <w:link w:val="TtuloCar"/>
     <w:uiPriority w:val="10"/>
     <w:qFormat/>
-    <w:rsid w:val="009A36E8"/>
+    <w:rsid w:val="00101272"/>
     <w:pPr>
       <w:spacing w:after="80"/>
       <w:contextualSpacing/>
@@ -12465,7 +13812,7 @@
     <w:basedOn w:val="Fuentedeprrafopredeter"/>
     <w:link w:val="Ttulo"/>
     <w:uiPriority w:val="10"/>
-    <w:rsid w:val="009A36E8"/>
+    <w:rsid w:val="00101272"/>
     <w:rPr>
       <w:rFonts w:ascii="Aptos Display" w:eastAsiaTheme="majorEastAsia" w:hAnsi="Aptos Display" w:cstheme="majorBidi"/>
       <w:color w:val="13458B"/>
@@ -12482,7 +13829,7 @@
     <w:link w:val="SubttuloCar"/>
     <w:uiPriority w:val="11"/>
     <w:qFormat/>
-    <w:rsid w:val="009A36E8"/>
+    <w:rsid w:val="00101272"/>
     <w:pPr>
       <w:numPr>
         <w:ilvl w:val="1"/>
@@ -12501,7 +13848,7 @@
     <w:basedOn w:val="Fuentedeprrafopredeter"/>
     <w:link w:val="Subttulo"/>
     <w:uiPriority w:val="11"/>
-    <w:rsid w:val="009A36E8"/>
+    <w:rsid w:val="00101272"/>
     <w:rPr>
       <w:rFonts w:eastAsiaTheme="majorEastAsia" w:cstheme="majorBidi"/>
       <w:color w:val="595959" w:themeColor="text1" w:themeTint="A6"/>
@@ -12517,7 +13864,7 @@
     <w:link w:val="CitaCar"/>
     <w:uiPriority w:val="29"/>
     <w:qFormat/>
-    <w:rsid w:val="009A36E8"/>
+    <w:rsid w:val="00101272"/>
     <w:pPr>
       <w:spacing w:before="160"/>
       <w:jc w:val="center"/>
@@ -12533,7 +13880,7 @@
     <w:basedOn w:val="Fuentedeprrafopredeter"/>
     <w:link w:val="Cita"/>
     <w:uiPriority w:val="29"/>
-    <w:rsid w:val="009A36E8"/>
+    <w:rsid w:val="00101272"/>
     <w:rPr>
       <w:i/>
       <w:iCs/>
@@ -12545,7 +13892,7 @@
     <w:basedOn w:val="Normal"/>
     <w:uiPriority w:val="34"/>
     <w:qFormat/>
-    <w:rsid w:val="009A36E8"/>
+    <w:rsid w:val="00101272"/>
     <w:pPr>
       <w:ind w:left="720"/>
       <w:contextualSpacing/>
@@ -12556,7 +13903,7 @@
     <w:basedOn w:val="Fuentedeprrafopredeter"/>
     <w:uiPriority w:val="21"/>
     <w:qFormat/>
-    <w:rsid w:val="009A36E8"/>
+    <w:rsid w:val="00101272"/>
     <w:rPr>
       <w:i/>
       <w:iCs/>
@@ -12570,7 +13917,7 @@
     <w:link w:val="CitadestacadaCar"/>
     <w:uiPriority w:val="30"/>
     <w:qFormat/>
-    <w:rsid w:val="009A36E8"/>
+    <w:rsid w:val="00101272"/>
     <w:pPr>
       <w:pBdr>
         <w:top w:val="single" w:sz="4" w:space="10" w:color="0F4761" w:themeColor="accent1" w:themeShade="BF"/>
@@ -12591,7 +13938,7 @@
     <w:basedOn w:val="Fuentedeprrafopredeter"/>
     <w:link w:val="Citadestacada"/>
     <w:uiPriority w:val="30"/>
-    <w:rsid w:val="009A36E8"/>
+    <w:rsid w:val="00101272"/>
     <w:rPr>
       <w:i/>
       <w:iCs/>
@@ -12603,7 +13950,7 @@
     <w:basedOn w:val="Fuentedeprrafopredeter"/>
     <w:uiPriority w:val="32"/>
     <w:qFormat/>
-    <w:rsid w:val="009A36E8"/>
+    <w:rsid w:val="00101272"/>
     <w:rPr>
       <w:b/>
       <w:bCs/>
@@ -12618,7 +13965,7 @@
     <w:link w:val="EncabezadoCar"/>
     <w:uiPriority w:val="99"/>
     <w:unhideWhenUsed/>
-    <w:rsid w:val="009A36E8"/>
+    <w:rsid w:val="00101272"/>
     <w:pPr>
       <w:tabs>
         <w:tab w:val="center" w:pos="4419"/>
@@ -12632,7 +13979,7 @@
     <w:basedOn w:val="Fuentedeprrafopredeter"/>
     <w:link w:val="Encabezado"/>
     <w:uiPriority w:val="99"/>
-    <w:rsid w:val="009A36E8"/>
+    <w:rsid w:val="00101272"/>
     <w:rPr>
       <w:rFonts w:ascii="Aptos" w:hAnsi="Aptos"/>
       <w:sz w:val="20"/>
@@ -12644,7 +13991,7 @@
     <w:link w:val="PiedepginaCar"/>
     <w:uiPriority w:val="99"/>
     <w:unhideWhenUsed/>
-    <w:rsid w:val="009A36E8"/>
+    <w:rsid w:val="00101272"/>
     <w:pPr>
       <w:tabs>
         <w:tab w:val="center" w:pos="4419"/>
@@ -12658,7 +14005,7 @@
     <w:basedOn w:val="Fuentedeprrafopredeter"/>
     <w:link w:val="Piedepgina"/>
     <w:uiPriority w:val="99"/>
-    <w:rsid w:val="009A36E8"/>
+    <w:rsid w:val="00101272"/>
     <w:rPr>
       <w:rFonts w:ascii="Aptos" w:hAnsi="Aptos"/>
       <w:sz w:val="20"/>
@@ -12669,7 +14016,7 @@
     <w:basedOn w:val="Normal"/>
     <w:uiPriority w:val="99"/>
     <w:unhideWhenUsed/>
-    <w:rsid w:val="009A36E8"/>
+    <w:rsid w:val="00101272"/>
     <w:pPr>
       <w:numPr>
         <w:numId w:val="1"/>

</xml_diff>

<commit_message>
feat: integrate Sprint 3 pipeline in test mode
</commit_message>
<xml_diff>
--- a/docs/project-management/SEISMIK_CONTROL_AVANCE_v0.1.docx
+++ b/docs/project-management/SEISMIK_CONTROL_AVANCE_v0.1.docx
@@ -12,17 +12,17 @@
     </w:p>
     <w:p>
       <w:r>
-        <w:t xml:space="preserve">Versión: 0.1.2  </w:t>
+        <w:t>Versión: 0.1.3</w:t>
       </w:r>
     </w:p>
     <w:p>
       <w:r>
-        <w:t>Fecha de corte: 24 de agosto de 2026</w:t>
+        <w:t>Fecha de corte: 26 de agosto de 2026</w:t>
       </w:r>
     </w:p>
     <w:p>
       <w:r>
-        <w:t>Estado general: Alfa 0.1 — Sprint 2 cerrado técnicamente; revisión científica pendiente</w:t>
+        <w:t>Estado general: Alfa 0.1 — Sprint 3 en curso; E2E Docker pendiente de WSL 2</w:t>
       </w:r>
     </w:p>
     <w:p>
@@ -465,6 +465,104 @@
                 <w:sz w:val="17"/>
               </w:rPr>
               <w:t>Calibración sombra y cierre técnico del Sprint 2</w:t>
+            </w:r>
+          </w:p>
+        </w:tc>
+        <w:tc>
+          <w:tcPr>
+            <w:tcW w:w="0" w:type="auto"/>
+          </w:tcPr>
+          <w:p>
+            <w:pPr>
+              <w:rPr>
+                <w:sz w:val="17"/>
+              </w:rPr>
+            </w:pPr>
+            <w:r>
+              <w:rPr>
+                <w:sz w:val="17"/>
+              </w:rPr>
+              <w:t>Activo</w:t>
+            </w:r>
+          </w:p>
+        </w:tc>
+      </w:tr>
+      <w:tr>
+        <w:tblPrEx>
+          <w:tblCellMar>
+            <w:top w:w="0" w:type="dxa"/>
+            <w:bottom w:w="0" w:type="dxa"/>
+          </w:tblCellMar>
+        </w:tblPrEx>
+        <w:tc>
+          <w:tcPr>
+            <w:tcW w:w="0" w:type="auto"/>
+          </w:tcPr>
+          <w:p>
+            <w:pPr>
+              <w:rPr>
+                <w:sz w:val="17"/>
+              </w:rPr>
+            </w:pPr>
+            <w:r>
+              <w:rPr>
+                <w:sz w:val="17"/>
+              </w:rPr>
+              <w:t>0.1.3</w:t>
+            </w:r>
+          </w:p>
+        </w:tc>
+        <w:tc>
+          <w:tcPr>
+            <w:tcW w:w="0" w:type="auto"/>
+          </w:tcPr>
+          <w:p>
+            <w:pPr>
+              <w:rPr>
+                <w:sz w:val="17"/>
+              </w:rPr>
+            </w:pPr>
+            <w:r>
+              <w:rPr>
+                <w:sz w:val="17"/>
+              </w:rPr>
+              <w:t>2026-08-26</w:t>
+            </w:r>
+          </w:p>
+        </w:tc>
+        <w:tc>
+          <w:tcPr>
+            <w:tcW w:w="0" w:type="auto"/>
+          </w:tcPr>
+          <w:p>
+            <w:pPr>
+              <w:rPr>
+                <w:sz w:val="17"/>
+              </w:rPr>
+            </w:pPr>
+            <w:r>
+              <w:rPr>
+                <w:sz w:val="17"/>
+              </w:rPr>
+              <w:t>Codex</w:t>
+            </w:r>
+          </w:p>
+        </w:tc>
+        <w:tc>
+          <w:tcPr>
+            <w:tcW w:w="0" w:type="auto"/>
+          </w:tcPr>
+          <w:p>
+            <w:pPr>
+              <w:rPr>
+                <w:sz w:val="17"/>
+              </w:rPr>
+            </w:pPr>
+            <w:r>
+              <w:rPr>
+                <w:sz w:val="17"/>
+              </w:rPr>
+              <w:t>Seguridad, bus y avance técnico del Sprint 3</w:t>
             </w:r>
           </w:p>
         </w:tc>
@@ -1493,7 +1591,7 @@
               <w:rPr>
                 <w:sz w:val="17"/>
               </w:rPr>
-              <w:t>41 aprobadas; Ruff y mypy limpios</w:t>
+              <w:t>55 aprobadas; Ruff y mypy limpios</w:t>
             </w:r>
           </w:p>
         </w:tc>
@@ -1547,7 +1645,7 @@
               <w:rPr>
                 <w:sz w:val="17"/>
               </w:rPr>
-              <w:t>Entorno local 2026-08-24</w:t>
+              <w:t>Entorno local 2026-08-26</w:t>
             </w:r>
           </w:p>
         </w:tc>
@@ -1769,6 +1867,7 @@
               <w:rPr>
                 <w:sz w:val="17"/>
               </w:rPr>
+              <w:lastRenderedPageBreak/>
               <w:t>Operación en sombra</w:t>
             </w:r>
           </w:p>
@@ -1867,7 +1966,6 @@
               <w:rPr>
                 <w:sz w:val="17"/>
               </w:rPr>
-              <w:lastRenderedPageBreak/>
               <w:t>Costo cloud activo</w:t>
             </w:r>
           </w:p>
@@ -1902,9 +2000,17 @@
             </w:pPr>
             <w:r>
               <w:rPr>
-                <w:sz w:val="17"/>
-              </w:rPr>
-              <w:t>≤150.000 COP/mes</w:t>
+                <w:rFonts w:hint="eastAsia"/>
+                <w:sz w:val="17"/>
+              </w:rPr>
+              <w:t>≤</w:t>
+            </w:r>
+            <w:r>
+              <w:rPr>
+                <w:rFonts w:hint="eastAsia"/>
+                <w:sz w:val="17"/>
+              </w:rPr>
+              <w:t>150.000 COP/mes</w:t>
             </w:r>
           </w:p>
         </w:tc>
@@ -4106,6 +4212,7 @@
               <w:rPr>
                 <w:sz w:val="17"/>
               </w:rPr>
+              <w:lastRenderedPageBreak/>
               <w:t>S1-06</w:t>
             </w:r>
           </w:p>
@@ -5089,6 +5196,1018 @@
         <w:pStyle w:val="Ttulo1"/>
       </w:pPr>
       <w:r>
+        <w:t>3.3 Tablero de Sprint 3</w:t>
+      </w:r>
+    </w:p>
+    <w:tbl>
+      <w:tblPr>
+        <w:tblW w:w="0" w:type="auto"/>
+        <w:tblInd w:w="-5" w:type="dxa"/>
+        <w:tblBorders>
+          <w:top w:val="single" w:sz="4" w:space="0" w:color="auto"/>
+          <w:left w:val="single" w:sz="4" w:space="0" w:color="auto"/>
+          <w:bottom w:val="single" w:sz="4" w:space="0" w:color="auto"/>
+          <w:right w:val="single" w:sz="4" w:space="0" w:color="auto"/>
+          <w:insideH w:val="single" w:sz="4" w:space="0" w:color="auto"/>
+          <w:insideV w:val="single" w:sz="4" w:space="0" w:color="auto"/>
+        </w:tblBorders>
+        <w:tblCellMar>
+          <w:left w:w="70" w:type="dxa"/>
+          <w:right w:w="70" w:type="dxa"/>
+        </w:tblCellMar>
+        <w:tblLook w:val="0000" w:firstRow="0" w:lastRow="0" w:firstColumn="0" w:lastColumn="0" w:noHBand="0" w:noVBand="0"/>
+      </w:tblPr>
+      <w:tblGrid>
+        <w:gridCol w:w="486"/>
+        <w:gridCol w:w="1940"/>
+        <w:gridCol w:w="1735"/>
+        <w:gridCol w:w="843"/>
+        <w:gridCol w:w="1629"/>
+        <w:gridCol w:w="3334"/>
+      </w:tblGrid>
+      <w:tr>
+        <w:tblPrEx>
+          <w:tblCellMar>
+            <w:top w:w="0" w:type="dxa"/>
+            <w:bottom w:w="0" w:type="dxa"/>
+          </w:tblCellMar>
+        </w:tblPrEx>
+        <w:trPr>
+          <w:tblHeader/>
+        </w:trPr>
+        <w:tc>
+          <w:tcPr>
+            <w:tcW w:w="0" w:type="auto"/>
+            <w:shd w:val="clear" w:color="auto" w:fill="13458B"/>
+          </w:tcPr>
+          <w:p>
+            <w:pPr>
+              <w:rPr>
+                <w:b/>
+                <w:color w:val="FFFFFF"/>
+                <w:sz w:val="17"/>
+              </w:rPr>
+            </w:pPr>
+            <w:r>
+              <w:rPr>
+                <w:b/>
+                <w:color w:val="FFFFFF"/>
+                <w:sz w:val="17"/>
+              </w:rPr>
+              <w:t>ID</w:t>
+            </w:r>
+          </w:p>
+        </w:tc>
+        <w:tc>
+          <w:tcPr>
+            <w:tcW w:w="0" w:type="auto"/>
+            <w:shd w:val="clear" w:color="auto" w:fill="13458B"/>
+          </w:tcPr>
+          <w:p>
+            <w:pPr>
+              <w:rPr>
+                <w:b/>
+                <w:color w:val="FFFFFF"/>
+                <w:sz w:val="17"/>
+              </w:rPr>
+            </w:pPr>
+            <w:r>
+              <w:rPr>
+                <w:b/>
+                <w:color w:val="FFFFFF"/>
+                <w:sz w:val="17"/>
+              </w:rPr>
+              <w:t>Actividad</w:t>
+            </w:r>
+          </w:p>
+        </w:tc>
+        <w:tc>
+          <w:tcPr>
+            <w:tcW w:w="0" w:type="auto"/>
+            <w:shd w:val="clear" w:color="auto" w:fill="13458B"/>
+          </w:tcPr>
+          <w:p>
+            <w:pPr>
+              <w:rPr>
+                <w:b/>
+                <w:color w:val="FFFFFF"/>
+                <w:sz w:val="17"/>
+              </w:rPr>
+            </w:pPr>
+            <w:r>
+              <w:rPr>
+                <w:b/>
+                <w:color w:val="FFFFFF"/>
+                <w:sz w:val="17"/>
+              </w:rPr>
+              <w:t>Responsable</w:t>
+            </w:r>
+          </w:p>
+        </w:tc>
+        <w:tc>
+          <w:tcPr>
+            <w:tcW w:w="0" w:type="auto"/>
+            <w:shd w:val="clear" w:color="auto" w:fill="13458B"/>
+          </w:tcPr>
+          <w:p>
+            <w:pPr>
+              <w:rPr>
+                <w:b/>
+                <w:color w:val="FFFFFF"/>
+                <w:sz w:val="17"/>
+              </w:rPr>
+            </w:pPr>
+            <w:r>
+              <w:rPr>
+                <w:b/>
+                <w:color w:val="FFFFFF"/>
+                <w:sz w:val="17"/>
+              </w:rPr>
+              <w:t>Estado</w:t>
+            </w:r>
+          </w:p>
+        </w:tc>
+        <w:tc>
+          <w:tcPr>
+            <w:tcW w:w="0" w:type="auto"/>
+            <w:shd w:val="clear" w:color="auto" w:fill="13458B"/>
+          </w:tcPr>
+          <w:p>
+            <w:pPr>
+              <w:rPr>
+                <w:b/>
+                <w:color w:val="FFFFFF"/>
+                <w:sz w:val="17"/>
+              </w:rPr>
+            </w:pPr>
+            <w:r>
+              <w:rPr>
+                <w:b/>
+                <w:color w:val="FFFFFF"/>
+                <w:sz w:val="17"/>
+              </w:rPr>
+              <w:t>Entregable</w:t>
+            </w:r>
+          </w:p>
+        </w:tc>
+        <w:tc>
+          <w:tcPr>
+            <w:tcW w:w="0" w:type="auto"/>
+            <w:shd w:val="clear" w:color="auto" w:fill="13458B"/>
+          </w:tcPr>
+          <w:p>
+            <w:pPr>
+              <w:rPr>
+                <w:b/>
+                <w:color w:val="FFFFFF"/>
+                <w:sz w:val="17"/>
+              </w:rPr>
+            </w:pPr>
+            <w:r>
+              <w:rPr>
+                <w:b/>
+                <w:color w:val="FFFFFF"/>
+                <w:sz w:val="17"/>
+              </w:rPr>
+              <w:t>Evidencia</w:t>
+            </w:r>
+          </w:p>
+        </w:tc>
+      </w:tr>
+      <w:tr>
+        <w:tblPrEx>
+          <w:tblCellMar>
+            <w:top w:w="0" w:type="dxa"/>
+            <w:bottom w:w="0" w:type="dxa"/>
+          </w:tblCellMar>
+        </w:tblPrEx>
+        <w:tc>
+          <w:tcPr>
+            <w:tcW w:w="0" w:type="auto"/>
+          </w:tcPr>
+          <w:p>
+            <w:pPr>
+              <w:rPr>
+                <w:sz w:val="17"/>
+              </w:rPr>
+            </w:pPr>
+            <w:r>
+              <w:rPr>
+                <w:sz w:val="17"/>
+              </w:rPr>
+              <w:t>S3-01</w:t>
+            </w:r>
+          </w:p>
+        </w:tc>
+        <w:tc>
+          <w:tcPr>
+            <w:tcW w:w="0" w:type="auto"/>
+          </w:tcPr>
+          <w:p>
+            <w:pPr>
+              <w:rPr>
+                <w:sz w:val="17"/>
+              </w:rPr>
+            </w:pPr>
+            <w:r>
+              <w:rPr>
+                <w:sz w:val="17"/>
+              </w:rPr>
+              <w:t>Contratos Pydantic/OpenAPI</w:t>
+            </w:r>
+          </w:p>
+        </w:tc>
+        <w:tc>
+          <w:tcPr>
+            <w:tcW w:w="0" w:type="auto"/>
+          </w:tcPr>
+          <w:p>
+            <w:pPr>
+              <w:rPr>
+                <w:sz w:val="17"/>
+              </w:rPr>
+            </w:pPr>
+            <w:r>
+              <w:rPr>
+                <w:sz w:val="17"/>
+              </w:rPr>
+              <w:t>Codex</w:t>
+            </w:r>
+          </w:p>
+        </w:tc>
+        <w:tc>
+          <w:tcPr>
+            <w:tcW w:w="0" w:type="auto"/>
+          </w:tcPr>
+          <w:p>
+            <w:pPr>
+              <w:rPr>
+                <w:sz w:val="17"/>
+              </w:rPr>
+            </w:pPr>
+            <w:r>
+              <w:rPr>
+                <w:sz w:val="17"/>
+              </w:rPr>
+              <w:t>CO</w:t>
+            </w:r>
+          </w:p>
+        </w:tc>
+        <w:tc>
+          <w:tcPr>
+            <w:tcW w:w="0" w:type="auto"/>
+          </w:tcPr>
+          <w:p>
+            <w:pPr>
+              <w:rPr>
+                <w:sz w:val="17"/>
+              </w:rPr>
+            </w:pPr>
+            <w:r>
+              <w:rPr>
+                <w:sz w:val="17"/>
+              </w:rPr>
+              <w:t>OpenAPI v1 estricta</w:t>
+            </w:r>
+          </w:p>
+        </w:tc>
+        <w:tc>
+          <w:tcPr>
+            <w:tcW w:w="0" w:type="auto"/>
+          </w:tcPr>
+          <w:p>
+            <w:pPr>
+              <w:rPr>
+                <w:sz w:val="17"/>
+              </w:rPr>
+            </w:pPr>
+            <w:r>
+              <w:rPr>
+                <w:sz w:val="17"/>
+              </w:rPr>
+              <w:t>docs/api/openapi-v1.json, tests</w:t>
+            </w:r>
+          </w:p>
+        </w:tc>
+      </w:tr>
+      <w:tr>
+        <w:tblPrEx>
+          <w:tblCellMar>
+            <w:top w:w="0" w:type="dxa"/>
+            <w:bottom w:w="0" w:type="dxa"/>
+          </w:tblCellMar>
+        </w:tblPrEx>
+        <w:tc>
+          <w:tcPr>
+            <w:tcW w:w="0" w:type="auto"/>
+          </w:tcPr>
+          <w:p>
+            <w:pPr>
+              <w:rPr>
+                <w:sz w:val="17"/>
+              </w:rPr>
+            </w:pPr>
+            <w:r>
+              <w:rPr>
+                <w:sz w:val="17"/>
+              </w:rPr>
+              <w:t>S3-02</w:t>
+            </w:r>
+          </w:p>
+        </w:tc>
+        <w:tc>
+          <w:tcPr>
+            <w:tcW w:w="0" w:type="auto"/>
+          </w:tcPr>
+          <w:p>
+            <w:pPr>
+              <w:rPr>
+                <w:sz w:val="17"/>
+              </w:rPr>
+            </w:pPr>
+            <w:r>
+              <w:rPr>
+                <w:sz w:val="17"/>
+              </w:rPr>
+              <w:t>HMAC, replay e idempotencia</w:t>
+            </w:r>
+          </w:p>
+        </w:tc>
+        <w:tc>
+          <w:tcPr>
+            <w:tcW w:w="0" w:type="auto"/>
+          </w:tcPr>
+          <w:p>
+            <w:pPr>
+              <w:rPr>
+                <w:sz w:val="17"/>
+              </w:rPr>
+            </w:pPr>
+            <w:r>
+              <w:rPr>
+                <w:sz w:val="17"/>
+              </w:rPr>
+              <w:t>Codex</w:t>
+            </w:r>
+          </w:p>
+        </w:tc>
+        <w:tc>
+          <w:tcPr>
+            <w:tcW w:w="0" w:type="auto"/>
+          </w:tcPr>
+          <w:p>
+            <w:pPr>
+              <w:rPr>
+                <w:sz w:val="17"/>
+              </w:rPr>
+            </w:pPr>
+            <w:r>
+              <w:rPr>
+                <w:sz w:val="17"/>
+              </w:rPr>
+              <w:t>CO</w:t>
+            </w:r>
+          </w:p>
+        </w:tc>
+        <w:tc>
+          <w:tcPr>
+            <w:tcW w:w="0" w:type="auto"/>
+          </w:tcPr>
+          <w:p>
+            <w:pPr>
+              <w:rPr>
+                <w:sz w:val="17"/>
+              </w:rPr>
+            </w:pPr>
+            <w:r>
+              <w:rPr>
+                <w:sz w:val="17"/>
+              </w:rPr>
+              <w:t>Ingesta endurecida</w:t>
+            </w:r>
+          </w:p>
+        </w:tc>
+        <w:tc>
+          <w:tcPr>
+            <w:tcW w:w="0" w:type="auto"/>
+          </w:tcPr>
+          <w:p>
+            <w:pPr>
+              <w:rPr>
+                <w:sz w:val="17"/>
+              </w:rPr>
+            </w:pPr>
+            <w:r>
+              <w:rPr>
+                <w:sz w:val="17"/>
+              </w:rPr>
+              <w:t>413/401/422, duplicados y bus atómico probados</w:t>
+            </w:r>
+          </w:p>
+        </w:tc>
+      </w:tr>
+      <w:tr>
+        <w:tblPrEx>
+          <w:tblCellMar>
+            <w:top w:w="0" w:type="dxa"/>
+            <w:bottom w:w="0" w:type="dxa"/>
+          </w:tblCellMar>
+        </w:tblPrEx>
+        <w:tc>
+          <w:tcPr>
+            <w:tcW w:w="0" w:type="auto"/>
+          </w:tcPr>
+          <w:p>
+            <w:pPr>
+              <w:rPr>
+                <w:sz w:val="17"/>
+              </w:rPr>
+            </w:pPr>
+            <w:r>
+              <w:rPr>
+                <w:sz w:val="17"/>
+              </w:rPr>
+              <w:t>S3-03</w:t>
+            </w:r>
+          </w:p>
+        </w:tc>
+        <w:tc>
+          <w:tcPr>
+            <w:tcW w:w="0" w:type="auto"/>
+          </w:tcPr>
+          <w:p>
+            <w:pPr>
+              <w:rPr>
+                <w:sz w:val="17"/>
+              </w:rPr>
+            </w:pPr>
+            <w:r>
+              <w:rPr>
+                <w:sz w:val="17"/>
+              </w:rPr>
+              <w:t>Elegir bus MVP</w:t>
+            </w:r>
+          </w:p>
+        </w:tc>
+        <w:tc>
+          <w:tcPr>
+            <w:tcW w:w="0" w:type="auto"/>
+          </w:tcPr>
+          <w:p>
+            <w:pPr>
+              <w:rPr>
+                <w:sz w:val="17"/>
+              </w:rPr>
+            </w:pPr>
+            <w:r>
+              <w:rPr>
+                <w:sz w:val="17"/>
+              </w:rPr>
+              <w:t>Codex propone; PO aprueba</w:t>
+            </w:r>
+          </w:p>
+        </w:tc>
+        <w:tc>
+          <w:tcPr>
+            <w:tcW w:w="0" w:type="auto"/>
+          </w:tcPr>
+          <w:p>
+            <w:pPr>
+              <w:rPr>
+                <w:sz w:val="17"/>
+              </w:rPr>
+            </w:pPr>
+            <w:r>
+              <w:rPr>
+                <w:sz w:val="17"/>
+              </w:rPr>
+              <w:t>CO técnico</w:t>
+            </w:r>
+          </w:p>
+        </w:tc>
+        <w:tc>
+          <w:tcPr>
+            <w:tcW w:w="0" w:type="auto"/>
+          </w:tcPr>
+          <w:p>
+            <w:pPr>
+              <w:rPr>
+                <w:sz w:val="17"/>
+              </w:rPr>
+            </w:pPr>
+            <w:r>
+              <w:rPr>
+                <w:sz w:val="17"/>
+              </w:rPr>
+              <w:t>ADR Redis Streams</w:t>
+            </w:r>
+          </w:p>
+        </w:tc>
+        <w:tc>
+          <w:tcPr>
+            <w:tcW w:w="0" w:type="auto"/>
+          </w:tcPr>
+          <w:p>
+            <w:pPr>
+              <w:rPr>
+                <w:sz w:val="17"/>
+              </w:rPr>
+            </w:pPr>
+            <w:r>
+              <w:rPr>
+                <w:sz w:val="17"/>
+              </w:rPr>
+              <w:t>ADR-0001-redis-streams-mvp.md</w:t>
+            </w:r>
+          </w:p>
+        </w:tc>
+      </w:tr>
+      <w:tr>
+        <w:tblPrEx>
+          <w:tblCellMar>
+            <w:top w:w="0" w:type="dxa"/>
+            <w:bottom w:w="0" w:type="dxa"/>
+          </w:tblCellMar>
+        </w:tblPrEx>
+        <w:tc>
+          <w:tcPr>
+            <w:tcW w:w="0" w:type="auto"/>
+          </w:tcPr>
+          <w:p>
+            <w:pPr>
+              <w:rPr>
+                <w:sz w:val="17"/>
+              </w:rPr>
+            </w:pPr>
+            <w:r>
+              <w:rPr>
+                <w:sz w:val="17"/>
+              </w:rPr>
+              <w:t>S3-04</w:t>
+            </w:r>
+          </w:p>
+        </w:tc>
+        <w:tc>
+          <w:tcPr>
+            <w:tcW w:w="0" w:type="auto"/>
+          </w:tcPr>
+          <w:p>
+            <w:pPr>
+              <w:rPr>
+                <w:sz w:val="17"/>
+              </w:rPr>
+            </w:pPr>
+            <w:r>
+              <w:rPr>
+                <w:sz w:val="17"/>
+              </w:rPr>
+              <w:t>App Check y registro</w:t>
+            </w:r>
+          </w:p>
+        </w:tc>
+        <w:tc>
+          <w:tcPr>
+            <w:tcW w:w="0" w:type="auto"/>
+          </w:tcPr>
+          <w:p>
+            <w:pPr>
+              <w:rPr>
+                <w:sz w:val="17"/>
+              </w:rPr>
+            </w:pPr>
+            <w:r>
+              <w:rPr>
+                <w:sz w:val="17"/>
+              </w:rPr>
+              <w:t>Codex</w:t>
+            </w:r>
+          </w:p>
+        </w:tc>
+        <w:tc>
+          <w:tcPr>
+            <w:tcW w:w="0" w:type="auto"/>
+          </w:tcPr>
+          <w:p>
+            <w:pPr>
+              <w:rPr>
+                <w:sz w:val="17"/>
+              </w:rPr>
+            </w:pPr>
+            <w:r>
+              <w:rPr>
+                <w:sz w:val="17"/>
+              </w:rPr>
+              <w:t>CO técnico</w:t>
+            </w:r>
+          </w:p>
+        </w:tc>
+        <w:tc>
+          <w:tcPr>
+            <w:tcW w:w="0" w:type="auto"/>
+          </w:tcPr>
+          <w:p>
+            <w:pPr>
+              <w:rPr>
+                <w:sz w:val="17"/>
+              </w:rPr>
+            </w:pPr>
+            <w:r>
+              <w:rPr>
+                <w:sz w:val="17"/>
+              </w:rPr>
+              <w:t>Integridad tipada</w:t>
+            </w:r>
+          </w:p>
+        </w:tc>
+        <w:tc>
+          <w:tcPr>
+            <w:tcW w:w="0" w:type="auto"/>
+          </w:tcPr>
+          <w:p>
+            <w:pPr>
+              <w:rPr>
+                <w:sz w:val="17"/>
+              </w:rPr>
+            </w:pPr>
+            <w:r>
+              <w:rPr>
+                <w:sz w:val="17"/>
+              </w:rPr>
+              <w:t>Token inválido y configuración productiva probados</w:t>
+            </w:r>
+          </w:p>
+        </w:tc>
+      </w:tr>
+      <w:tr>
+        <w:tblPrEx>
+          <w:tblCellMar>
+            <w:top w:w="0" w:type="dxa"/>
+            <w:bottom w:w="0" w:type="dxa"/>
+          </w:tblCellMar>
+        </w:tblPrEx>
+        <w:tc>
+          <w:tcPr>
+            <w:tcW w:w="0" w:type="auto"/>
+          </w:tcPr>
+          <w:p>
+            <w:pPr>
+              <w:rPr>
+                <w:sz w:val="17"/>
+              </w:rPr>
+            </w:pPr>
+            <w:r>
+              <w:rPr>
+                <w:sz w:val="17"/>
+              </w:rPr>
+              <w:t>S3-05</w:t>
+            </w:r>
+          </w:p>
+        </w:tc>
+        <w:tc>
+          <w:tcPr>
+            <w:tcW w:w="0" w:type="auto"/>
+          </w:tcPr>
+          <w:p>
+            <w:pPr>
+              <w:rPr>
+                <w:sz w:val="17"/>
+              </w:rPr>
+            </w:pPr>
+            <w:r>
+              <w:rPr>
+                <w:sz w:val="17"/>
+              </w:rPr>
+              <w:t>Dispatcher seguro</w:t>
+            </w:r>
+          </w:p>
+        </w:tc>
+        <w:tc>
+          <w:tcPr>
+            <w:tcW w:w="0" w:type="auto"/>
+          </w:tcPr>
+          <w:p>
+            <w:pPr>
+              <w:rPr>
+                <w:sz w:val="17"/>
+              </w:rPr>
+            </w:pPr>
+            <w:r>
+              <w:rPr>
+                <w:sz w:val="17"/>
+              </w:rPr>
+              <w:t>Codex</w:t>
+            </w:r>
+          </w:p>
+        </w:tc>
+        <w:tc>
+          <w:tcPr>
+            <w:tcW w:w="0" w:type="auto"/>
+          </w:tcPr>
+          <w:p>
+            <w:pPr>
+              <w:rPr>
+                <w:sz w:val="17"/>
+              </w:rPr>
+            </w:pPr>
+            <w:r>
+              <w:rPr>
+                <w:sz w:val="17"/>
+              </w:rPr>
+              <w:t>CO</w:t>
+            </w:r>
+          </w:p>
+        </w:tc>
+        <w:tc>
+          <w:tcPr>
+            <w:tcW w:w="0" w:type="auto"/>
+          </w:tcPr>
+          <w:p>
+            <w:pPr>
+              <w:rPr>
+                <w:sz w:val="17"/>
+              </w:rPr>
+            </w:pPr>
+            <w:r>
+              <w:rPr>
+                <w:sz w:val="17"/>
+              </w:rPr>
+              <w:t>Dry run auditable y allowlist</w:t>
+            </w:r>
+          </w:p>
+        </w:tc>
+        <w:tc>
+          <w:tcPr>
+            <w:tcW w:w="0" w:type="auto"/>
+          </w:tcPr>
+          <w:p>
+            <w:pPr>
+              <w:rPr>
+                <w:sz w:val="17"/>
+              </w:rPr>
+            </w:pPr>
+            <w:r>
+              <w:rPr>
+                <w:sz w:val="17"/>
+              </w:rPr>
+              <w:t>stream:seismik:push-test, tests</w:t>
+            </w:r>
+          </w:p>
+        </w:tc>
+      </w:tr>
+      <w:tr>
+        <w:tblPrEx>
+          <w:tblCellMar>
+            <w:top w:w="0" w:type="dxa"/>
+            <w:bottom w:w="0" w:type="dxa"/>
+          </w:tblCellMar>
+        </w:tblPrEx>
+        <w:tc>
+          <w:tcPr>
+            <w:tcW w:w="0" w:type="auto"/>
+          </w:tcPr>
+          <w:p>
+            <w:pPr>
+              <w:rPr>
+                <w:sz w:val="17"/>
+              </w:rPr>
+            </w:pPr>
+            <w:r>
+              <w:rPr>
+                <w:sz w:val="17"/>
+              </w:rPr>
+              <w:t>S3-06</w:t>
+            </w:r>
+          </w:p>
+        </w:tc>
+        <w:tc>
+          <w:tcPr>
+            <w:tcW w:w="0" w:type="auto"/>
+          </w:tcPr>
+          <w:p>
+            <w:pPr>
+              <w:rPr>
+                <w:sz w:val="17"/>
+              </w:rPr>
+            </w:pPr>
+            <w:r>
+              <w:rPr>
+                <w:sz w:val="17"/>
+              </w:rPr>
+              <w:t>E2E local</w:t>
+            </w:r>
+          </w:p>
+        </w:tc>
+        <w:tc>
+          <w:tcPr>
+            <w:tcW w:w="0" w:type="auto"/>
+          </w:tcPr>
+          <w:p>
+            <w:pPr>
+              <w:rPr>
+                <w:sz w:val="17"/>
+              </w:rPr>
+            </w:pPr>
+            <w:r>
+              <w:rPr>
+                <w:sz w:val="17"/>
+              </w:rPr>
+              <w:t>Codex</w:t>
+            </w:r>
+          </w:p>
+        </w:tc>
+        <w:tc>
+          <w:tcPr>
+            <w:tcW w:w="0" w:type="auto"/>
+          </w:tcPr>
+          <w:p>
+            <w:pPr>
+              <w:rPr>
+                <w:sz w:val="17"/>
+              </w:rPr>
+            </w:pPr>
+            <w:r>
+              <w:rPr>
+                <w:sz w:val="17"/>
+              </w:rPr>
+              <w:t>ER</w:t>
+            </w:r>
+          </w:p>
+        </w:tc>
+        <w:tc>
+          <w:tcPr>
+            <w:tcW w:w="0" w:type="auto"/>
+          </w:tcPr>
+          <w:p>
+            <w:pPr>
+              <w:rPr>
+                <w:sz w:val="17"/>
+              </w:rPr>
+            </w:pPr>
+            <w:r>
+              <w:rPr>
+                <w:rFonts w:hint="eastAsia"/>
+                <w:sz w:val="17"/>
+              </w:rPr>
+              <w:t xml:space="preserve">Replay </w:t>
+            </w:r>
+            <w:r>
+              <w:rPr>
+                <w:rFonts w:hint="eastAsia"/>
+                <w:sz w:val="17"/>
+              </w:rPr>
+              <w:t>→</w:t>
+            </w:r>
+            <w:r>
+              <w:rPr>
+                <w:rFonts w:hint="eastAsia"/>
+                <w:sz w:val="17"/>
+              </w:rPr>
+              <w:t xml:space="preserve"> payload TEST</w:t>
+            </w:r>
+          </w:p>
+        </w:tc>
+        <w:tc>
+          <w:tcPr>
+            <w:tcW w:w="0" w:type="auto"/>
+          </w:tcPr>
+          <w:p>
+            <w:pPr>
+              <w:rPr>
+                <w:sz w:val="17"/>
+              </w:rPr>
+            </w:pPr>
+            <w:r>
+              <w:rPr>
+                <w:sz w:val="17"/>
+              </w:rPr>
+              <w:t>E2E en memoria aprobado; Compose pendiente</w:t>
+            </w:r>
+          </w:p>
+        </w:tc>
+      </w:tr>
+      <w:tr>
+        <w:tblPrEx>
+          <w:tblCellMar>
+            <w:top w:w="0" w:type="dxa"/>
+            <w:bottom w:w="0" w:type="dxa"/>
+          </w:tblCellMar>
+        </w:tblPrEx>
+        <w:tc>
+          <w:tcPr>
+            <w:tcW w:w="0" w:type="auto"/>
+          </w:tcPr>
+          <w:p>
+            <w:pPr>
+              <w:rPr>
+                <w:sz w:val="17"/>
+              </w:rPr>
+            </w:pPr>
+            <w:r>
+              <w:rPr>
+                <w:sz w:val="17"/>
+              </w:rPr>
+              <w:t>S3-07</w:t>
+            </w:r>
+          </w:p>
+        </w:tc>
+        <w:tc>
+          <w:tcPr>
+            <w:tcW w:w="0" w:type="auto"/>
+          </w:tcPr>
+          <w:p>
+            <w:pPr>
+              <w:rPr>
+                <w:sz w:val="17"/>
+              </w:rPr>
+            </w:pPr>
+            <w:r>
+              <w:rPr>
+                <w:sz w:val="17"/>
+              </w:rPr>
+              <w:t>IaC, cuotas y límites</w:t>
+            </w:r>
+          </w:p>
+        </w:tc>
+        <w:tc>
+          <w:tcPr>
+            <w:tcW w:w="0" w:type="auto"/>
+          </w:tcPr>
+          <w:p>
+            <w:pPr>
+              <w:rPr>
+                <w:sz w:val="17"/>
+              </w:rPr>
+            </w:pPr>
+            <w:r>
+              <w:rPr>
+                <w:sz w:val="17"/>
+              </w:rPr>
+              <w:t>Codex</w:t>
+            </w:r>
+          </w:p>
+        </w:tc>
+        <w:tc>
+          <w:tcPr>
+            <w:tcW w:w="0" w:type="auto"/>
+          </w:tcPr>
+          <w:p>
+            <w:pPr>
+              <w:rPr>
+                <w:sz w:val="17"/>
+              </w:rPr>
+            </w:pPr>
+            <w:r>
+              <w:rPr>
+                <w:sz w:val="17"/>
+              </w:rPr>
+              <w:t>CO técnico</w:t>
+            </w:r>
+          </w:p>
+        </w:tc>
+        <w:tc>
+          <w:tcPr>
+            <w:tcW w:w="0" w:type="auto"/>
+          </w:tcPr>
+          <w:p>
+            <w:pPr>
+              <w:rPr>
+                <w:sz w:val="17"/>
+              </w:rPr>
+            </w:pPr>
+            <w:r>
+              <w:rPr>
+                <w:sz w:val="17"/>
+              </w:rPr>
+              <w:t>Guardrails sin recursos</w:t>
+            </w:r>
+          </w:p>
+        </w:tc>
+        <w:tc>
+          <w:tcPr>
+            <w:tcW w:w="0" w:type="auto"/>
+          </w:tcPr>
+          <w:p>
+            <w:pPr>
+              <w:rPr>
+                <w:sz w:val="17"/>
+              </w:rPr>
+            </w:pPr>
+            <w:r>
+              <w:rPr>
+                <w:sz w:val="17"/>
+              </w:rPr>
+              <w:t>deploy/README.md, .env.example</w:t>
+            </w:r>
+          </w:p>
+        </w:tc>
+      </w:tr>
+    </w:tbl>
+    <w:p/>
+    <w:p>
+      <w:pPr>
+        <w:pStyle w:val="Ttulo1"/>
+      </w:pPr>
+      <w:r>
         <w:t>4. Registro maestro de entregables</w:t>
       </w:r>
     </w:p>
@@ -5112,11 +6231,11 @@
       </w:tblPr>
       <w:tblGrid>
         <w:gridCol w:w="703"/>
-        <w:gridCol w:w="1385"/>
+        <w:gridCol w:w="1370"/>
         <w:gridCol w:w="609"/>
-        <w:gridCol w:w="1177"/>
+        <w:gridCol w:w="1176"/>
         <w:gridCol w:w="675"/>
-        <w:gridCol w:w="1657"/>
+        <w:gridCol w:w="1673"/>
         <w:gridCol w:w="3761"/>
       </w:tblGrid>
       <w:tr>
@@ -5446,6 +6565,7 @@
               <w:rPr>
                 <w:sz w:val="17"/>
               </w:rPr>
+              <w:lastRenderedPageBreak/>
               <w:t>ENT-002</w:t>
             </w:r>
           </w:p>
@@ -5920,43 +7040,43 @@
               <w:rPr>
                 <w:sz w:val="17"/>
               </w:rPr>
-              <w:t>NI</w:t>
-            </w:r>
-          </w:p>
-        </w:tc>
-        <w:tc>
-          <w:tcPr>
-            <w:tcW w:w="0" w:type="auto"/>
-          </w:tcPr>
-          <w:p>
-            <w:pPr>
-              <w:rPr>
-                <w:sz w:val="17"/>
-              </w:rPr>
-            </w:pPr>
-            <w:r>
-              <w:rPr>
-                <w:sz w:val="17"/>
-              </w:rPr>
-              <w:t>E2E local aprobado</w:t>
-            </w:r>
-          </w:p>
-        </w:tc>
-        <w:tc>
-          <w:tcPr>
-            <w:tcW w:w="0" w:type="auto"/>
-          </w:tcPr>
-          <w:p>
-            <w:pPr>
-              <w:rPr>
-                <w:sz w:val="17"/>
-              </w:rPr>
-            </w:pPr>
-            <w:r>
-              <w:rPr>
-                <w:sz w:val="17"/>
-              </w:rPr>
-              <w:t>CI y logs de prueba</w:t>
+              <w:t>ER</w:t>
+            </w:r>
+          </w:p>
+        </w:tc>
+        <w:tc>
+          <w:tcPr>
+            <w:tcW w:w="0" w:type="auto"/>
+          </w:tcPr>
+          <w:p>
+            <w:pPr>
+              <w:rPr>
+                <w:sz w:val="17"/>
+              </w:rPr>
+            </w:pPr>
+            <w:r>
+              <w:rPr>
+                <w:sz w:val="17"/>
+              </w:rPr>
+              <w:t>E2E en memoria aprobado; falta Compose real</w:t>
+            </w:r>
+          </w:p>
+        </w:tc>
+        <w:tc>
+          <w:tcPr>
+            <w:tcW w:w="0" w:type="auto"/>
+          </w:tcPr>
+          <w:p>
+            <w:pPr>
+              <w:rPr>
+                <w:sz w:val="17"/>
+              </w:rPr>
+            </w:pPr>
+            <w:r>
+              <w:rPr>
+                <w:sz w:val="17"/>
+              </w:rPr>
+              <w:t>Tests y SPRINT_3_AVANCE_2026-08-26.md</w:t>
             </w:r>
           </w:p>
         </w:tc>
@@ -6777,7 +7897,6 @@
               <w:rPr>
                 <w:sz w:val="17"/>
               </w:rPr>
-              <w:lastRenderedPageBreak/>
               <w:t>CP-01</w:t>
             </w:r>
           </w:p>
@@ -8305,6 +9424,7 @@
               <w:rPr>
                 <w:sz w:val="17"/>
               </w:rPr>
+              <w:lastRenderedPageBreak/>
               <w:t>R-05</w:t>
             </w:r>
           </w:p>
@@ -9529,12 +10649,12 @@
         <w:tblLook w:val="0000" w:firstRow="0" w:lastRow="0" w:firstColumn="0" w:lastColumn="0" w:noHBand="0" w:noVBand="0"/>
       </w:tblPr>
       <w:tblGrid>
-        <w:gridCol w:w="676"/>
-        <w:gridCol w:w="815"/>
-        <w:gridCol w:w="2211"/>
-        <w:gridCol w:w="3072"/>
-        <w:gridCol w:w="1628"/>
-        <w:gridCol w:w="1565"/>
+        <w:gridCol w:w="641"/>
+        <w:gridCol w:w="768"/>
+        <w:gridCol w:w="1896"/>
+        <w:gridCol w:w="2680"/>
+        <w:gridCol w:w="1517"/>
+        <w:gridCol w:w="2465"/>
       </w:tblGrid>
       <w:tr>
         <w:tblPrEx>
@@ -9938,7 +11058,6 @@
               <w:rPr>
                 <w:sz w:val="17"/>
               </w:rPr>
-              <w:lastRenderedPageBreak/>
               <w:t>DEC-003</w:t>
             </w:r>
           </w:p>
@@ -10614,6 +11733,238 @@
           </w:p>
         </w:tc>
       </w:tr>
+      <w:tr>
+        <w:tblPrEx>
+          <w:tblCellMar>
+            <w:top w:w="0" w:type="dxa"/>
+            <w:bottom w:w="0" w:type="dxa"/>
+          </w:tblCellMar>
+        </w:tblPrEx>
+        <w:tc>
+          <w:tcPr>
+            <w:tcW w:w="0" w:type="auto"/>
+          </w:tcPr>
+          <w:p>
+            <w:pPr>
+              <w:rPr>
+                <w:sz w:val="17"/>
+              </w:rPr>
+            </w:pPr>
+            <w:r>
+              <w:rPr>
+                <w:sz w:val="17"/>
+              </w:rPr>
+              <w:t>DEC-009</w:t>
+            </w:r>
+          </w:p>
+        </w:tc>
+        <w:tc>
+          <w:tcPr>
+            <w:tcW w:w="0" w:type="auto"/>
+          </w:tcPr>
+          <w:p>
+            <w:pPr>
+              <w:rPr>
+                <w:sz w:val="17"/>
+              </w:rPr>
+            </w:pPr>
+            <w:r>
+              <w:rPr>
+                <w:sz w:val="17"/>
+              </w:rPr>
+              <w:t>2026-08-26</w:t>
+            </w:r>
+          </w:p>
+        </w:tc>
+        <w:tc>
+          <w:tcPr>
+            <w:tcW w:w="0" w:type="auto"/>
+          </w:tcPr>
+          <w:p>
+            <w:pPr>
+              <w:rPr>
+                <w:sz w:val="17"/>
+              </w:rPr>
+            </w:pPr>
+            <w:r>
+              <w:rPr>
+                <w:sz w:val="17"/>
+              </w:rPr>
+              <w:t>Redis Streams será el bus del MVP</w:t>
+            </w:r>
+          </w:p>
+        </w:tc>
+        <w:tc>
+          <w:tcPr>
+            <w:tcW w:w="0" w:type="auto"/>
+          </w:tcPr>
+          <w:p>
+            <w:pPr>
+              <w:rPr>
+                <w:sz w:val="17"/>
+              </w:rPr>
+            </w:pPr>
+            <w:r>
+              <w:rPr>
+                <w:sz w:val="17"/>
+              </w:rPr>
+              <w:t>Redis ya es necesario y permite beta sin activar GCP</w:t>
+            </w:r>
+          </w:p>
+        </w:tc>
+        <w:tc>
+          <w:tcPr>
+            <w:tcW w:w="0" w:type="auto"/>
+          </w:tcPr>
+          <w:p>
+            <w:pPr>
+              <w:rPr>
+                <w:sz w:val="17"/>
+              </w:rPr>
+            </w:pPr>
+            <w:r>
+              <w:rPr>
+                <w:sz w:val="17"/>
+              </w:rPr>
+              <w:t>Codex</w:t>
+            </w:r>
+          </w:p>
+        </w:tc>
+        <w:tc>
+          <w:tcPr>
+            <w:tcW w:w="0" w:type="auto"/>
+          </w:tcPr>
+          <w:p>
+            <w:pPr>
+              <w:rPr>
+                <w:sz w:val="17"/>
+              </w:rPr>
+            </w:pPr>
+            <w:r>
+              <w:rPr>
+                <w:sz w:val="17"/>
+              </w:rPr>
+              <w:t>Aceptada técnicamente; PO revisa costo antes de nube</w:t>
+            </w:r>
+          </w:p>
+        </w:tc>
+      </w:tr>
+      <w:tr>
+        <w:tblPrEx>
+          <w:tblCellMar>
+            <w:top w:w="0" w:type="dxa"/>
+            <w:bottom w:w="0" w:type="dxa"/>
+          </w:tblCellMar>
+        </w:tblPrEx>
+        <w:tc>
+          <w:tcPr>
+            <w:tcW w:w="0" w:type="auto"/>
+          </w:tcPr>
+          <w:p>
+            <w:pPr>
+              <w:rPr>
+                <w:sz w:val="17"/>
+              </w:rPr>
+            </w:pPr>
+            <w:r>
+              <w:rPr>
+                <w:sz w:val="17"/>
+              </w:rPr>
+              <w:t>DEC-010</w:t>
+            </w:r>
+          </w:p>
+        </w:tc>
+        <w:tc>
+          <w:tcPr>
+            <w:tcW w:w="0" w:type="auto"/>
+          </w:tcPr>
+          <w:p>
+            <w:pPr>
+              <w:rPr>
+                <w:sz w:val="17"/>
+              </w:rPr>
+            </w:pPr>
+            <w:r>
+              <w:rPr>
+                <w:sz w:val="17"/>
+              </w:rPr>
+              <w:t>2026-08-26</w:t>
+            </w:r>
+          </w:p>
+        </w:tc>
+        <w:tc>
+          <w:tcPr>
+            <w:tcW w:w="0" w:type="auto"/>
+          </w:tcPr>
+          <w:p>
+            <w:pPr>
+              <w:rPr>
+                <w:sz w:val="17"/>
+              </w:rPr>
+            </w:pPr>
+            <w:r>
+              <w:rPr>
+                <w:sz w:val="17"/>
+              </w:rPr>
+              <w:t>Todo push inicia en dry run auditable</w:t>
+            </w:r>
+          </w:p>
+        </w:tc>
+        <w:tc>
+          <w:tcPr>
+            <w:tcW w:w="0" w:type="auto"/>
+          </w:tcPr>
+          <w:p>
+            <w:pPr>
+              <w:rPr>
+                <w:sz w:val="17"/>
+              </w:rPr>
+            </w:pPr>
+            <w:r>
+              <w:rPr>
+                <w:sz w:val="17"/>
+              </w:rPr>
+              <w:t>Evitar alertas reales accidentales</w:t>
+            </w:r>
+          </w:p>
+        </w:tc>
+        <w:tc>
+          <w:tcPr>
+            <w:tcW w:w="0" w:type="auto"/>
+          </w:tcPr>
+          <w:p>
+            <w:pPr>
+              <w:rPr>
+                <w:sz w:val="17"/>
+              </w:rPr>
+            </w:pPr>
+            <w:r>
+              <w:rPr>
+                <w:sz w:val="17"/>
+              </w:rPr>
+              <w:t>Codex</w:t>
+            </w:r>
+          </w:p>
+        </w:tc>
+        <w:tc>
+          <w:tcPr>
+            <w:tcW w:w="0" w:type="auto"/>
+          </w:tcPr>
+          <w:p>
+            <w:pPr>
+              <w:rPr>
+                <w:sz w:val="17"/>
+              </w:rPr>
+            </w:pPr>
+            <w:r>
+              <w:rPr>
+                <w:sz w:val="17"/>
+              </w:rPr>
+              <w:t>Aceptada técnicamente</w:t>
+            </w:r>
+          </w:p>
+        </w:tc>
+      </w:tr>
     </w:tbl>
     <w:p/>
     <w:p>
@@ -10621,6 +11972,7 @@
         <w:pStyle w:val="Ttulo1"/>
       </w:pPr>
       <w:r>
+        <w:lastRenderedPageBreak/>
         <w:t>8. Registro de impedimentos</w:t>
       </w:r>
     </w:p>
@@ -10643,13 +11995,13 @@
         <w:tblLook w:val="0000" w:firstRow="0" w:lastRow="0" w:firstColumn="0" w:lastColumn="0" w:noHBand="0" w:noVBand="0"/>
       </w:tblPr>
       <w:tblGrid>
-        <w:gridCol w:w="536"/>
+        <w:gridCol w:w="532"/>
         <w:gridCol w:w="961"/>
-        <w:gridCol w:w="1795"/>
-        <w:gridCol w:w="1693"/>
-        <w:gridCol w:w="1368"/>
-        <w:gridCol w:w="2303"/>
-        <w:gridCol w:w="1311"/>
+        <w:gridCol w:w="1773"/>
+        <w:gridCol w:w="1758"/>
+        <w:gridCol w:w="1360"/>
+        <w:gridCol w:w="2276"/>
+        <w:gridCol w:w="1307"/>
       </w:tblGrid>
       <w:tr>
         <w:tblPrEx>
@@ -11489,6 +12841,140 @@
                 <w:sz w:val="17"/>
               </w:rPr>
               <w:t>Documentado</w:t>
+            </w:r>
+          </w:p>
+        </w:tc>
+      </w:tr>
+      <w:tr>
+        <w:tblPrEx>
+          <w:tblCellMar>
+            <w:top w:w="0" w:type="dxa"/>
+            <w:bottom w:w="0" w:type="dxa"/>
+          </w:tblCellMar>
+        </w:tblPrEx>
+        <w:tc>
+          <w:tcPr>
+            <w:tcW w:w="0" w:type="auto"/>
+          </w:tcPr>
+          <w:p>
+            <w:pPr>
+              <w:rPr>
+                <w:sz w:val="17"/>
+              </w:rPr>
+            </w:pPr>
+            <w:r>
+              <w:rPr>
+                <w:sz w:val="17"/>
+              </w:rPr>
+              <w:t>IMP-006</w:t>
+            </w:r>
+          </w:p>
+        </w:tc>
+        <w:tc>
+          <w:tcPr>
+            <w:tcW w:w="0" w:type="auto"/>
+          </w:tcPr>
+          <w:p>
+            <w:pPr>
+              <w:rPr>
+                <w:sz w:val="17"/>
+              </w:rPr>
+            </w:pPr>
+            <w:r>
+              <w:rPr>
+                <w:sz w:val="17"/>
+              </w:rPr>
+              <w:t>2026-08-26</w:t>
+            </w:r>
+          </w:p>
+        </w:tc>
+        <w:tc>
+          <w:tcPr>
+            <w:tcW w:w="0" w:type="auto"/>
+          </w:tcPr>
+          <w:p>
+            <w:pPr>
+              <w:rPr>
+                <w:sz w:val="17"/>
+              </w:rPr>
+            </w:pPr>
+            <w:r>
+              <w:rPr>
+                <w:sz w:val="17"/>
+              </w:rPr>
+              <w:t>WSL 2 no está habilitado</w:t>
+            </w:r>
+          </w:p>
+        </w:tc>
+        <w:tc>
+          <w:tcPr>
+            <w:tcW w:w="0" w:type="auto"/>
+          </w:tcPr>
+          <w:p>
+            <w:pPr>
+              <w:rPr>
+                <w:sz w:val="17"/>
+              </w:rPr>
+            </w:pPr>
+            <w:r>
+              <w:rPr>
+                <w:sz w:val="17"/>
+              </w:rPr>
+              <w:t>Docker daemon no inicia; E2E Compose pendiente</w:t>
+            </w:r>
+          </w:p>
+        </w:tc>
+        <w:tc>
+          <w:tcPr>
+            <w:tcW w:w="0" w:type="auto"/>
+          </w:tcPr>
+          <w:p>
+            <w:pPr>
+              <w:rPr>
+                <w:sz w:val="17"/>
+              </w:rPr>
+            </w:pPr>
+            <w:r>
+              <w:rPr>
+                <w:sz w:val="17"/>
+              </w:rPr>
+              <w:t>Product Owner</w:t>
+            </w:r>
+          </w:p>
+        </w:tc>
+        <w:tc>
+          <w:tcPr>
+            <w:tcW w:w="0" w:type="auto"/>
+          </w:tcPr>
+          <w:p>
+            <w:pPr>
+              <w:rPr>
+                <w:sz w:val="17"/>
+              </w:rPr>
+            </w:pPr>
+            <w:r>
+              <w:rPr>
+                <w:sz w:val="17"/>
+              </w:rPr>
+              <w:t>Ejecutar wsl --install como administrador y reiniciar</w:t>
+            </w:r>
+          </w:p>
+        </w:tc>
+        <w:tc>
+          <w:tcPr>
+            <w:tcW w:w="0" w:type="auto"/>
+          </w:tcPr>
+          <w:p>
+            <w:pPr>
+              <w:rPr>
+                <w:sz w:val="17"/>
+              </w:rPr>
+            </w:pPr>
+            <w:r>
+              <w:rPr>
+                <w:sz w:val="17"/>
+              </w:rPr>
+              <w:t>Abierto</w:t>
             </w:r>
           </w:p>
         </w:tc>
@@ -11719,7 +13205,6 @@
               <w:rPr>
                 <w:sz w:val="17"/>
               </w:rPr>
-              <w:lastRenderedPageBreak/>
               <w:t>Objetivo</w:t>
             </w:r>
           </w:p>
@@ -12108,9 +13593,63 @@
     <w:p>
       <w:pPr>
         <w:pStyle w:val="Listaconvietas"/>
+        <w:rPr>
+          <w:rFonts w:hint="eastAsia"/>
+        </w:rPr>
       </w:pPr>
       <w:r>
-        <w:t>[ ] Pipeline replay → candidato → API → bus → push TEST demostrado.</w:t>
+        <w:rPr>
+          <w:rFonts w:hint="eastAsia"/>
+        </w:rPr>
+        <w:t xml:space="preserve">[ ] Pipeline replay </w:t>
+      </w:r>
+      <w:r>
+        <w:rPr>
+          <w:rFonts w:hint="eastAsia"/>
+        </w:rPr>
+        <w:t>→</w:t>
+      </w:r>
+      <w:r>
+        <w:rPr>
+          <w:rFonts w:hint="eastAsia"/>
+        </w:rPr>
+        <w:t xml:space="preserve"> candidato </w:t>
+      </w:r>
+      <w:r>
+        <w:rPr>
+          <w:rFonts w:hint="eastAsia"/>
+        </w:rPr>
+        <w:t>→</w:t>
+      </w:r>
+      <w:r>
+        <w:rPr>
+          <w:rFonts w:hint="eastAsia"/>
+        </w:rPr>
+        <w:t xml:space="preserve"> API </w:t>
+      </w:r>
+      <w:r>
+        <w:rPr>
+          <w:rFonts w:hint="eastAsia"/>
+        </w:rPr>
+        <w:t>→</w:t>
+      </w:r>
+      <w:r>
+        <w:rPr>
+          <w:rFonts w:hint="eastAsia"/>
+        </w:rPr>
+        <w:t xml:space="preserve"> bus </w:t>
+      </w:r>
+      <w:r>
+        <w:rPr>
+          <w:rFonts w:hint="eastAsia"/>
+        </w:rPr>
+        <w:t>→</w:t>
+      </w:r>
+      <w:r>
+        <w:rPr>
+          <w:rFonts w:hint="eastAsia"/>
+        </w:rPr>
+        <w:t xml:space="preserve"> push TEST demostrado.</w:t>
       </w:r>
     </w:p>
     <w:p>
@@ -12988,7 +14527,7 @@
         <w:color w:val="808080"/>
         <w:sz w:val="16"/>
       </w:rPr>
-      <w:t>Seismik | Control de Avance | v0.1.2</w:t>
+      <w:t>Seismik | Control de Avance | v0.1.3</w:t>
     </w:r>
   </w:p>
 </w:hdr>
@@ -13009,7 +14548,7 @@
   <w:abstractNum w:abstractNumId="0" w15:restartNumberingAfterBreak="0">
     <w:nsid w:val="FFFFFF89"/>
     <w:multiLevelType w:val="singleLevel"/>
-    <w:tmpl w:val="AFFE2E3C"/>
+    <w:tmpl w:val="3382498E"/>
     <w:lvl w:ilvl="0">
       <w:start w:val="1"/>
       <w:numFmt w:val="bullet"/>
@@ -13027,7 +14566,7 @@
       </w:rPr>
     </w:lvl>
   </w:abstractNum>
-  <w:num w:numId="1" w16cid:durableId="1510098797">
+  <w:num w:numId="1" w16cid:durableId="1227109222">
     <w:abstractNumId w:val="0"/>
   </w:num>
 </w:numbering>
@@ -13038,11 +14577,11 @@
   <w:docDefaults>
     <w:rPrDefault>
       <w:rPr>
-        <w:rFonts w:asciiTheme="minorHAnsi" w:eastAsiaTheme="minorHAnsi" w:hAnsiTheme="minorHAnsi" w:cstheme="minorBidi"/>
+        <w:rFonts w:asciiTheme="minorHAnsi" w:eastAsiaTheme="minorEastAsia" w:hAnsiTheme="minorHAnsi" w:cstheme="minorBidi"/>
         <w:kern w:val="2"/>
         <w:sz w:val="24"/>
         <w:szCs w:val="24"/>
-        <w:lang w:val="es-CO" w:eastAsia="en-US" w:bidi="ar-SA"/>
+        <w:lang w:val="es-CO" w:eastAsia="ko-KR" w:bidi="ar-SA"/>
         <w14:ligatures w14:val="standardContextual"/>
       </w:rPr>
     </w:rPrDefault>
@@ -13448,7 +14987,7 @@
     <w:link w:val="Ttulo1Car"/>
     <w:uiPriority w:val="9"/>
     <w:qFormat/>
-    <w:rsid w:val="00101272"/>
+    <w:rsid w:val="00C74280"/>
     <w:pPr>
       <w:keepNext/>
       <w:keepLines/>
@@ -13471,7 +15010,7 @@
     <w:semiHidden/>
     <w:unhideWhenUsed/>
     <w:qFormat/>
-    <w:rsid w:val="00101272"/>
+    <w:rsid w:val="00C74280"/>
     <w:pPr>
       <w:keepNext/>
       <w:keepLines/>
@@ -13494,7 +15033,7 @@
     <w:semiHidden/>
     <w:unhideWhenUsed/>
     <w:qFormat/>
-    <w:rsid w:val="00101272"/>
+    <w:rsid w:val="00C74280"/>
     <w:pPr>
       <w:keepNext/>
       <w:keepLines/>
@@ -13517,7 +15056,7 @@
     <w:semiHidden/>
     <w:unhideWhenUsed/>
     <w:qFormat/>
-    <w:rsid w:val="00101272"/>
+    <w:rsid w:val="00C74280"/>
     <w:pPr>
       <w:keepNext/>
       <w:keepLines/>
@@ -13540,7 +15079,7 @@
     <w:semiHidden/>
     <w:unhideWhenUsed/>
     <w:qFormat/>
-    <w:rsid w:val="00101272"/>
+    <w:rsid w:val="00C74280"/>
     <w:pPr>
       <w:keepNext/>
       <w:keepLines/>
@@ -13561,7 +15100,7 @@
     <w:semiHidden/>
     <w:unhideWhenUsed/>
     <w:qFormat/>
-    <w:rsid w:val="00101272"/>
+    <w:rsid w:val="00C74280"/>
     <w:pPr>
       <w:keepNext/>
       <w:keepLines/>
@@ -13584,7 +15123,7 @@
     <w:semiHidden/>
     <w:unhideWhenUsed/>
     <w:qFormat/>
-    <w:rsid w:val="00101272"/>
+    <w:rsid w:val="00C74280"/>
     <w:pPr>
       <w:keepNext/>
       <w:keepLines/>
@@ -13605,7 +15144,7 @@
     <w:semiHidden/>
     <w:unhideWhenUsed/>
     <w:qFormat/>
-    <w:rsid w:val="00101272"/>
+    <w:rsid w:val="00C74280"/>
     <w:pPr>
       <w:keepNext/>
       <w:keepLines/>
@@ -13628,7 +15167,7 @@
     <w:semiHidden/>
     <w:unhideWhenUsed/>
     <w:qFormat/>
-    <w:rsid w:val="00101272"/>
+    <w:rsid w:val="00C74280"/>
     <w:pPr>
       <w:keepNext/>
       <w:keepLines/>
@@ -13672,7 +15211,7 @@
     <w:basedOn w:val="Fuentedeprrafopredeter"/>
     <w:link w:val="Ttulo1"/>
     <w:uiPriority w:val="9"/>
-    <w:rsid w:val="00101272"/>
+    <w:rsid w:val="00C74280"/>
     <w:rPr>
       <w:rFonts w:ascii="Aptos Display" w:eastAsiaTheme="majorEastAsia" w:hAnsi="Aptos Display" w:cstheme="majorBidi"/>
       <w:color w:val="13458B"/>
@@ -13686,7 +15225,7 @@
     <w:link w:val="Ttulo2"/>
     <w:uiPriority w:val="9"/>
     <w:semiHidden/>
-    <w:rsid w:val="00101272"/>
+    <w:rsid w:val="00C74280"/>
     <w:rPr>
       <w:rFonts w:ascii="Aptos Display" w:eastAsiaTheme="majorEastAsia" w:hAnsi="Aptos Display" w:cstheme="majorBidi"/>
       <w:color w:val="13458B"/>
@@ -13700,7 +15239,7 @@
     <w:link w:val="Ttulo3"/>
     <w:uiPriority w:val="9"/>
     <w:semiHidden/>
-    <w:rsid w:val="00101272"/>
+    <w:rsid w:val="00C74280"/>
     <w:rPr>
       <w:rFonts w:ascii="Aptos Display" w:eastAsiaTheme="majorEastAsia" w:hAnsi="Aptos Display" w:cstheme="majorBidi"/>
       <w:color w:val="13458B"/>
@@ -13714,7 +15253,7 @@
     <w:link w:val="Ttulo4"/>
     <w:uiPriority w:val="9"/>
     <w:semiHidden/>
-    <w:rsid w:val="00101272"/>
+    <w:rsid w:val="00C74280"/>
     <w:rPr>
       <w:rFonts w:eastAsiaTheme="majorEastAsia" w:cstheme="majorBidi"/>
       <w:i/>
@@ -13728,7 +15267,7 @@
     <w:link w:val="Ttulo5"/>
     <w:uiPriority w:val="9"/>
     <w:semiHidden/>
-    <w:rsid w:val="00101272"/>
+    <w:rsid w:val="00C74280"/>
     <w:rPr>
       <w:rFonts w:eastAsiaTheme="majorEastAsia" w:cstheme="majorBidi"/>
       <w:color w:val="0F4761" w:themeColor="accent1" w:themeShade="BF"/>
@@ -13740,7 +15279,7 @@
     <w:link w:val="Ttulo6"/>
     <w:uiPriority w:val="9"/>
     <w:semiHidden/>
-    <w:rsid w:val="00101272"/>
+    <w:rsid w:val="00C74280"/>
     <w:rPr>
       <w:rFonts w:eastAsiaTheme="majorEastAsia" w:cstheme="majorBidi"/>
       <w:i/>
@@ -13754,7 +15293,7 @@
     <w:link w:val="Ttulo7"/>
     <w:uiPriority w:val="9"/>
     <w:semiHidden/>
-    <w:rsid w:val="00101272"/>
+    <w:rsid w:val="00C74280"/>
     <w:rPr>
       <w:rFonts w:eastAsiaTheme="majorEastAsia" w:cstheme="majorBidi"/>
       <w:color w:val="595959" w:themeColor="text1" w:themeTint="A6"/>
@@ -13766,7 +15305,7 @@
     <w:link w:val="Ttulo8"/>
     <w:uiPriority w:val="9"/>
     <w:semiHidden/>
-    <w:rsid w:val="00101272"/>
+    <w:rsid w:val="00C74280"/>
     <w:rPr>
       <w:rFonts w:eastAsiaTheme="majorEastAsia" w:cstheme="majorBidi"/>
       <w:i/>
@@ -13780,7 +15319,7 @@
     <w:link w:val="Ttulo9"/>
     <w:uiPriority w:val="9"/>
     <w:semiHidden/>
-    <w:rsid w:val="00101272"/>
+    <w:rsid w:val="00C74280"/>
     <w:rPr>
       <w:rFonts w:eastAsiaTheme="majorEastAsia" w:cstheme="majorBidi"/>
       <w:color w:val="272727" w:themeColor="text1" w:themeTint="D8"/>
@@ -13793,7 +15332,7 @@
     <w:link w:val="TtuloCar"/>
     <w:uiPriority w:val="10"/>
     <w:qFormat/>
-    <w:rsid w:val="00101272"/>
+    <w:rsid w:val="00C74280"/>
     <w:pPr>
       <w:spacing w:after="80"/>
       <w:contextualSpacing/>
@@ -13812,7 +15351,7 @@
     <w:basedOn w:val="Fuentedeprrafopredeter"/>
     <w:link w:val="Ttulo"/>
     <w:uiPriority w:val="10"/>
-    <w:rsid w:val="00101272"/>
+    <w:rsid w:val="00C74280"/>
     <w:rPr>
       <w:rFonts w:ascii="Aptos Display" w:eastAsiaTheme="majorEastAsia" w:hAnsi="Aptos Display" w:cstheme="majorBidi"/>
       <w:color w:val="13458B"/>
@@ -13829,7 +15368,7 @@
     <w:link w:val="SubttuloCar"/>
     <w:uiPriority w:val="11"/>
     <w:qFormat/>
-    <w:rsid w:val="00101272"/>
+    <w:rsid w:val="00C74280"/>
     <w:pPr>
       <w:numPr>
         <w:ilvl w:val="1"/>
@@ -13848,7 +15387,7 @@
     <w:basedOn w:val="Fuentedeprrafopredeter"/>
     <w:link w:val="Subttulo"/>
     <w:uiPriority w:val="11"/>
-    <w:rsid w:val="00101272"/>
+    <w:rsid w:val="00C74280"/>
     <w:rPr>
       <w:rFonts w:eastAsiaTheme="majorEastAsia" w:cstheme="majorBidi"/>
       <w:color w:val="595959" w:themeColor="text1" w:themeTint="A6"/>
@@ -13864,7 +15403,7 @@
     <w:link w:val="CitaCar"/>
     <w:uiPriority w:val="29"/>
     <w:qFormat/>
-    <w:rsid w:val="00101272"/>
+    <w:rsid w:val="00C74280"/>
     <w:pPr>
       <w:spacing w:before="160"/>
       <w:jc w:val="center"/>
@@ -13880,7 +15419,7 @@
     <w:basedOn w:val="Fuentedeprrafopredeter"/>
     <w:link w:val="Cita"/>
     <w:uiPriority w:val="29"/>
-    <w:rsid w:val="00101272"/>
+    <w:rsid w:val="00C74280"/>
     <w:rPr>
       <w:i/>
       <w:iCs/>
@@ -13892,7 +15431,7 @@
     <w:basedOn w:val="Normal"/>
     <w:uiPriority w:val="34"/>
     <w:qFormat/>
-    <w:rsid w:val="00101272"/>
+    <w:rsid w:val="00C74280"/>
     <w:pPr>
       <w:ind w:left="720"/>
       <w:contextualSpacing/>
@@ -13903,7 +15442,7 @@
     <w:basedOn w:val="Fuentedeprrafopredeter"/>
     <w:uiPriority w:val="21"/>
     <w:qFormat/>
-    <w:rsid w:val="00101272"/>
+    <w:rsid w:val="00C74280"/>
     <w:rPr>
       <w:i/>
       <w:iCs/>
@@ -13917,7 +15456,7 @@
     <w:link w:val="CitadestacadaCar"/>
     <w:uiPriority w:val="30"/>
     <w:qFormat/>
-    <w:rsid w:val="00101272"/>
+    <w:rsid w:val="00C74280"/>
     <w:pPr>
       <w:pBdr>
         <w:top w:val="single" w:sz="4" w:space="10" w:color="0F4761" w:themeColor="accent1" w:themeShade="BF"/>
@@ -13938,7 +15477,7 @@
     <w:basedOn w:val="Fuentedeprrafopredeter"/>
     <w:link w:val="Citadestacada"/>
     <w:uiPriority w:val="30"/>
-    <w:rsid w:val="00101272"/>
+    <w:rsid w:val="00C74280"/>
     <w:rPr>
       <w:i/>
       <w:iCs/>
@@ -13950,7 +15489,7 @@
     <w:basedOn w:val="Fuentedeprrafopredeter"/>
     <w:uiPriority w:val="32"/>
     <w:qFormat/>
-    <w:rsid w:val="00101272"/>
+    <w:rsid w:val="00C74280"/>
     <w:rPr>
       <w:b/>
       <w:bCs/>
@@ -13965,7 +15504,7 @@
     <w:link w:val="EncabezadoCar"/>
     <w:uiPriority w:val="99"/>
     <w:unhideWhenUsed/>
-    <w:rsid w:val="00101272"/>
+    <w:rsid w:val="00C74280"/>
     <w:pPr>
       <w:tabs>
         <w:tab w:val="center" w:pos="4419"/>
@@ -13979,7 +15518,7 @@
     <w:basedOn w:val="Fuentedeprrafopredeter"/>
     <w:link w:val="Encabezado"/>
     <w:uiPriority w:val="99"/>
-    <w:rsid w:val="00101272"/>
+    <w:rsid w:val="00C74280"/>
     <w:rPr>
       <w:rFonts w:ascii="Aptos" w:hAnsi="Aptos"/>
       <w:sz w:val="20"/>
@@ -13991,7 +15530,7 @@
     <w:link w:val="PiedepginaCar"/>
     <w:uiPriority w:val="99"/>
     <w:unhideWhenUsed/>
-    <w:rsid w:val="00101272"/>
+    <w:rsid w:val="00C74280"/>
     <w:pPr>
       <w:tabs>
         <w:tab w:val="center" w:pos="4419"/>
@@ -14005,7 +15544,7 @@
     <w:basedOn w:val="Fuentedeprrafopredeter"/>
     <w:link w:val="Piedepgina"/>
     <w:uiPriority w:val="99"/>
-    <w:rsid w:val="00101272"/>
+    <w:rsid w:val="00C74280"/>
     <w:rPr>
       <w:rFonts w:ascii="Aptos" w:hAnsi="Aptos"/>
       <w:sz w:val="20"/>
@@ -14016,7 +15555,7 @@
     <w:basedOn w:val="Normal"/>
     <w:uiPriority w:val="99"/>
     <w:unhideWhenUsed/>
-    <w:rsid w:val="00101272"/>
+    <w:rsid w:val="00C74280"/>
     <w:pPr>
       <w:numPr>
         <w:numId w:val="1"/>

</xml_diff>

<commit_message>
feat: close Sprint 3 with Docker E2E evidence
</commit_message>
<xml_diff>
--- a/docs/project-management/SEISMIK_CONTROL_AVANCE_v0.1.docx
+++ b/docs/project-management/SEISMIK_CONTROL_AVANCE_v0.1.docx
@@ -12,17 +12,17 @@
     </w:p>
     <w:p>
       <w:r>
-        <w:t>Versión: 0.1.3</w:t>
+        <w:t>Versión: 0.1.4</w:t>
       </w:r>
     </w:p>
     <w:p>
       <w:r>
-        <w:t>Fecha de corte: 26 de agosto de 2026</w:t>
+        <w:t>Fecha de corte: 27 de agosto de 2026</w:t>
       </w:r>
     </w:p>
     <w:p>
       <w:r>
-        <w:t>Estado general: Alfa 0.1 — Sprint 3 en curso; E2E Docker pendiente de WSL 2</w:t>
+        <w:t>Estado general: Alfa 0.1 — Sprint 3 cerrado técnicamente; No-Go público</w:t>
       </w:r>
     </w:p>
     <w:p>
@@ -563,6 +563,104 @@
                 <w:sz w:val="17"/>
               </w:rPr>
               <w:t>Seguridad, bus y avance técnico del Sprint 3</w:t>
+            </w:r>
+          </w:p>
+        </w:tc>
+        <w:tc>
+          <w:tcPr>
+            <w:tcW w:w="0" w:type="auto"/>
+          </w:tcPr>
+          <w:p>
+            <w:pPr>
+              <w:rPr>
+                <w:sz w:val="17"/>
+              </w:rPr>
+            </w:pPr>
+            <w:r>
+              <w:rPr>
+                <w:sz w:val="17"/>
+              </w:rPr>
+              <w:t>Activo</w:t>
+            </w:r>
+          </w:p>
+        </w:tc>
+      </w:tr>
+      <w:tr>
+        <w:tblPrEx>
+          <w:tblCellMar>
+            <w:top w:w="0" w:type="dxa"/>
+            <w:bottom w:w="0" w:type="dxa"/>
+          </w:tblCellMar>
+        </w:tblPrEx>
+        <w:tc>
+          <w:tcPr>
+            <w:tcW w:w="0" w:type="auto"/>
+          </w:tcPr>
+          <w:p>
+            <w:pPr>
+              <w:rPr>
+                <w:sz w:val="17"/>
+              </w:rPr>
+            </w:pPr>
+            <w:r>
+              <w:rPr>
+                <w:sz w:val="17"/>
+              </w:rPr>
+              <w:t>0.1.4</w:t>
+            </w:r>
+          </w:p>
+        </w:tc>
+        <w:tc>
+          <w:tcPr>
+            <w:tcW w:w="0" w:type="auto"/>
+          </w:tcPr>
+          <w:p>
+            <w:pPr>
+              <w:rPr>
+                <w:sz w:val="17"/>
+              </w:rPr>
+            </w:pPr>
+            <w:r>
+              <w:rPr>
+                <w:sz w:val="17"/>
+              </w:rPr>
+              <w:t>2026-08-27</w:t>
+            </w:r>
+          </w:p>
+        </w:tc>
+        <w:tc>
+          <w:tcPr>
+            <w:tcW w:w="0" w:type="auto"/>
+          </w:tcPr>
+          <w:p>
+            <w:pPr>
+              <w:rPr>
+                <w:sz w:val="17"/>
+              </w:rPr>
+            </w:pPr>
+            <w:r>
+              <w:rPr>
+                <w:sz w:val="17"/>
+              </w:rPr>
+              <w:t>Codex</w:t>
+            </w:r>
+          </w:p>
+        </w:tc>
+        <w:tc>
+          <w:tcPr>
+            <w:tcW w:w="0" w:type="auto"/>
+          </w:tcPr>
+          <w:p>
+            <w:pPr>
+              <w:rPr>
+                <w:sz w:val="17"/>
+              </w:rPr>
+            </w:pPr>
+            <w:r>
+              <w:rPr>
+                <w:sz w:val="17"/>
+              </w:rPr>
+              <w:t>E2E Docker real y cierre técnico del Sprint 3</w:t>
             </w:r>
           </w:p>
         </w:tc>
@@ -1297,7 +1395,7 @@
               <w:rPr>
                 <w:sz w:val="17"/>
               </w:rPr>
-              <w:t>2 de 8 cerrados técnicamente</w:t>
+              <w:t>3 de 8 cerrados técnicamente</w:t>
             </w:r>
           </w:p>
         </w:tc>
@@ -1351,7 +1449,7 @@
               <w:rPr>
                 <w:sz w:val="17"/>
               </w:rPr>
-              <w:t>Informes Sprint 1 y 2</w:t>
+              <w:t>Informes Sprint 1, 2 y 3</w:t>
             </w:r>
           </w:p>
         </w:tc>
@@ -1645,7 +1743,7 @@
               <w:rPr>
                 <w:sz w:val="17"/>
               </w:rPr>
-              <w:t>Entorno local 2026-08-26</w:t>
+              <w:t>Entorno local 2026-08-27</w:t>
             </w:r>
           </w:p>
         </w:tc>
@@ -1769,6 +1867,7 @@
               <w:rPr>
                 <w:sz w:val="17"/>
               </w:rPr>
+              <w:lastRenderedPageBreak/>
               <w:t>URL móvil real</w:t>
             </w:r>
           </w:p>
@@ -1867,7 +1966,6 @@
               <w:rPr>
                 <w:sz w:val="17"/>
               </w:rPr>
-              <w:lastRenderedPageBreak/>
               <w:t>Operación en sombra</w:t>
             </w:r>
           </w:p>
@@ -2000,17 +2098,9 @@
             </w:pPr>
             <w:r>
               <w:rPr>
-                <w:rFonts w:hint="eastAsia"/>
-                <w:sz w:val="17"/>
-              </w:rPr>
-              <w:t>≤</w:t>
-            </w:r>
-            <w:r>
-              <w:rPr>
-                <w:rFonts w:hint="eastAsia"/>
-                <w:sz w:val="17"/>
-              </w:rPr>
-              <w:t>150.000 COP/mes</w:t>
+                <w:sz w:val="17"/>
+              </w:rPr>
+              <w:t>≤150.000 COP/mes</w:t>
             </w:r>
           </w:p>
         </w:tc>
@@ -4096,6 +4186,7 @@
               <w:rPr>
                 <w:sz w:val="17"/>
               </w:rPr>
+              <w:lastRenderedPageBreak/>
               <w:t>S1-05</w:t>
             </w:r>
           </w:p>
@@ -4212,7 +4303,6 @@
               <w:rPr>
                 <w:sz w:val="17"/>
               </w:rPr>
-              <w:lastRenderedPageBreak/>
               <w:t>S1-06</w:t>
             </w:r>
           </w:p>
@@ -5218,12 +5308,12 @@
         <w:tblLook w:val="0000" w:firstRow="0" w:lastRow="0" w:firstColumn="0" w:lastColumn="0" w:noHBand="0" w:noVBand="0"/>
       </w:tblPr>
       <w:tblGrid>
-        <w:gridCol w:w="486"/>
-        <w:gridCol w:w="1940"/>
-        <w:gridCol w:w="1735"/>
-        <w:gridCol w:w="843"/>
-        <w:gridCol w:w="1629"/>
-        <w:gridCol w:w="3334"/>
+        <w:gridCol w:w="497"/>
+        <w:gridCol w:w="1996"/>
+        <w:gridCol w:w="1806"/>
+        <w:gridCol w:w="862"/>
+        <w:gridCol w:w="1708"/>
+        <w:gridCol w:w="3098"/>
       </w:tblGrid>
       <w:tr>
         <w:tblPrEx>
@@ -6029,58 +6119,43 @@
               <w:rPr>
                 <w:sz w:val="17"/>
               </w:rPr>
-              <w:t>ER</w:t>
-            </w:r>
-          </w:p>
-        </w:tc>
-        <w:tc>
-          <w:tcPr>
-            <w:tcW w:w="0" w:type="auto"/>
-          </w:tcPr>
-          <w:p>
-            <w:pPr>
-              <w:rPr>
-                <w:sz w:val="17"/>
-              </w:rPr>
-            </w:pPr>
-            <w:r>
-              <w:rPr>
-                <w:rFonts w:hint="eastAsia"/>
-                <w:sz w:val="17"/>
-              </w:rPr>
-              <w:t xml:space="preserve">Replay </w:t>
-            </w:r>
-            <w:r>
-              <w:rPr>
-                <w:rFonts w:hint="eastAsia"/>
-                <w:sz w:val="17"/>
-              </w:rPr>
-              <w:t>→</w:t>
-            </w:r>
-            <w:r>
-              <w:rPr>
-                <w:rFonts w:hint="eastAsia"/>
-                <w:sz w:val="17"/>
-              </w:rPr>
-              <w:t xml:space="preserve"> payload TEST</w:t>
-            </w:r>
-          </w:p>
-        </w:tc>
-        <w:tc>
-          <w:tcPr>
-            <w:tcW w:w="0" w:type="auto"/>
-          </w:tcPr>
-          <w:p>
-            <w:pPr>
-              <w:rPr>
-                <w:sz w:val="17"/>
-              </w:rPr>
-            </w:pPr>
-            <w:r>
-              <w:rPr>
-                <w:sz w:val="17"/>
-              </w:rPr>
-              <w:t>E2E en memoria aprobado; Compose pendiente</w:t>
+              <w:t>CO</w:t>
+            </w:r>
+          </w:p>
+        </w:tc>
+        <w:tc>
+          <w:tcPr>
+            <w:tcW w:w="0" w:type="auto"/>
+          </w:tcPr>
+          <w:p>
+            <w:pPr>
+              <w:rPr>
+                <w:sz w:val="17"/>
+              </w:rPr>
+            </w:pPr>
+            <w:r>
+              <w:rPr>
+                <w:sz w:val="17"/>
+              </w:rPr>
+              <w:t>Replay → payload TEST</w:t>
+            </w:r>
+          </w:p>
+        </w:tc>
+        <w:tc>
+          <w:tcPr>
+            <w:tcW w:w="0" w:type="auto"/>
+          </w:tcPr>
+          <w:p>
+            <w:pPr>
+              <w:rPr>
+                <w:sz w:val="17"/>
+              </w:rPr>
+            </w:pPr>
+            <w:r>
+              <w:rPr>
+                <w:sz w:val="17"/>
+              </w:rPr>
+              <w:t>docs/evidence/sprint3-docker-e2e.json</w:t>
             </w:r>
           </w:p>
         </w:tc>
@@ -6208,6 +6283,7 @@
         <w:pStyle w:val="Ttulo1"/>
       </w:pPr>
       <w:r>
+        <w:lastRenderedPageBreak/>
         <w:t>4. Registro maestro de entregables</w:t>
       </w:r>
     </w:p>
@@ -6230,13 +6306,13 @@
         <w:tblLook w:val="0000" w:firstRow="0" w:lastRow="0" w:firstColumn="0" w:lastColumn="0" w:noHBand="0" w:noVBand="0"/>
       </w:tblPr>
       <w:tblGrid>
-        <w:gridCol w:w="703"/>
-        <w:gridCol w:w="1370"/>
+        <w:gridCol w:w="698"/>
+        <w:gridCol w:w="1286"/>
         <w:gridCol w:w="609"/>
-        <w:gridCol w:w="1176"/>
+        <w:gridCol w:w="1167"/>
         <w:gridCol w:w="675"/>
-        <w:gridCol w:w="1673"/>
-        <w:gridCol w:w="3761"/>
+        <w:gridCol w:w="1616"/>
+        <w:gridCol w:w="3916"/>
       </w:tblGrid>
       <w:tr>
         <w:tblPrEx>
@@ -6565,7 +6641,6 @@
               <w:rPr>
                 <w:sz w:val="17"/>
               </w:rPr>
-              <w:lastRenderedPageBreak/>
               <w:t>ENT-002</w:t>
             </w:r>
           </w:p>
@@ -7040,43 +7115,43 @@
               <w:rPr>
                 <w:sz w:val="17"/>
               </w:rPr>
-              <w:t>ER</w:t>
-            </w:r>
-          </w:p>
-        </w:tc>
-        <w:tc>
-          <w:tcPr>
-            <w:tcW w:w="0" w:type="auto"/>
-          </w:tcPr>
-          <w:p>
-            <w:pPr>
-              <w:rPr>
-                <w:sz w:val="17"/>
-              </w:rPr>
-            </w:pPr>
-            <w:r>
-              <w:rPr>
-                <w:sz w:val="17"/>
-              </w:rPr>
-              <w:t>E2E en memoria aprobado; falta Compose real</w:t>
-            </w:r>
-          </w:p>
-        </w:tc>
-        <w:tc>
-          <w:tcPr>
-            <w:tcW w:w="0" w:type="auto"/>
-          </w:tcPr>
-          <w:p>
-            <w:pPr>
-              <w:rPr>
-                <w:sz w:val="17"/>
-              </w:rPr>
-            </w:pPr>
-            <w:r>
-              <w:rPr>
-                <w:sz w:val="17"/>
-              </w:rPr>
-              <w:t>Tests y SPRINT_3_AVANCE_2026-08-26.md</w:t>
+              <w:t>CO</w:t>
+            </w:r>
+          </w:p>
+        </w:tc>
+        <w:tc>
+          <w:tcPr>
+            <w:tcW w:w="0" w:type="auto"/>
+          </w:tcPr>
+          <w:p>
+            <w:pPr>
+              <w:rPr>
+                <w:sz w:val="17"/>
+              </w:rPr>
+            </w:pPr>
+            <w:r>
+              <w:rPr>
+                <w:sz w:val="17"/>
+              </w:rPr>
+              <w:t>E2E Docker real, duplicado suprimido y cero push externo</w:t>
+            </w:r>
+          </w:p>
+        </w:tc>
+        <w:tc>
+          <w:tcPr>
+            <w:tcW w:w="0" w:type="auto"/>
+          </w:tcPr>
+          <w:p>
+            <w:pPr>
+              <w:rPr>
+                <w:sz w:val="17"/>
+              </w:rPr>
+            </w:pPr>
+            <w:r>
+              <w:rPr>
+                <w:sz w:val="17"/>
+              </w:rPr>
+              <w:t>Evidencia JSON y SPRINT_3_CIERRE_TECNICO_2026-08-27.md</w:t>
             </w:r>
           </w:p>
         </w:tc>
@@ -8968,6 +9043,7 @@
               <w:rPr>
                 <w:sz w:val="17"/>
               </w:rPr>
+              <w:lastRenderedPageBreak/>
               <w:t>R-02</w:t>
             </w:r>
           </w:p>
@@ -9424,7 +9500,6 @@
               <w:rPr>
                 <w:sz w:val="17"/>
               </w:rPr>
-              <w:lastRenderedPageBreak/>
               <w:t>R-05</w:t>
             </w:r>
           </w:p>
@@ -11995,13 +12070,13 @@
         <w:tblLook w:val="0000" w:firstRow="0" w:lastRow="0" w:firstColumn="0" w:lastColumn="0" w:noHBand="0" w:noVBand="0"/>
       </w:tblPr>
       <w:tblGrid>
-        <w:gridCol w:w="532"/>
+        <w:gridCol w:w="536"/>
         <w:gridCol w:w="961"/>
-        <w:gridCol w:w="1773"/>
-        <w:gridCol w:w="1758"/>
-        <w:gridCol w:w="1360"/>
-        <w:gridCol w:w="2276"/>
-        <w:gridCol w:w="1307"/>
+        <w:gridCol w:w="1795"/>
+        <w:gridCol w:w="1693"/>
+        <w:gridCol w:w="1368"/>
+        <w:gridCol w:w="2303"/>
+        <w:gridCol w:w="1311"/>
       </w:tblGrid>
       <w:tr>
         <w:tblPrEx>
@@ -12902,79 +12977,79 @@
               <w:rPr>
                 <w:sz w:val="17"/>
               </w:rPr>
-              <w:t>WSL 2 no está habilitado</w:t>
-            </w:r>
-          </w:p>
-        </w:tc>
-        <w:tc>
-          <w:tcPr>
-            <w:tcW w:w="0" w:type="auto"/>
-          </w:tcPr>
-          <w:p>
-            <w:pPr>
-              <w:rPr>
-                <w:sz w:val="17"/>
-              </w:rPr>
-            </w:pPr>
-            <w:r>
-              <w:rPr>
-                <w:sz w:val="17"/>
-              </w:rPr>
-              <w:t>Docker daemon no inicia; E2E Compose pendiente</w:t>
-            </w:r>
-          </w:p>
-        </w:tc>
-        <w:tc>
-          <w:tcPr>
-            <w:tcW w:w="0" w:type="auto"/>
-          </w:tcPr>
-          <w:p>
-            <w:pPr>
-              <w:rPr>
-                <w:sz w:val="17"/>
-              </w:rPr>
-            </w:pPr>
-            <w:r>
-              <w:rPr>
-                <w:sz w:val="17"/>
-              </w:rPr>
-              <w:t>Product Owner</w:t>
-            </w:r>
-          </w:p>
-        </w:tc>
-        <w:tc>
-          <w:tcPr>
-            <w:tcW w:w="0" w:type="auto"/>
-          </w:tcPr>
-          <w:p>
-            <w:pPr>
-              <w:rPr>
-                <w:sz w:val="17"/>
-              </w:rPr>
-            </w:pPr>
-            <w:r>
-              <w:rPr>
-                <w:sz w:val="17"/>
-              </w:rPr>
-              <w:t>Ejecutar wsl --install como administrador y reiniciar</w:t>
-            </w:r>
-          </w:p>
-        </w:tc>
-        <w:tc>
-          <w:tcPr>
-            <w:tcW w:w="0" w:type="auto"/>
-          </w:tcPr>
-          <w:p>
-            <w:pPr>
-              <w:rPr>
-                <w:sz w:val="17"/>
-              </w:rPr>
-            </w:pPr>
-            <w:r>
-              <w:rPr>
-                <w:sz w:val="17"/>
-              </w:rPr>
-              <w:t>Abierto</w:t>
+              <w:t>WSL 2 no estaba habilitado</w:t>
+            </w:r>
+          </w:p>
+        </w:tc>
+        <w:tc>
+          <w:tcPr>
+            <w:tcW w:w="0" w:type="auto"/>
+          </w:tcPr>
+          <w:p>
+            <w:pPr>
+              <w:rPr>
+                <w:sz w:val="17"/>
+              </w:rPr>
+            </w:pPr>
+            <w:r>
+              <w:rPr>
+                <w:sz w:val="17"/>
+              </w:rPr>
+              <w:t>Docker daemon no iniciaba</w:t>
+            </w:r>
+          </w:p>
+        </w:tc>
+        <w:tc>
+          <w:tcPr>
+            <w:tcW w:w="0" w:type="auto"/>
+          </w:tcPr>
+          <w:p>
+            <w:pPr>
+              <w:rPr>
+                <w:sz w:val="17"/>
+              </w:rPr>
+            </w:pPr>
+            <w:r>
+              <w:rPr>
+                <w:sz w:val="17"/>
+              </w:rPr>
+              <w:t>Product Owner + Codex</w:t>
+            </w:r>
+          </w:p>
+        </w:tc>
+        <w:tc>
+          <w:tcPr>
+            <w:tcW w:w="0" w:type="auto"/>
+          </w:tcPr>
+          <w:p>
+            <w:pPr>
+              <w:rPr>
+                <w:sz w:val="17"/>
+              </w:rPr>
+            </w:pPr>
+            <w:r>
+              <w:rPr>
+                <w:sz w:val="17"/>
+              </w:rPr>
+              <w:t>WSL 2 habilitado; runtime Docker reparado y E2E ejecutado</w:t>
+            </w:r>
+          </w:p>
+        </w:tc>
+        <w:tc>
+          <w:tcPr>
+            <w:tcW w:w="0" w:type="auto"/>
+          </w:tcPr>
+          <w:p>
+            <w:pPr>
+              <w:rPr>
+                <w:sz w:val="17"/>
+              </w:rPr>
+            </w:pPr>
+            <w:r>
+              <w:rPr>
+                <w:sz w:val="17"/>
+              </w:rPr>
+              <w:t>Resuelto 2026-08-27</w:t>
             </w:r>
           </w:p>
         </w:tc>
@@ -13593,63 +13668,9 @@
     <w:p>
       <w:pPr>
         <w:pStyle w:val="Listaconvietas"/>
-        <w:rPr>
-          <w:rFonts w:hint="eastAsia"/>
-        </w:rPr>
       </w:pPr>
       <w:r>
-        <w:rPr>
-          <w:rFonts w:hint="eastAsia"/>
-        </w:rPr>
-        <w:t xml:space="preserve">[ ] Pipeline replay </w:t>
-      </w:r>
-      <w:r>
-        <w:rPr>
-          <w:rFonts w:hint="eastAsia"/>
-        </w:rPr>
-        <w:t>→</w:t>
-      </w:r>
-      <w:r>
-        <w:rPr>
-          <w:rFonts w:hint="eastAsia"/>
-        </w:rPr>
-        <w:t xml:space="preserve"> candidato </w:t>
-      </w:r>
-      <w:r>
-        <w:rPr>
-          <w:rFonts w:hint="eastAsia"/>
-        </w:rPr>
-        <w:t>→</w:t>
-      </w:r>
-      <w:r>
-        <w:rPr>
-          <w:rFonts w:hint="eastAsia"/>
-        </w:rPr>
-        <w:t xml:space="preserve"> API </w:t>
-      </w:r>
-      <w:r>
-        <w:rPr>
-          <w:rFonts w:hint="eastAsia"/>
-        </w:rPr>
-        <w:t>→</w:t>
-      </w:r>
-      <w:r>
-        <w:rPr>
-          <w:rFonts w:hint="eastAsia"/>
-        </w:rPr>
-        <w:t xml:space="preserve"> bus </w:t>
-      </w:r>
-      <w:r>
-        <w:rPr>
-          <w:rFonts w:hint="eastAsia"/>
-        </w:rPr>
-        <w:t>→</w:t>
-      </w:r>
-      <w:r>
-        <w:rPr>
-          <w:rFonts w:hint="eastAsia"/>
-        </w:rPr>
-        <w:t xml:space="preserve"> push TEST demostrado.</w:t>
+        <w:t>[x] Pipeline replay → candidato → API → bus → push TEST demostrado.</w:t>
       </w:r>
     </w:p>
     <w:p>
@@ -14527,7 +14548,7 @@
         <w:color w:val="808080"/>
         <w:sz w:val="16"/>
       </w:rPr>
-      <w:t>Seismik | Control de Avance | v0.1.3</w:t>
+      <w:t>Seismik | Control de Avance | v0.1.4</w:t>
     </w:r>
   </w:p>
 </w:hdr>
@@ -14548,7 +14569,7 @@
   <w:abstractNum w:abstractNumId="0" w15:restartNumberingAfterBreak="0">
     <w:nsid w:val="FFFFFF89"/>
     <w:multiLevelType w:val="singleLevel"/>
-    <w:tmpl w:val="3382498E"/>
+    <w:tmpl w:val="2B4C8062"/>
     <w:lvl w:ilvl="0">
       <w:start w:val="1"/>
       <w:numFmt w:val="bullet"/>
@@ -14566,7 +14587,7 @@
       </w:rPr>
     </w:lvl>
   </w:abstractNum>
-  <w:num w:numId="1" w16cid:durableId="1227109222">
+  <w:num w:numId="1" w16cid:durableId="944268792">
     <w:abstractNumId w:val="0"/>
   </w:num>
 </w:numbering>
@@ -14577,11 +14598,11 @@
   <w:docDefaults>
     <w:rPrDefault>
       <w:rPr>
-        <w:rFonts w:asciiTheme="minorHAnsi" w:eastAsiaTheme="minorEastAsia" w:hAnsiTheme="minorHAnsi" w:cstheme="minorBidi"/>
+        <w:rFonts w:asciiTheme="minorHAnsi" w:eastAsiaTheme="minorHAnsi" w:hAnsiTheme="minorHAnsi" w:cstheme="minorBidi"/>
         <w:kern w:val="2"/>
         <w:sz w:val="24"/>
         <w:szCs w:val="24"/>
-        <w:lang w:val="es-CO" w:eastAsia="ko-KR" w:bidi="ar-SA"/>
+        <w:lang w:val="es-CO" w:eastAsia="en-US" w:bidi="ar-SA"/>
         <w14:ligatures w14:val="standardContextual"/>
       </w:rPr>
     </w:rPrDefault>
@@ -14987,7 +15008,7 @@
     <w:link w:val="Ttulo1Car"/>
     <w:uiPriority w:val="9"/>
     <w:qFormat/>
-    <w:rsid w:val="00C74280"/>
+    <w:rsid w:val="0013610D"/>
     <w:pPr>
       <w:keepNext/>
       <w:keepLines/>
@@ -15010,7 +15031,7 @@
     <w:semiHidden/>
     <w:unhideWhenUsed/>
     <w:qFormat/>
-    <w:rsid w:val="00C74280"/>
+    <w:rsid w:val="0013610D"/>
     <w:pPr>
       <w:keepNext/>
       <w:keepLines/>
@@ -15033,7 +15054,7 @@
     <w:semiHidden/>
     <w:unhideWhenUsed/>
     <w:qFormat/>
-    <w:rsid w:val="00C74280"/>
+    <w:rsid w:val="0013610D"/>
     <w:pPr>
       <w:keepNext/>
       <w:keepLines/>
@@ -15056,7 +15077,7 @@
     <w:semiHidden/>
     <w:unhideWhenUsed/>
     <w:qFormat/>
-    <w:rsid w:val="00C74280"/>
+    <w:rsid w:val="0013610D"/>
     <w:pPr>
       <w:keepNext/>
       <w:keepLines/>
@@ -15079,7 +15100,7 @@
     <w:semiHidden/>
     <w:unhideWhenUsed/>
     <w:qFormat/>
-    <w:rsid w:val="00C74280"/>
+    <w:rsid w:val="0013610D"/>
     <w:pPr>
       <w:keepNext/>
       <w:keepLines/>
@@ -15100,7 +15121,7 @@
     <w:semiHidden/>
     <w:unhideWhenUsed/>
     <w:qFormat/>
-    <w:rsid w:val="00C74280"/>
+    <w:rsid w:val="0013610D"/>
     <w:pPr>
       <w:keepNext/>
       <w:keepLines/>
@@ -15123,7 +15144,7 @@
     <w:semiHidden/>
     <w:unhideWhenUsed/>
     <w:qFormat/>
-    <w:rsid w:val="00C74280"/>
+    <w:rsid w:val="0013610D"/>
     <w:pPr>
       <w:keepNext/>
       <w:keepLines/>
@@ -15144,7 +15165,7 @@
     <w:semiHidden/>
     <w:unhideWhenUsed/>
     <w:qFormat/>
-    <w:rsid w:val="00C74280"/>
+    <w:rsid w:val="0013610D"/>
     <w:pPr>
       <w:keepNext/>
       <w:keepLines/>
@@ -15167,7 +15188,7 @@
     <w:semiHidden/>
     <w:unhideWhenUsed/>
     <w:qFormat/>
-    <w:rsid w:val="00C74280"/>
+    <w:rsid w:val="0013610D"/>
     <w:pPr>
       <w:keepNext/>
       <w:keepLines/>
@@ -15211,7 +15232,7 @@
     <w:basedOn w:val="Fuentedeprrafopredeter"/>
     <w:link w:val="Ttulo1"/>
     <w:uiPriority w:val="9"/>
-    <w:rsid w:val="00C74280"/>
+    <w:rsid w:val="0013610D"/>
     <w:rPr>
       <w:rFonts w:ascii="Aptos Display" w:eastAsiaTheme="majorEastAsia" w:hAnsi="Aptos Display" w:cstheme="majorBidi"/>
       <w:color w:val="13458B"/>
@@ -15225,7 +15246,7 @@
     <w:link w:val="Ttulo2"/>
     <w:uiPriority w:val="9"/>
     <w:semiHidden/>
-    <w:rsid w:val="00C74280"/>
+    <w:rsid w:val="0013610D"/>
     <w:rPr>
       <w:rFonts w:ascii="Aptos Display" w:eastAsiaTheme="majorEastAsia" w:hAnsi="Aptos Display" w:cstheme="majorBidi"/>
       <w:color w:val="13458B"/>
@@ -15239,7 +15260,7 @@
     <w:link w:val="Ttulo3"/>
     <w:uiPriority w:val="9"/>
     <w:semiHidden/>
-    <w:rsid w:val="00C74280"/>
+    <w:rsid w:val="0013610D"/>
     <w:rPr>
       <w:rFonts w:ascii="Aptos Display" w:eastAsiaTheme="majorEastAsia" w:hAnsi="Aptos Display" w:cstheme="majorBidi"/>
       <w:color w:val="13458B"/>
@@ -15253,7 +15274,7 @@
     <w:link w:val="Ttulo4"/>
     <w:uiPriority w:val="9"/>
     <w:semiHidden/>
-    <w:rsid w:val="00C74280"/>
+    <w:rsid w:val="0013610D"/>
     <w:rPr>
       <w:rFonts w:eastAsiaTheme="majorEastAsia" w:cstheme="majorBidi"/>
       <w:i/>
@@ -15267,7 +15288,7 @@
     <w:link w:val="Ttulo5"/>
     <w:uiPriority w:val="9"/>
     <w:semiHidden/>
-    <w:rsid w:val="00C74280"/>
+    <w:rsid w:val="0013610D"/>
     <w:rPr>
       <w:rFonts w:eastAsiaTheme="majorEastAsia" w:cstheme="majorBidi"/>
       <w:color w:val="0F4761" w:themeColor="accent1" w:themeShade="BF"/>
@@ -15279,7 +15300,7 @@
     <w:link w:val="Ttulo6"/>
     <w:uiPriority w:val="9"/>
     <w:semiHidden/>
-    <w:rsid w:val="00C74280"/>
+    <w:rsid w:val="0013610D"/>
     <w:rPr>
       <w:rFonts w:eastAsiaTheme="majorEastAsia" w:cstheme="majorBidi"/>
       <w:i/>
@@ -15293,7 +15314,7 @@
     <w:link w:val="Ttulo7"/>
     <w:uiPriority w:val="9"/>
     <w:semiHidden/>
-    <w:rsid w:val="00C74280"/>
+    <w:rsid w:val="0013610D"/>
     <w:rPr>
       <w:rFonts w:eastAsiaTheme="majorEastAsia" w:cstheme="majorBidi"/>
       <w:color w:val="595959" w:themeColor="text1" w:themeTint="A6"/>
@@ -15305,7 +15326,7 @@
     <w:link w:val="Ttulo8"/>
     <w:uiPriority w:val="9"/>
     <w:semiHidden/>
-    <w:rsid w:val="00C74280"/>
+    <w:rsid w:val="0013610D"/>
     <w:rPr>
       <w:rFonts w:eastAsiaTheme="majorEastAsia" w:cstheme="majorBidi"/>
       <w:i/>
@@ -15319,7 +15340,7 @@
     <w:link w:val="Ttulo9"/>
     <w:uiPriority w:val="9"/>
     <w:semiHidden/>
-    <w:rsid w:val="00C74280"/>
+    <w:rsid w:val="0013610D"/>
     <w:rPr>
       <w:rFonts w:eastAsiaTheme="majorEastAsia" w:cstheme="majorBidi"/>
       <w:color w:val="272727" w:themeColor="text1" w:themeTint="D8"/>
@@ -15332,7 +15353,7 @@
     <w:link w:val="TtuloCar"/>
     <w:uiPriority w:val="10"/>
     <w:qFormat/>
-    <w:rsid w:val="00C74280"/>
+    <w:rsid w:val="0013610D"/>
     <w:pPr>
       <w:spacing w:after="80"/>
       <w:contextualSpacing/>
@@ -15351,7 +15372,7 @@
     <w:basedOn w:val="Fuentedeprrafopredeter"/>
     <w:link w:val="Ttulo"/>
     <w:uiPriority w:val="10"/>
-    <w:rsid w:val="00C74280"/>
+    <w:rsid w:val="0013610D"/>
     <w:rPr>
       <w:rFonts w:ascii="Aptos Display" w:eastAsiaTheme="majorEastAsia" w:hAnsi="Aptos Display" w:cstheme="majorBidi"/>
       <w:color w:val="13458B"/>
@@ -15368,7 +15389,7 @@
     <w:link w:val="SubttuloCar"/>
     <w:uiPriority w:val="11"/>
     <w:qFormat/>
-    <w:rsid w:val="00C74280"/>
+    <w:rsid w:val="0013610D"/>
     <w:pPr>
       <w:numPr>
         <w:ilvl w:val="1"/>
@@ -15387,7 +15408,7 @@
     <w:basedOn w:val="Fuentedeprrafopredeter"/>
     <w:link w:val="Subttulo"/>
     <w:uiPriority w:val="11"/>
-    <w:rsid w:val="00C74280"/>
+    <w:rsid w:val="0013610D"/>
     <w:rPr>
       <w:rFonts w:eastAsiaTheme="majorEastAsia" w:cstheme="majorBidi"/>
       <w:color w:val="595959" w:themeColor="text1" w:themeTint="A6"/>
@@ -15403,7 +15424,7 @@
     <w:link w:val="CitaCar"/>
     <w:uiPriority w:val="29"/>
     <w:qFormat/>
-    <w:rsid w:val="00C74280"/>
+    <w:rsid w:val="0013610D"/>
     <w:pPr>
       <w:spacing w:before="160"/>
       <w:jc w:val="center"/>
@@ -15419,7 +15440,7 @@
     <w:basedOn w:val="Fuentedeprrafopredeter"/>
     <w:link w:val="Cita"/>
     <w:uiPriority w:val="29"/>
-    <w:rsid w:val="00C74280"/>
+    <w:rsid w:val="0013610D"/>
     <w:rPr>
       <w:i/>
       <w:iCs/>
@@ -15431,7 +15452,7 @@
     <w:basedOn w:val="Normal"/>
     <w:uiPriority w:val="34"/>
     <w:qFormat/>
-    <w:rsid w:val="00C74280"/>
+    <w:rsid w:val="0013610D"/>
     <w:pPr>
       <w:ind w:left="720"/>
       <w:contextualSpacing/>
@@ -15442,7 +15463,7 @@
     <w:basedOn w:val="Fuentedeprrafopredeter"/>
     <w:uiPriority w:val="21"/>
     <w:qFormat/>
-    <w:rsid w:val="00C74280"/>
+    <w:rsid w:val="0013610D"/>
     <w:rPr>
       <w:i/>
       <w:iCs/>
@@ -15456,7 +15477,7 @@
     <w:link w:val="CitadestacadaCar"/>
     <w:uiPriority w:val="30"/>
     <w:qFormat/>
-    <w:rsid w:val="00C74280"/>
+    <w:rsid w:val="0013610D"/>
     <w:pPr>
       <w:pBdr>
         <w:top w:val="single" w:sz="4" w:space="10" w:color="0F4761" w:themeColor="accent1" w:themeShade="BF"/>
@@ -15477,7 +15498,7 @@
     <w:basedOn w:val="Fuentedeprrafopredeter"/>
     <w:link w:val="Citadestacada"/>
     <w:uiPriority w:val="30"/>
-    <w:rsid w:val="00C74280"/>
+    <w:rsid w:val="0013610D"/>
     <w:rPr>
       <w:i/>
       <w:iCs/>
@@ -15489,7 +15510,7 @@
     <w:basedOn w:val="Fuentedeprrafopredeter"/>
     <w:uiPriority w:val="32"/>
     <w:qFormat/>
-    <w:rsid w:val="00C74280"/>
+    <w:rsid w:val="0013610D"/>
     <w:rPr>
       <w:b/>
       <w:bCs/>
@@ -15504,7 +15525,7 @@
     <w:link w:val="EncabezadoCar"/>
     <w:uiPriority w:val="99"/>
     <w:unhideWhenUsed/>
-    <w:rsid w:val="00C74280"/>
+    <w:rsid w:val="0013610D"/>
     <w:pPr>
       <w:tabs>
         <w:tab w:val="center" w:pos="4419"/>
@@ -15518,7 +15539,7 @@
     <w:basedOn w:val="Fuentedeprrafopredeter"/>
     <w:link w:val="Encabezado"/>
     <w:uiPriority w:val="99"/>
-    <w:rsid w:val="00C74280"/>
+    <w:rsid w:val="0013610D"/>
     <w:rPr>
       <w:rFonts w:ascii="Aptos" w:hAnsi="Aptos"/>
       <w:sz w:val="20"/>
@@ -15530,7 +15551,7 @@
     <w:link w:val="PiedepginaCar"/>
     <w:uiPriority w:val="99"/>
     <w:unhideWhenUsed/>
-    <w:rsid w:val="00C74280"/>
+    <w:rsid w:val="0013610D"/>
     <w:pPr>
       <w:tabs>
         <w:tab w:val="center" w:pos="4419"/>
@@ -15544,7 +15565,7 @@
     <w:basedOn w:val="Fuentedeprrafopredeter"/>
     <w:link w:val="Piedepgina"/>
     <w:uiPriority w:val="99"/>
-    <w:rsid w:val="00C74280"/>
+    <w:rsid w:val="0013610D"/>
     <w:rPr>
       <w:rFonts w:ascii="Aptos" w:hAnsi="Aptos"/>
       <w:sz w:val="20"/>
@@ -15555,7 +15576,7 @@
     <w:basedOn w:val="Normal"/>
     <w:uiPriority w:val="99"/>
     <w:unhideWhenUsed/>
-    <w:rsid w:val="00C74280"/>
+    <w:rsid w:val="0013610D"/>
     <w:pPr>
       <w:numPr>
         <w:numId w:val="1"/>

</xml_diff>

<commit_message>
feat: add Material You and per-event agency selection
</commit_message>
<xml_diff>
--- a/docs/project-management/SEISMIK_CONTROL_AVANCE_v0.1.docx
+++ b/docs/project-management/SEISMIK_CONTROL_AVANCE_v0.1.docx
@@ -12,7 +12,7 @@
     </w:p>
     <w:p>
       <w:r>
-        <w:t>Versión: 0.1.4</w:t>
+        <w:t>Versión: 0.1.5</w:t>
       </w:r>
     </w:p>
     <w:p>
@@ -22,7 +22,7 @@
     </w:p>
     <w:p>
       <w:r>
-        <w:t>Estado general: Alfa 0.1 — Sprint 3 cerrado técnicamente; No-Go público</w:t>
+        <w:t>Estado general: Alfa 0.1 — Sprint 4 en curso; No-Go público</w:t>
       </w:r>
     </w:p>
     <w:p>
@@ -683,6 +683,104 @@
           </w:p>
         </w:tc>
       </w:tr>
+      <w:tr>
+        <w:tblPrEx>
+          <w:tblCellMar>
+            <w:top w:w="0" w:type="dxa"/>
+            <w:bottom w:w="0" w:type="dxa"/>
+          </w:tblCellMar>
+        </w:tblPrEx>
+        <w:tc>
+          <w:tcPr>
+            <w:tcW w:w="0" w:type="auto"/>
+          </w:tcPr>
+          <w:p>
+            <w:pPr>
+              <w:rPr>
+                <w:sz w:val="17"/>
+              </w:rPr>
+            </w:pPr>
+            <w:r>
+              <w:rPr>
+                <w:sz w:val="17"/>
+              </w:rPr>
+              <w:t>0.1.5</w:t>
+            </w:r>
+          </w:p>
+        </w:tc>
+        <w:tc>
+          <w:tcPr>
+            <w:tcW w:w="0" w:type="auto"/>
+          </w:tcPr>
+          <w:p>
+            <w:pPr>
+              <w:rPr>
+                <w:sz w:val="17"/>
+              </w:rPr>
+            </w:pPr>
+            <w:r>
+              <w:rPr>
+                <w:sz w:val="17"/>
+              </w:rPr>
+              <w:t>2026-08-27</w:t>
+            </w:r>
+          </w:p>
+        </w:tc>
+        <w:tc>
+          <w:tcPr>
+            <w:tcW w:w="0" w:type="auto"/>
+          </w:tcPr>
+          <w:p>
+            <w:pPr>
+              <w:rPr>
+                <w:sz w:val="17"/>
+              </w:rPr>
+            </w:pPr>
+            <w:r>
+              <w:rPr>
+                <w:sz w:val="17"/>
+              </w:rPr>
+              <w:t>Codex</w:t>
+            </w:r>
+          </w:p>
+        </w:tc>
+        <w:tc>
+          <w:tcPr>
+            <w:tcW w:w="0" w:type="auto"/>
+          </w:tcPr>
+          <w:p>
+            <w:pPr>
+              <w:rPr>
+                <w:sz w:val="17"/>
+              </w:rPr>
+            </w:pPr>
+            <w:r>
+              <w:rPr>
+                <w:sz w:val="17"/>
+              </w:rPr>
+              <w:t>Material You y selección de agencias por sismo</w:t>
+            </w:r>
+          </w:p>
+        </w:tc>
+        <w:tc>
+          <w:tcPr>
+            <w:tcW w:w="0" w:type="auto"/>
+          </w:tcPr>
+          <w:p>
+            <w:pPr>
+              <w:rPr>
+                <w:sz w:val="17"/>
+              </w:rPr>
+            </w:pPr>
+            <w:r>
+              <w:rPr>
+                <w:sz w:val="17"/>
+              </w:rPr>
+              <w:t>Activo</w:t>
+            </w:r>
+          </w:p>
+        </w:tc>
+      </w:tr>
     </w:tbl>
     <w:p/>
     <w:p>
@@ -1209,6 +1307,7 @@
     <w:tbl>
       <w:tblPr>
         <w:tblW w:w="0" w:type="auto"/>
+        <w:tblInd w:w="-5" w:type="dxa"/>
         <w:tblBorders>
           <w:top w:val="single" w:sz="4" w:space="0" w:color="auto"/>
           <w:left w:val="single" w:sz="4" w:space="0" w:color="auto"/>
@@ -1224,9 +1323,9 @@
         <w:tblLook w:val="0000" w:firstRow="0" w:lastRow="0" w:firstColumn="0" w:lastColumn="0" w:noHBand="0" w:noVBand="0"/>
       </w:tblPr>
       <w:tblGrid>
-        <w:gridCol w:w="1965"/>
-        <w:gridCol w:w="2484"/>
-        <w:gridCol w:w="1879"/>
+        <w:gridCol w:w="1903"/>
+        <w:gridCol w:w="2611"/>
+        <w:gridCol w:w="1819"/>
         <w:gridCol w:w="895"/>
         <w:gridCol w:w="2739"/>
       </w:tblGrid>
@@ -1493,6 +1592,24 @@
               <w:rPr>
                 <w:sz w:val="17"/>
               </w:rPr>
+              <w:t>Sin problemas; APK debug construido</w:t>
+            </w:r>
+          </w:p>
+        </w:tc>
+        <w:tc>
+          <w:tcPr>
+            <w:tcW w:w="0" w:type="auto"/>
+          </w:tcPr>
+          <w:p>
+            <w:pPr>
+              <w:rPr>
+                <w:sz w:val="17"/>
+              </w:rPr>
+            </w:pPr>
+            <w:r>
+              <w:rPr>
+                <w:sz w:val="17"/>
+              </w:rPr>
               <w:t>Sin problemas</w:t>
             </w:r>
           </w:p>
@@ -1511,24 +1628,6 @@
               <w:rPr>
                 <w:sz w:val="17"/>
               </w:rPr>
-              <w:t>Sin problemas</w:t>
-            </w:r>
-          </w:p>
-        </w:tc>
-        <w:tc>
-          <w:tcPr>
-            <w:tcW w:w="0" w:type="auto"/>
-          </w:tcPr>
-          <w:p>
-            <w:pPr>
-              <w:rPr>
-                <w:sz w:val="17"/>
-              </w:rPr>
-            </w:pPr>
-            <w:r>
-              <w:rPr>
-                <w:sz w:val="17"/>
-              </w:rPr>
               <w:t>Verde</w:t>
             </w:r>
           </w:p>
@@ -1547,7 +1646,7 @@
               <w:rPr>
                 <w:sz w:val="17"/>
               </w:rPr>
-              <w:t>Ejecución 2026-08-23</w:t>
+              <w:t>Ejecución 2026-08-27</w:t>
             </w:r>
           </w:p>
         </w:tc>
@@ -1591,7 +1690,7 @@
               <w:rPr>
                 <w:sz w:val="17"/>
               </w:rPr>
-              <w:t>2 aprobadas</w:t>
+              <w:t>5 aprobadas</w:t>
             </w:r>
           </w:p>
         </w:tc>
@@ -1671,6 +1770,7 @@
               <w:rPr>
                 <w:sz w:val="17"/>
               </w:rPr>
+              <w:lastRenderedPageBreak/>
               <w:t>Pruebas backend actuales</w:t>
             </w:r>
           </w:p>
@@ -1689,7 +1789,7 @@
               <w:rPr>
                 <w:sz w:val="17"/>
               </w:rPr>
-              <w:t>55 aprobadas; Ruff y mypy limpios</w:t>
+              <w:t>57 aprobadas; Ruff y mypy limpios</w:t>
             </w:r>
           </w:p>
         </w:tc>
@@ -1867,7 +1967,6 @@
               <w:rPr>
                 <w:sz w:val="17"/>
               </w:rPr>
-              <w:lastRenderedPageBreak/>
               <w:t>URL móvil real</w:t>
             </w:r>
           </w:p>
@@ -4070,6 +4169,7 @@
               <w:rPr>
                 <w:sz w:val="17"/>
               </w:rPr>
+              <w:lastRenderedPageBreak/>
               <w:t>S1-04</w:t>
             </w:r>
           </w:p>
@@ -4186,7 +4286,6 @@
               <w:rPr>
                 <w:sz w:val="17"/>
               </w:rPr>
-              <w:lastRenderedPageBreak/>
               <w:t>S1-05</w:t>
             </w:r>
           </w:p>
@@ -6284,6 +6383,1003 @@
       </w:pPr>
       <w:r>
         <w:lastRenderedPageBreak/>
+        <w:t>3.4 Tablero de Sprint 4</w:t>
+      </w:r>
+    </w:p>
+    <w:tbl>
+      <w:tblPr>
+        <w:tblW w:w="0" w:type="auto"/>
+        <w:tblInd w:w="-5" w:type="dxa"/>
+        <w:tblBorders>
+          <w:top w:val="single" w:sz="4" w:space="0" w:color="auto"/>
+          <w:left w:val="single" w:sz="4" w:space="0" w:color="auto"/>
+          <w:bottom w:val="single" w:sz="4" w:space="0" w:color="auto"/>
+          <w:right w:val="single" w:sz="4" w:space="0" w:color="auto"/>
+          <w:insideH w:val="single" w:sz="4" w:space="0" w:color="auto"/>
+          <w:insideV w:val="single" w:sz="4" w:space="0" w:color="auto"/>
+        </w:tblBorders>
+        <w:tblCellMar>
+          <w:left w:w="70" w:type="dxa"/>
+          <w:right w:w="70" w:type="dxa"/>
+        </w:tblCellMar>
+        <w:tblLook w:val="0000" w:firstRow="0" w:lastRow="0" w:firstColumn="0" w:lastColumn="0" w:noHBand="0" w:noVBand="0"/>
+      </w:tblPr>
+      <w:tblGrid>
+        <w:gridCol w:w="521"/>
+        <w:gridCol w:w="2160"/>
+        <w:gridCol w:w="1150"/>
+        <w:gridCol w:w="898"/>
+        <w:gridCol w:w="1877"/>
+        <w:gridCol w:w="3361"/>
+      </w:tblGrid>
+      <w:tr>
+        <w:tblPrEx>
+          <w:tblCellMar>
+            <w:top w:w="0" w:type="dxa"/>
+            <w:bottom w:w="0" w:type="dxa"/>
+          </w:tblCellMar>
+        </w:tblPrEx>
+        <w:trPr>
+          <w:tblHeader/>
+        </w:trPr>
+        <w:tc>
+          <w:tcPr>
+            <w:tcW w:w="0" w:type="auto"/>
+            <w:shd w:val="clear" w:color="auto" w:fill="13458B"/>
+          </w:tcPr>
+          <w:p>
+            <w:pPr>
+              <w:rPr>
+                <w:b/>
+                <w:color w:val="FFFFFF"/>
+                <w:sz w:val="17"/>
+              </w:rPr>
+            </w:pPr>
+            <w:r>
+              <w:rPr>
+                <w:b/>
+                <w:color w:val="FFFFFF"/>
+                <w:sz w:val="17"/>
+              </w:rPr>
+              <w:t>ID</w:t>
+            </w:r>
+          </w:p>
+        </w:tc>
+        <w:tc>
+          <w:tcPr>
+            <w:tcW w:w="0" w:type="auto"/>
+            <w:shd w:val="clear" w:color="auto" w:fill="13458B"/>
+          </w:tcPr>
+          <w:p>
+            <w:pPr>
+              <w:rPr>
+                <w:b/>
+                <w:color w:val="FFFFFF"/>
+                <w:sz w:val="17"/>
+              </w:rPr>
+            </w:pPr>
+            <w:r>
+              <w:rPr>
+                <w:b/>
+                <w:color w:val="FFFFFF"/>
+                <w:sz w:val="17"/>
+              </w:rPr>
+              <w:t>Actividad</w:t>
+            </w:r>
+          </w:p>
+        </w:tc>
+        <w:tc>
+          <w:tcPr>
+            <w:tcW w:w="0" w:type="auto"/>
+            <w:shd w:val="clear" w:color="auto" w:fill="13458B"/>
+          </w:tcPr>
+          <w:p>
+            <w:pPr>
+              <w:rPr>
+                <w:b/>
+                <w:color w:val="FFFFFF"/>
+                <w:sz w:val="17"/>
+              </w:rPr>
+            </w:pPr>
+            <w:r>
+              <w:rPr>
+                <w:b/>
+                <w:color w:val="FFFFFF"/>
+                <w:sz w:val="17"/>
+              </w:rPr>
+              <w:t>Responsable</w:t>
+            </w:r>
+          </w:p>
+        </w:tc>
+        <w:tc>
+          <w:tcPr>
+            <w:tcW w:w="0" w:type="auto"/>
+            <w:shd w:val="clear" w:color="auto" w:fill="13458B"/>
+          </w:tcPr>
+          <w:p>
+            <w:pPr>
+              <w:rPr>
+                <w:b/>
+                <w:color w:val="FFFFFF"/>
+                <w:sz w:val="17"/>
+              </w:rPr>
+            </w:pPr>
+            <w:r>
+              <w:rPr>
+                <w:b/>
+                <w:color w:val="FFFFFF"/>
+                <w:sz w:val="17"/>
+              </w:rPr>
+              <w:t>Estado</w:t>
+            </w:r>
+          </w:p>
+        </w:tc>
+        <w:tc>
+          <w:tcPr>
+            <w:tcW w:w="0" w:type="auto"/>
+            <w:shd w:val="clear" w:color="auto" w:fill="13458B"/>
+          </w:tcPr>
+          <w:p>
+            <w:pPr>
+              <w:rPr>
+                <w:b/>
+                <w:color w:val="FFFFFF"/>
+                <w:sz w:val="17"/>
+              </w:rPr>
+            </w:pPr>
+            <w:r>
+              <w:rPr>
+                <w:b/>
+                <w:color w:val="FFFFFF"/>
+                <w:sz w:val="17"/>
+              </w:rPr>
+              <w:t>Entregable</w:t>
+            </w:r>
+          </w:p>
+        </w:tc>
+        <w:tc>
+          <w:tcPr>
+            <w:tcW w:w="0" w:type="auto"/>
+            <w:shd w:val="clear" w:color="auto" w:fill="13458B"/>
+          </w:tcPr>
+          <w:p>
+            <w:pPr>
+              <w:rPr>
+                <w:b/>
+                <w:color w:val="FFFFFF"/>
+                <w:sz w:val="17"/>
+              </w:rPr>
+            </w:pPr>
+            <w:r>
+              <w:rPr>
+                <w:b/>
+                <w:color w:val="FFFFFF"/>
+                <w:sz w:val="17"/>
+              </w:rPr>
+              <w:t>Evidencia</w:t>
+            </w:r>
+          </w:p>
+        </w:tc>
+      </w:tr>
+      <w:tr>
+        <w:tblPrEx>
+          <w:tblCellMar>
+            <w:top w:w="0" w:type="dxa"/>
+            <w:bottom w:w="0" w:type="dxa"/>
+          </w:tblCellMar>
+        </w:tblPrEx>
+        <w:tc>
+          <w:tcPr>
+            <w:tcW w:w="0" w:type="auto"/>
+          </w:tcPr>
+          <w:p>
+            <w:pPr>
+              <w:rPr>
+                <w:sz w:val="17"/>
+              </w:rPr>
+            </w:pPr>
+            <w:r>
+              <w:rPr>
+                <w:sz w:val="17"/>
+              </w:rPr>
+              <w:t>S4-01</w:t>
+            </w:r>
+          </w:p>
+        </w:tc>
+        <w:tc>
+          <w:tcPr>
+            <w:tcW w:w="0" w:type="auto"/>
+          </w:tcPr>
+          <w:p>
+            <w:pPr>
+              <w:rPr>
+                <w:sz w:val="17"/>
+              </w:rPr>
+            </w:pPr>
+            <w:r>
+              <w:rPr>
+                <w:sz w:val="17"/>
+              </w:rPr>
+              <w:t>Conectar app a API de prueba</w:t>
+            </w:r>
+          </w:p>
+        </w:tc>
+        <w:tc>
+          <w:tcPr>
+            <w:tcW w:w="0" w:type="auto"/>
+          </w:tcPr>
+          <w:p>
+            <w:pPr>
+              <w:rPr>
+                <w:sz w:val="17"/>
+              </w:rPr>
+            </w:pPr>
+            <w:r>
+              <w:rPr>
+                <w:sz w:val="17"/>
+              </w:rPr>
+              <w:t>Codex</w:t>
+            </w:r>
+          </w:p>
+        </w:tc>
+        <w:tc>
+          <w:tcPr>
+            <w:tcW w:w="0" w:type="auto"/>
+          </w:tcPr>
+          <w:p>
+            <w:pPr>
+              <w:rPr>
+                <w:sz w:val="17"/>
+              </w:rPr>
+            </w:pPr>
+            <w:r>
+              <w:rPr>
+                <w:sz w:val="17"/>
+              </w:rPr>
+              <w:t>ER</w:t>
+            </w:r>
+          </w:p>
+        </w:tc>
+        <w:tc>
+          <w:tcPr>
+            <w:tcW w:w="0" w:type="auto"/>
+          </w:tcPr>
+          <w:p>
+            <w:pPr>
+              <w:rPr>
+                <w:sz w:val="17"/>
+              </w:rPr>
+            </w:pPr>
+            <w:r>
+              <w:rPr>
+                <w:sz w:val="17"/>
+              </w:rPr>
+              <w:t>Configuración segura</w:t>
+            </w:r>
+          </w:p>
+        </w:tc>
+        <w:tc>
+          <w:tcPr>
+            <w:tcW w:w="0" w:type="auto"/>
+          </w:tcPr>
+          <w:p>
+            <w:pPr>
+              <w:rPr>
+                <w:sz w:val="17"/>
+              </w:rPr>
+            </w:pPr>
+            <w:r>
+              <w:rPr>
+                <w:sz w:val="17"/>
+              </w:rPr>
+              <w:t>Falta URL beta real</w:t>
+            </w:r>
+          </w:p>
+        </w:tc>
+      </w:tr>
+      <w:tr>
+        <w:tblPrEx>
+          <w:tblCellMar>
+            <w:top w:w="0" w:type="dxa"/>
+            <w:bottom w:w="0" w:type="dxa"/>
+          </w:tblCellMar>
+        </w:tblPrEx>
+        <w:tc>
+          <w:tcPr>
+            <w:tcW w:w="0" w:type="auto"/>
+          </w:tcPr>
+          <w:p>
+            <w:pPr>
+              <w:rPr>
+                <w:sz w:val="17"/>
+              </w:rPr>
+            </w:pPr>
+            <w:r>
+              <w:rPr>
+                <w:sz w:val="17"/>
+              </w:rPr>
+              <w:t>S4-02</w:t>
+            </w:r>
+          </w:p>
+        </w:tc>
+        <w:tc>
+          <w:tcPr>
+            <w:tcW w:w="0" w:type="auto"/>
+          </w:tcPr>
+          <w:p>
+            <w:pPr>
+              <w:rPr>
+                <w:sz w:val="17"/>
+              </w:rPr>
+            </w:pPr>
+            <w:r>
+              <w:rPr>
+                <w:sz w:val="17"/>
+              </w:rPr>
+              <w:t>Mapa y experiencia Material You</w:t>
+            </w:r>
+          </w:p>
+        </w:tc>
+        <w:tc>
+          <w:tcPr>
+            <w:tcW w:w="0" w:type="auto"/>
+          </w:tcPr>
+          <w:p>
+            <w:pPr>
+              <w:rPr>
+                <w:sz w:val="17"/>
+              </w:rPr>
+            </w:pPr>
+            <w:r>
+              <w:rPr>
+                <w:sz w:val="17"/>
+              </w:rPr>
+              <w:t>Codex</w:t>
+            </w:r>
+          </w:p>
+        </w:tc>
+        <w:tc>
+          <w:tcPr>
+            <w:tcW w:w="0" w:type="auto"/>
+          </w:tcPr>
+          <w:p>
+            <w:pPr>
+              <w:rPr>
+                <w:sz w:val="17"/>
+              </w:rPr>
+            </w:pPr>
+            <w:r>
+              <w:rPr>
+                <w:sz w:val="17"/>
+              </w:rPr>
+              <w:t>CO técnico</w:t>
+            </w:r>
+          </w:p>
+        </w:tc>
+        <w:tc>
+          <w:tcPr>
+            <w:tcW w:w="0" w:type="auto"/>
+          </w:tcPr>
+          <w:p>
+            <w:pPr>
+              <w:rPr>
+                <w:sz w:val="17"/>
+              </w:rPr>
+            </w:pPr>
+            <w:r>
+              <w:rPr>
+                <w:sz w:val="17"/>
+              </w:rPr>
+              <w:t>Tema dinámico y monitor</w:t>
+            </w:r>
+          </w:p>
+        </w:tc>
+        <w:tc>
+          <w:tcPr>
+            <w:tcW w:w="0" w:type="auto"/>
+          </w:tcPr>
+          <w:p>
+            <w:pPr>
+              <w:rPr>
+                <w:sz w:val="17"/>
+              </w:rPr>
+            </w:pPr>
+            <w:r>
+              <w:rPr>
+                <w:sz w:val="17"/>
+              </w:rPr>
+              <w:t>mobile_app/lib/core/theme.dart; Flutter analyze</w:t>
+            </w:r>
+          </w:p>
+        </w:tc>
+      </w:tr>
+      <w:tr>
+        <w:tblPrEx>
+          <w:tblCellMar>
+            <w:top w:w="0" w:type="dxa"/>
+            <w:bottom w:w="0" w:type="dxa"/>
+          </w:tblCellMar>
+        </w:tblPrEx>
+        <w:tc>
+          <w:tcPr>
+            <w:tcW w:w="0" w:type="auto"/>
+          </w:tcPr>
+          <w:p>
+            <w:pPr>
+              <w:rPr>
+                <w:sz w:val="17"/>
+              </w:rPr>
+            </w:pPr>
+            <w:r>
+              <w:rPr>
+                <w:sz w:val="17"/>
+              </w:rPr>
+              <w:t>S4-03</w:t>
+            </w:r>
+          </w:p>
+        </w:tc>
+        <w:tc>
+          <w:tcPr>
+            <w:tcW w:w="0" w:type="auto"/>
+          </w:tcPr>
+          <w:p>
+            <w:pPr>
+              <w:rPr>
+                <w:sz w:val="17"/>
+              </w:rPr>
+            </w:pPr>
+            <w:r>
+              <w:rPr>
+                <w:sz w:val="17"/>
+              </w:rPr>
+              <w:t>Detalle oficial y fuentes</w:t>
+            </w:r>
+          </w:p>
+        </w:tc>
+        <w:tc>
+          <w:tcPr>
+            <w:tcW w:w="0" w:type="auto"/>
+          </w:tcPr>
+          <w:p>
+            <w:pPr>
+              <w:rPr>
+                <w:sz w:val="17"/>
+              </w:rPr>
+            </w:pPr>
+            <w:r>
+              <w:rPr>
+                <w:sz w:val="17"/>
+              </w:rPr>
+              <w:t>Codex</w:t>
+            </w:r>
+          </w:p>
+        </w:tc>
+        <w:tc>
+          <w:tcPr>
+            <w:tcW w:w="0" w:type="auto"/>
+          </w:tcPr>
+          <w:p>
+            <w:pPr>
+              <w:rPr>
+                <w:sz w:val="17"/>
+              </w:rPr>
+            </w:pPr>
+            <w:r>
+              <w:rPr>
+                <w:sz w:val="17"/>
+              </w:rPr>
+              <w:t>EC</w:t>
+            </w:r>
+          </w:p>
+        </w:tc>
+        <w:tc>
+          <w:tcPr>
+            <w:tcW w:w="0" w:type="auto"/>
+          </w:tcPr>
+          <w:p>
+            <w:pPr>
+              <w:rPr>
+                <w:sz w:val="17"/>
+              </w:rPr>
+            </w:pPr>
+            <w:r>
+              <w:rPr>
+                <w:sz w:val="17"/>
+              </w:rPr>
+              <w:t>EventDetail adaptable</w:t>
+            </w:r>
+          </w:p>
+        </w:tc>
+        <w:tc>
+          <w:tcPr>
+            <w:tcW w:w="0" w:type="auto"/>
+          </w:tcPr>
+          <w:p>
+            <w:pPr>
+              <w:rPr>
+                <w:sz w:val="17"/>
+              </w:rPr>
+            </w:pPr>
+            <w:r>
+              <w:rPr>
+                <w:sz w:val="17"/>
+              </w:rPr>
+              <w:t>UI existente adaptada a ColorScheme</w:t>
+            </w:r>
+          </w:p>
+        </w:tc>
+      </w:tr>
+      <w:tr>
+        <w:tblPrEx>
+          <w:tblCellMar>
+            <w:top w:w="0" w:type="dxa"/>
+            <w:bottom w:w="0" w:type="dxa"/>
+          </w:tblCellMar>
+        </w:tblPrEx>
+        <w:tc>
+          <w:tcPr>
+            <w:tcW w:w="0" w:type="auto"/>
+          </w:tcPr>
+          <w:p>
+            <w:pPr>
+              <w:rPr>
+                <w:sz w:val="17"/>
+              </w:rPr>
+            </w:pPr>
+            <w:r>
+              <w:rPr>
+                <w:sz w:val="17"/>
+              </w:rPr>
+              <w:t>S4-04</w:t>
+            </w:r>
+          </w:p>
+        </w:tc>
+        <w:tc>
+          <w:tcPr>
+            <w:tcW w:w="0" w:type="auto"/>
+          </w:tcPr>
+          <w:p>
+            <w:pPr>
+              <w:rPr>
+                <w:sz w:val="17"/>
+              </w:rPr>
+            </w:pPr>
+            <w:r>
+              <w:rPr>
+                <w:sz w:val="17"/>
+              </w:rPr>
+              <w:t>Reporte “lo sentí”</w:t>
+            </w:r>
+          </w:p>
+        </w:tc>
+        <w:tc>
+          <w:tcPr>
+            <w:tcW w:w="0" w:type="auto"/>
+          </w:tcPr>
+          <w:p>
+            <w:pPr>
+              <w:rPr>
+                <w:sz w:val="17"/>
+              </w:rPr>
+            </w:pPr>
+            <w:r>
+              <w:rPr>
+                <w:sz w:val="17"/>
+              </w:rPr>
+              <w:t>Codex</w:t>
+            </w:r>
+          </w:p>
+        </w:tc>
+        <w:tc>
+          <w:tcPr>
+            <w:tcW w:w="0" w:type="auto"/>
+          </w:tcPr>
+          <w:p>
+            <w:pPr>
+              <w:rPr>
+                <w:sz w:val="17"/>
+              </w:rPr>
+            </w:pPr>
+            <w:r>
+              <w:rPr>
+                <w:sz w:val="17"/>
+              </w:rPr>
+              <w:t>CO técnico</w:t>
+            </w:r>
+          </w:p>
+        </w:tc>
+        <w:tc>
+          <w:tcPr>
+            <w:tcW w:w="0" w:type="auto"/>
+          </w:tcPr>
+          <w:p>
+            <w:pPr>
+              <w:rPr>
+                <w:sz w:val="17"/>
+              </w:rPr>
+            </w:pPr>
+            <w:r>
+              <w:rPr>
+                <w:sz w:val="17"/>
+              </w:rPr>
+              <w:t>Selección oficial por sismo</w:t>
+            </w:r>
+          </w:p>
+        </w:tc>
+        <w:tc>
+          <w:tcPr>
+            <w:tcW w:w="0" w:type="auto"/>
+          </w:tcPr>
+          <w:p>
+            <w:pPr>
+              <w:rPr>
+                <w:sz w:val="17"/>
+              </w:rPr>
+            </w:pPr>
+            <w:r>
+              <w:rPr>
+                <w:sz w:val="17"/>
+              </w:rPr>
+              <w:t>API, persistencia local y pruebas</w:t>
+            </w:r>
+          </w:p>
+        </w:tc>
+      </w:tr>
+      <w:tr>
+        <w:tblPrEx>
+          <w:tblCellMar>
+            <w:top w:w="0" w:type="dxa"/>
+            <w:bottom w:w="0" w:type="dxa"/>
+          </w:tblCellMar>
+        </w:tblPrEx>
+        <w:tc>
+          <w:tcPr>
+            <w:tcW w:w="0" w:type="auto"/>
+          </w:tcPr>
+          <w:p>
+            <w:pPr>
+              <w:rPr>
+                <w:sz w:val="17"/>
+              </w:rPr>
+            </w:pPr>
+            <w:r>
+              <w:rPr>
+                <w:sz w:val="17"/>
+              </w:rPr>
+              <w:t>S4-05</w:t>
+            </w:r>
+          </w:p>
+        </w:tc>
+        <w:tc>
+          <w:tcPr>
+            <w:tcW w:w="0" w:type="auto"/>
+          </w:tcPr>
+          <w:p>
+            <w:pPr>
+              <w:rPr>
+                <w:sz w:val="17"/>
+              </w:rPr>
+            </w:pPr>
+            <w:r>
+              <w:rPr>
+                <w:sz w:val="17"/>
+              </w:rPr>
+              <w:t>Reporte textual de daño</w:t>
+            </w:r>
+          </w:p>
+        </w:tc>
+        <w:tc>
+          <w:tcPr>
+            <w:tcW w:w="0" w:type="auto"/>
+          </w:tcPr>
+          <w:p>
+            <w:pPr>
+              <w:rPr>
+                <w:sz w:val="17"/>
+              </w:rPr>
+            </w:pPr>
+            <w:r>
+              <w:rPr>
+                <w:sz w:val="17"/>
+              </w:rPr>
+              <w:t>Codex</w:t>
+            </w:r>
+          </w:p>
+        </w:tc>
+        <w:tc>
+          <w:tcPr>
+            <w:tcW w:w="0" w:type="auto"/>
+          </w:tcPr>
+          <w:p>
+            <w:pPr>
+              <w:rPr>
+                <w:sz w:val="17"/>
+              </w:rPr>
+            </w:pPr>
+            <w:r>
+              <w:rPr>
+                <w:sz w:val="17"/>
+              </w:rPr>
+              <w:t>ER</w:t>
+            </w:r>
+          </w:p>
+        </w:tc>
+        <w:tc>
+          <w:tcPr>
+            <w:tcW w:w="0" w:type="auto"/>
+          </w:tcPr>
+          <w:p>
+            <w:pPr>
+              <w:rPr>
+                <w:sz w:val="17"/>
+              </w:rPr>
+            </w:pPr>
+            <w:r>
+              <w:rPr>
+                <w:sz w:val="17"/>
+              </w:rPr>
+              <w:t>Formulario sin multimedia</w:t>
+            </w:r>
+          </w:p>
+        </w:tc>
+        <w:tc>
+          <w:tcPr>
+            <w:tcW w:w="0" w:type="auto"/>
+          </w:tcPr>
+          <w:p>
+            <w:pPr>
+              <w:rPr>
+                <w:sz w:val="17"/>
+              </w:rPr>
+            </w:pPr>
+            <w:r>
+              <w:rPr>
+                <w:sz w:val="17"/>
+              </w:rPr>
+              <w:t>Implementado; falta prueba en dispositivo</w:t>
+            </w:r>
+          </w:p>
+        </w:tc>
+      </w:tr>
+      <w:tr>
+        <w:tblPrEx>
+          <w:tblCellMar>
+            <w:top w:w="0" w:type="dxa"/>
+            <w:bottom w:w="0" w:type="dxa"/>
+          </w:tblCellMar>
+        </w:tblPrEx>
+        <w:tc>
+          <w:tcPr>
+            <w:tcW w:w="0" w:type="auto"/>
+          </w:tcPr>
+          <w:p>
+            <w:pPr>
+              <w:rPr>
+                <w:sz w:val="17"/>
+              </w:rPr>
+            </w:pPr>
+            <w:r>
+              <w:rPr>
+                <w:sz w:val="17"/>
+              </w:rPr>
+              <w:t>S4-06</w:t>
+            </w:r>
+          </w:p>
+        </w:tc>
+        <w:tc>
+          <w:tcPr>
+            <w:tcW w:w="0" w:type="auto"/>
+          </w:tcPr>
+          <w:p>
+            <w:pPr>
+              <w:rPr>
+                <w:sz w:val="17"/>
+              </w:rPr>
+            </w:pPr>
+            <w:r>
+              <w:rPr>
+                <w:sz w:val="17"/>
+              </w:rPr>
+              <w:t>Cola offline y sincronización</w:t>
+            </w:r>
+          </w:p>
+        </w:tc>
+        <w:tc>
+          <w:tcPr>
+            <w:tcW w:w="0" w:type="auto"/>
+          </w:tcPr>
+          <w:p>
+            <w:pPr>
+              <w:rPr>
+                <w:sz w:val="17"/>
+              </w:rPr>
+            </w:pPr>
+            <w:r>
+              <w:rPr>
+                <w:sz w:val="17"/>
+              </w:rPr>
+              <w:t>Codex</w:t>
+            </w:r>
+          </w:p>
+        </w:tc>
+        <w:tc>
+          <w:tcPr>
+            <w:tcW w:w="0" w:type="auto"/>
+          </w:tcPr>
+          <w:p>
+            <w:pPr>
+              <w:rPr>
+                <w:sz w:val="17"/>
+              </w:rPr>
+            </w:pPr>
+            <w:r>
+              <w:rPr>
+                <w:sz w:val="17"/>
+              </w:rPr>
+              <w:t>NI</w:t>
+            </w:r>
+          </w:p>
+        </w:tc>
+        <w:tc>
+          <w:tcPr>
+            <w:tcW w:w="0" w:type="auto"/>
+          </w:tcPr>
+          <w:p>
+            <w:pPr>
+              <w:rPr>
+                <w:sz w:val="17"/>
+              </w:rPr>
+            </w:pPr>
+            <w:r>
+              <w:rPr>
+                <w:sz w:val="17"/>
+              </w:rPr>
+              <w:t>Store-and-forward</w:t>
+            </w:r>
+          </w:p>
+        </w:tc>
+        <w:tc>
+          <w:tcPr>
+            <w:tcW w:w="0" w:type="auto"/>
+          </w:tcPr>
+          <w:p>
+            <w:pPr>
+              <w:rPr>
+                <w:sz w:val="17"/>
+              </w:rPr>
+            </w:pPr>
+            <w:r>
+              <w:rPr>
+                <w:sz w:val="17"/>
+              </w:rPr>
+              <w:t>Pendiente</w:t>
+            </w:r>
+          </w:p>
+        </w:tc>
+      </w:tr>
+      <w:tr>
+        <w:tblPrEx>
+          <w:tblCellMar>
+            <w:top w:w="0" w:type="dxa"/>
+            <w:bottom w:w="0" w:type="dxa"/>
+          </w:tblCellMar>
+        </w:tblPrEx>
+        <w:tc>
+          <w:tcPr>
+            <w:tcW w:w="0" w:type="auto"/>
+          </w:tcPr>
+          <w:p>
+            <w:pPr>
+              <w:rPr>
+                <w:sz w:val="17"/>
+              </w:rPr>
+            </w:pPr>
+            <w:r>
+              <w:rPr>
+                <w:sz w:val="17"/>
+              </w:rPr>
+              <w:t>S4-07</w:t>
+            </w:r>
+          </w:p>
+        </w:tc>
+        <w:tc>
+          <w:tcPr>
+            <w:tcW w:w="0" w:type="auto"/>
+          </w:tcPr>
+          <w:p>
+            <w:pPr>
+              <w:rPr>
+                <w:sz w:val="17"/>
+              </w:rPr>
+            </w:pPr>
+            <w:r>
+              <w:rPr>
+                <w:sz w:val="17"/>
+              </w:rPr>
+              <w:t>Prueba en 2+ Android</w:t>
+            </w:r>
+          </w:p>
+        </w:tc>
+        <w:tc>
+          <w:tcPr>
+            <w:tcW w:w="0" w:type="auto"/>
+          </w:tcPr>
+          <w:p>
+            <w:pPr>
+              <w:rPr>
+                <w:sz w:val="17"/>
+              </w:rPr>
+            </w:pPr>
+            <w:r>
+              <w:rPr>
+                <w:sz w:val="17"/>
+              </w:rPr>
+              <w:t>PO + testers</w:t>
+            </w:r>
+          </w:p>
+        </w:tc>
+        <w:tc>
+          <w:tcPr>
+            <w:tcW w:w="0" w:type="auto"/>
+          </w:tcPr>
+          <w:p>
+            <w:pPr>
+              <w:rPr>
+                <w:sz w:val="17"/>
+              </w:rPr>
+            </w:pPr>
+            <w:r>
+              <w:rPr>
+                <w:sz w:val="17"/>
+              </w:rPr>
+              <w:t>NI</w:t>
+            </w:r>
+          </w:p>
+        </w:tc>
+        <w:tc>
+          <w:tcPr>
+            <w:tcW w:w="0" w:type="auto"/>
+          </w:tcPr>
+          <w:p>
+            <w:pPr>
+              <w:rPr>
+                <w:sz w:val="17"/>
+              </w:rPr>
+            </w:pPr>
+            <w:r>
+              <w:rPr>
+                <w:sz w:val="17"/>
+              </w:rPr>
+              <w:t>Evidencia física</w:t>
+            </w:r>
+          </w:p>
+        </w:tc>
+        <w:tc>
+          <w:tcPr>
+            <w:tcW w:w="0" w:type="auto"/>
+          </w:tcPr>
+          <w:p>
+            <w:pPr>
+              <w:rPr>
+                <w:sz w:val="17"/>
+              </w:rPr>
+            </w:pPr>
+            <w:r>
+              <w:rPr>
+                <w:sz w:val="17"/>
+              </w:rPr>
+              <w:t>Requiere dos teléfonos</w:t>
+            </w:r>
+          </w:p>
+        </w:tc>
+      </w:tr>
+    </w:tbl>
+    <w:p/>
+    <w:p>
+      <w:pPr>
+        <w:pStyle w:val="Ttulo1"/>
+      </w:pPr>
+      <w:r>
         <w:t>4. Registro maestro de entregables</w:t>
       </w:r>
     </w:p>
@@ -7249,43 +8345,43 @@
               <w:rPr>
                 <w:sz w:val="17"/>
               </w:rPr>
-              <w:t>NI</w:t>
-            </w:r>
-          </w:p>
-        </w:tc>
-        <w:tc>
-          <w:tcPr>
-            <w:tcW w:w="0" w:type="auto"/>
-          </w:tcPr>
-          <w:p>
-            <w:pPr>
-              <w:rPr>
-                <w:sz w:val="17"/>
-              </w:rPr>
-            </w:pPr>
-            <w:r>
-              <w:rPr>
-                <w:sz w:val="17"/>
-              </w:rPr>
-              <w:t>Prueba en 2+ dispositivos</w:t>
-            </w:r>
-          </w:p>
-        </w:tc>
-        <w:tc>
-          <w:tcPr>
-            <w:tcW w:w="0" w:type="auto"/>
-          </w:tcPr>
-          <w:p>
-            <w:pPr>
-              <w:rPr>
-                <w:sz w:val="17"/>
-              </w:rPr>
-            </w:pPr>
-            <w:r>
-              <w:rPr>
-                <w:sz w:val="17"/>
-              </w:rPr>
-              <w:t>Evidencia de testing</w:t>
+              <w:t>EC</w:t>
+            </w:r>
+          </w:p>
+        </w:tc>
+        <w:tc>
+          <w:tcPr>
+            <w:tcW w:w="0" w:type="auto"/>
+          </w:tcPr>
+          <w:p>
+            <w:pPr>
+              <w:rPr>
+                <w:sz w:val="17"/>
+              </w:rPr>
+            </w:pPr>
+            <w:r>
+              <w:rPr>
+                <w:sz w:val="17"/>
+              </w:rPr>
+              <w:t>Material You y agencias listos; faltan cola y dispositivos</w:t>
+            </w:r>
+          </w:p>
+        </w:tc>
+        <w:tc>
+          <w:tcPr>
+            <w:tcW w:w="0" w:type="auto"/>
+          </w:tcPr>
+          <w:p>
+            <w:pPr>
+              <w:rPr>
+                <w:sz w:val="17"/>
+              </w:rPr>
+            </w:pPr>
+            <w:r>
+              <w:rPr>
+                <w:sz w:val="17"/>
+              </w:rPr>
+              <w:t>SPRINT_4_AVANCE_2026-08-27.md</w:t>
             </w:r>
           </w:p>
         </w:tc>
@@ -7699,6 +8795,7 @@
         <w:pStyle w:val="Ttulo1"/>
       </w:pPr>
       <w:r>
+        <w:lastRenderedPageBreak/>
         <w:t>5. Registro de puntos de chequeo</w:t>
       </w:r>
     </w:p>
@@ -9043,7 +10140,6 @@
               <w:rPr>
                 <w:sz w:val="17"/>
               </w:rPr>
-              <w:lastRenderedPageBreak/>
               <w:t>R-02</w:t>
             </w:r>
           </w:p>
@@ -11017,6 +12113,7 @@
               <w:rPr>
                 <w:sz w:val="17"/>
               </w:rPr>
+              <w:lastRenderedPageBreak/>
               <w:t>DEC-002</w:t>
             </w:r>
           </w:p>
@@ -12047,7 +13144,6 @@
         <w:pStyle w:val="Ttulo1"/>
       </w:pPr>
       <w:r>
-        <w:lastRenderedPageBreak/>
         <w:t>8. Registro de impedimentos</w:t>
       </w:r>
     </w:p>
@@ -14548,7 +15644,7 @@
         <w:color w:val="808080"/>
         <w:sz w:val="16"/>
       </w:rPr>
-      <w:t>Seismik | Control de Avance | v0.1.4</w:t>
+      <w:t>Seismik | Control de Avance | v0.1.5</w:t>
     </w:r>
   </w:p>
 </w:hdr>
@@ -14569,7 +15665,7 @@
   <w:abstractNum w:abstractNumId="0" w15:restartNumberingAfterBreak="0">
     <w:nsid w:val="FFFFFF89"/>
     <w:multiLevelType w:val="singleLevel"/>
-    <w:tmpl w:val="2B4C8062"/>
+    <w:tmpl w:val="9788C37C"/>
     <w:lvl w:ilvl="0">
       <w:start w:val="1"/>
       <w:numFmt w:val="bullet"/>
@@ -14587,7 +15683,7 @@
       </w:rPr>
     </w:lvl>
   </w:abstractNum>
-  <w:num w:numId="1" w16cid:durableId="944268792">
+  <w:num w:numId="1" w16cid:durableId="118034701">
     <w:abstractNumId w:val="0"/>
   </w:num>
 </w:numbering>
@@ -15008,7 +16104,7 @@
     <w:link w:val="Ttulo1Car"/>
     <w:uiPriority w:val="9"/>
     <w:qFormat/>
-    <w:rsid w:val="0013610D"/>
+    <w:rsid w:val="00E5278D"/>
     <w:pPr>
       <w:keepNext/>
       <w:keepLines/>
@@ -15031,7 +16127,7 @@
     <w:semiHidden/>
     <w:unhideWhenUsed/>
     <w:qFormat/>
-    <w:rsid w:val="0013610D"/>
+    <w:rsid w:val="00E5278D"/>
     <w:pPr>
       <w:keepNext/>
       <w:keepLines/>
@@ -15054,7 +16150,7 @@
     <w:semiHidden/>
     <w:unhideWhenUsed/>
     <w:qFormat/>
-    <w:rsid w:val="0013610D"/>
+    <w:rsid w:val="00E5278D"/>
     <w:pPr>
       <w:keepNext/>
       <w:keepLines/>
@@ -15077,7 +16173,7 @@
     <w:semiHidden/>
     <w:unhideWhenUsed/>
     <w:qFormat/>
-    <w:rsid w:val="0013610D"/>
+    <w:rsid w:val="00E5278D"/>
     <w:pPr>
       <w:keepNext/>
       <w:keepLines/>
@@ -15100,7 +16196,7 @@
     <w:semiHidden/>
     <w:unhideWhenUsed/>
     <w:qFormat/>
-    <w:rsid w:val="0013610D"/>
+    <w:rsid w:val="00E5278D"/>
     <w:pPr>
       <w:keepNext/>
       <w:keepLines/>
@@ -15121,7 +16217,7 @@
     <w:semiHidden/>
     <w:unhideWhenUsed/>
     <w:qFormat/>
-    <w:rsid w:val="0013610D"/>
+    <w:rsid w:val="00E5278D"/>
     <w:pPr>
       <w:keepNext/>
       <w:keepLines/>
@@ -15144,7 +16240,7 @@
     <w:semiHidden/>
     <w:unhideWhenUsed/>
     <w:qFormat/>
-    <w:rsid w:val="0013610D"/>
+    <w:rsid w:val="00E5278D"/>
     <w:pPr>
       <w:keepNext/>
       <w:keepLines/>
@@ -15165,7 +16261,7 @@
     <w:semiHidden/>
     <w:unhideWhenUsed/>
     <w:qFormat/>
-    <w:rsid w:val="0013610D"/>
+    <w:rsid w:val="00E5278D"/>
     <w:pPr>
       <w:keepNext/>
       <w:keepLines/>
@@ -15188,7 +16284,7 @@
     <w:semiHidden/>
     <w:unhideWhenUsed/>
     <w:qFormat/>
-    <w:rsid w:val="0013610D"/>
+    <w:rsid w:val="00E5278D"/>
     <w:pPr>
       <w:keepNext/>
       <w:keepLines/>
@@ -15232,7 +16328,7 @@
     <w:basedOn w:val="Fuentedeprrafopredeter"/>
     <w:link w:val="Ttulo1"/>
     <w:uiPriority w:val="9"/>
-    <w:rsid w:val="0013610D"/>
+    <w:rsid w:val="00E5278D"/>
     <w:rPr>
       <w:rFonts w:ascii="Aptos Display" w:eastAsiaTheme="majorEastAsia" w:hAnsi="Aptos Display" w:cstheme="majorBidi"/>
       <w:color w:val="13458B"/>
@@ -15246,7 +16342,7 @@
     <w:link w:val="Ttulo2"/>
     <w:uiPriority w:val="9"/>
     <w:semiHidden/>
-    <w:rsid w:val="0013610D"/>
+    <w:rsid w:val="00E5278D"/>
     <w:rPr>
       <w:rFonts w:ascii="Aptos Display" w:eastAsiaTheme="majorEastAsia" w:hAnsi="Aptos Display" w:cstheme="majorBidi"/>
       <w:color w:val="13458B"/>
@@ -15260,7 +16356,7 @@
     <w:link w:val="Ttulo3"/>
     <w:uiPriority w:val="9"/>
     <w:semiHidden/>
-    <w:rsid w:val="0013610D"/>
+    <w:rsid w:val="00E5278D"/>
     <w:rPr>
       <w:rFonts w:ascii="Aptos Display" w:eastAsiaTheme="majorEastAsia" w:hAnsi="Aptos Display" w:cstheme="majorBidi"/>
       <w:color w:val="13458B"/>
@@ -15274,7 +16370,7 @@
     <w:link w:val="Ttulo4"/>
     <w:uiPriority w:val="9"/>
     <w:semiHidden/>
-    <w:rsid w:val="0013610D"/>
+    <w:rsid w:val="00E5278D"/>
     <w:rPr>
       <w:rFonts w:eastAsiaTheme="majorEastAsia" w:cstheme="majorBidi"/>
       <w:i/>
@@ -15288,7 +16384,7 @@
     <w:link w:val="Ttulo5"/>
     <w:uiPriority w:val="9"/>
     <w:semiHidden/>
-    <w:rsid w:val="0013610D"/>
+    <w:rsid w:val="00E5278D"/>
     <w:rPr>
       <w:rFonts w:eastAsiaTheme="majorEastAsia" w:cstheme="majorBidi"/>
       <w:color w:val="0F4761" w:themeColor="accent1" w:themeShade="BF"/>
@@ -15300,7 +16396,7 @@
     <w:link w:val="Ttulo6"/>
     <w:uiPriority w:val="9"/>
     <w:semiHidden/>
-    <w:rsid w:val="0013610D"/>
+    <w:rsid w:val="00E5278D"/>
     <w:rPr>
       <w:rFonts w:eastAsiaTheme="majorEastAsia" w:cstheme="majorBidi"/>
       <w:i/>
@@ -15314,7 +16410,7 @@
     <w:link w:val="Ttulo7"/>
     <w:uiPriority w:val="9"/>
     <w:semiHidden/>
-    <w:rsid w:val="0013610D"/>
+    <w:rsid w:val="00E5278D"/>
     <w:rPr>
       <w:rFonts w:eastAsiaTheme="majorEastAsia" w:cstheme="majorBidi"/>
       <w:color w:val="595959" w:themeColor="text1" w:themeTint="A6"/>
@@ -15326,7 +16422,7 @@
     <w:link w:val="Ttulo8"/>
     <w:uiPriority w:val="9"/>
     <w:semiHidden/>
-    <w:rsid w:val="0013610D"/>
+    <w:rsid w:val="00E5278D"/>
     <w:rPr>
       <w:rFonts w:eastAsiaTheme="majorEastAsia" w:cstheme="majorBidi"/>
       <w:i/>
@@ -15340,7 +16436,7 @@
     <w:link w:val="Ttulo9"/>
     <w:uiPriority w:val="9"/>
     <w:semiHidden/>
-    <w:rsid w:val="0013610D"/>
+    <w:rsid w:val="00E5278D"/>
     <w:rPr>
       <w:rFonts w:eastAsiaTheme="majorEastAsia" w:cstheme="majorBidi"/>
       <w:color w:val="272727" w:themeColor="text1" w:themeTint="D8"/>
@@ -15353,7 +16449,7 @@
     <w:link w:val="TtuloCar"/>
     <w:uiPriority w:val="10"/>
     <w:qFormat/>
-    <w:rsid w:val="0013610D"/>
+    <w:rsid w:val="00E5278D"/>
     <w:pPr>
       <w:spacing w:after="80"/>
       <w:contextualSpacing/>
@@ -15372,7 +16468,7 @@
     <w:basedOn w:val="Fuentedeprrafopredeter"/>
     <w:link w:val="Ttulo"/>
     <w:uiPriority w:val="10"/>
-    <w:rsid w:val="0013610D"/>
+    <w:rsid w:val="00E5278D"/>
     <w:rPr>
       <w:rFonts w:ascii="Aptos Display" w:eastAsiaTheme="majorEastAsia" w:hAnsi="Aptos Display" w:cstheme="majorBidi"/>
       <w:color w:val="13458B"/>
@@ -15389,7 +16485,7 @@
     <w:link w:val="SubttuloCar"/>
     <w:uiPriority w:val="11"/>
     <w:qFormat/>
-    <w:rsid w:val="0013610D"/>
+    <w:rsid w:val="00E5278D"/>
     <w:pPr>
       <w:numPr>
         <w:ilvl w:val="1"/>
@@ -15408,7 +16504,7 @@
     <w:basedOn w:val="Fuentedeprrafopredeter"/>
     <w:link w:val="Subttulo"/>
     <w:uiPriority w:val="11"/>
-    <w:rsid w:val="0013610D"/>
+    <w:rsid w:val="00E5278D"/>
     <w:rPr>
       <w:rFonts w:eastAsiaTheme="majorEastAsia" w:cstheme="majorBidi"/>
       <w:color w:val="595959" w:themeColor="text1" w:themeTint="A6"/>
@@ -15424,7 +16520,7 @@
     <w:link w:val="CitaCar"/>
     <w:uiPriority w:val="29"/>
     <w:qFormat/>
-    <w:rsid w:val="0013610D"/>
+    <w:rsid w:val="00E5278D"/>
     <w:pPr>
       <w:spacing w:before="160"/>
       <w:jc w:val="center"/>
@@ -15440,7 +16536,7 @@
     <w:basedOn w:val="Fuentedeprrafopredeter"/>
     <w:link w:val="Cita"/>
     <w:uiPriority w:val="29"/>
-    <w:rsid w:val="0013610D"/>
+    <w:rsid w:val="00E5278D"/>
     <w:rPr>
       <w:i/>
       <w:iCs/>
@@ -15452,7 +16548,7 @@
     <w:basedOn w:val="Normal"/>
     <w:uiPriority w:val="34"/>
     <w:qFormat/>
-    <w:rsid w:val="0013610D"/>
+    <w:rsid w:val="00E5278D"/>
     <w:pPr>
       <w:ind w:left="720"/>
       <w:contextualSpacing/>
@@ -15463,7 +16559,7 @@
     <w:basedOn w:val="Fuentedeprrafopredeter"/>
     <w:uiPriority w:val="21"/>
     <w:qFormat/>
-    <w:rsid w:val="0013610D"/>
+    <w:rsid w:val="00E5278D"/>
     <w:rPr>
       <w:i/>
       <w:iCs/>
@@ -15477,7 +16573,7 @@
     <w:link w:val="CitadestacadaCar"/>
     <w:uiPriority w:val="30"/>
     <w:qFormat/>
-    <w:rsid w:val="0013610D"/>
+    <w:rsid w:val="00E5278D"/>
     <w:pPr>
       <w:pBdr>
         <w:top w:val="single" w:sz="4" w:space="10" w:color="0F4761" w:themeColor="accent1" w:themeShade="BF"/>
@@ -15498,7 +16594,7 @@
     <w:basedOn w:val="Fuentedeprrafopredeter"/>
     <w:link w:val="Citadestacada"/>
     <w:uiPriority w:val="30"/>
-    <w:rsid w:val="0013610D"/>
+    <w:rsid w:val="00E5278D"/>
     <w:rPr>
       <w:i/>
       <w:iCs/>
@@ -15510,7 +16606,7 @@
     <w:basedOn w:val="Fuentedeprrafopredeter"/>
     <w:uiPriority w:val="32"/>
     <w:qFormat/>
-    <w:rsid w:val="0013610D"/>
+    <w:rsid w:val="00E5278D"/>
     <w:rPr>
       <w:b/>
       <w:bCs/>
@@ -15525,7 +16621,7 @@
     <w:link w:val="EncabezadoCar"/>
     <w:uiPriority w:val="99"/>
     <w:unhideWhenUsed/>
-    <w:rsid w:val="0013610D"/>
+    <w:rsid w:val="00E5278D"/>
     <w:pPr>
       <w:tabs>
         <w:tab w:val="center" w:pos="4419"/>
@@ -15539,7 +16635,7 @@
     <w:basedOn w:val="Fuentedeprrafopredeter"/>
     <w:link w:val="Encabezado"/>
     <w:uiPriority w:val="99"/>
-    <w:rsid w:val="0013610D"/>
+    <w:rsid w:val="00E5278D"/>
     <w:rPr>
       <w:rFonts w:ascii="Aptos" w:hAnsi="Aptos"/>
       <w:sz w:val="20"/>
@@ -15551,7 +16647,7 @@
     <w:link w:val="PiedepginaCar"/>
     <w:uiPriority w:val="99"/>
     <w:unhideWhenUsed/>
-    <w:rsid w:val="0013610D"/>
+    <w:rsid w:val="00E5278D"/>
     <w:pPr>
       <w:tabs>
         <w:tab w:val="center" w:pos="4419"/>
@@ -15565,7 +16661,7 @@
     <w:basedOn w:val="Fuentedeprrafopredeter"/>
     <w:link w:val="Piedepgina"/>
     <w:uiPriority w:val="99"/>
-    <w:rsid w:val="0013610D"/>
+    <w:rsid w:val="00E5278D"/>
     <w:rPr>
       <w:rFonts w:ascii="Aptos" w:hAnsi="Aptos"/>
       <w:sz w:val="20"/>
@@ -15576,7 +16672,7 @@
     <w:basedOn w:val="Normal"/>
     <w:uiPriority w:val="99"/>
     <w:unhideWhenUsed/>
-    <w:rsid w:val="0013610D"/>
+    <w:rsid w:val="00E5278D"/>
     <w:pPr>
       <w:numPr>
         <w:numId w:val="1"/>

</xml_diff>